<commit_message>
﻿chore(itesca): actualiza materiales de gestión administrativa
- Actualiza memorias, conceptos y reportes de las actividades 2 y 4
- Incorpora resúmenes de planeación y referencias sobre toma de decisiones
- Retira presentaciones, el reporte de la actividad 3 y un respaldo obsoleto
</commit_message>
<xml_diff>
--- a/ITESCA/maestria-en-gestion-administrativa/fundamentos-de-gestion-administrativa-mga/extractor-aulatex/conceptos-fundamentos-de-gestion-administrativa-actividad-4/fichas_conceptos.docx
+++ b/ITESCA/maestria-en-gestion-administrativa/fundamentos-de-gestion-administrativa-mga/extractor-aulatex/conceptos-fundamentos-de-gestion-administrativa-actividad-4/fichas_conceptos.docx
@@ -20,7 +20,7 @@
         <w:pStyle w:val="Heading2"/>
       </w:pPr>
       <w:r>
-        <w:t>Ficha 01. management</w:t>
+        <w:t>Ficha 01. adaptación</w:t>
       </w:r>
     </w:p>
     <w:p>
@@ -31,7 +31,7 @@
         <w:t xml:space="preserve">Fuentes: </w:t>
       </w:r>
       <w:r>
-        <w:t>bright-et-al-2019-principles-of-management-openstax.pdf</w:t>
+        <w:t>Robbins y Coulter - Administracion - 13a ed - 2018.pdf; Robbins y Judge - Comportamiento organizacional - 17a ed - 2017.pdf</w:t>
       </w:r>
     </w:p>
     <w:p>
@@ -42,7 +42,7 @@
         <w:t xml:space="preserve">Ubicaciones: </w:t>
       </w:r>
       <w:r>
-        <w:t>bright-et-al-2019-principles-of-management-openstax.pdf, p. 11; bright-et-al-2019-principles-of-management-openstax.pdf, p. 372; bright-et-al-2019-principles-of-management-openstax.pdf, p. 64; bright-et-al-2019-principles-of-management-openstax.pdf, p. 73; bright-et-al-2019-principles-of-management-openstax.pdf, p. 74; bright-et-al-2019-principles-of-management-openstax.pdf, p. 88; bright-et-al-2019-principles-of-management-openstax.pdf, p. 89</w:t>
+        <w:t>Robbins y Coulter - Administracion - 13a ed - 2018.pdf, p. 131; Robbins y Coulter - Administracion - 13a ed - 2018.pdf, p. 189; Robbins y Judge - Comportamiento organizacional - 17a ed - 2017.pdf, p. 180; Robbins y Judge - Comportamiento organizacional - 17a ed - 2017.pdf, p. 563; Robbins y Judge - Comportamiento organizacional - 17a ed - 2017.pdf, p. 655; Robbins y Judge - Comportamiento organizacional - 17a ed - 2017.pdf, p. 86; Robbins y Judge - Comportamiento organizacional - 17a ed - 2017.pdf, p. 90</w:t>
       </w:r>
     </w:p>
     <w:p>
@@ -50,7 +50,7 @@
         <w:pStyle w:val="Heading3"/>
       </w:pPr>
       <w:r>
-        <w:t>bright-et-al-2019-principles-of-management-openstax.pdf — p. 64 — similitud 0.2740</w:t>
+        <w:t>Robbins y Coulter - Administracion - 13a ed - 2018.pdf — p. 131 — similitud 0.1645</w:t>
       </w:r>
     </w:p>
     <w:p>
@@ -58,7 +58,7 @@
         <w:ind w:left="360"/>
       </w:pPr>
       <w:r>
-        <w:t>“3 The History of Management Exhibit 3.1 (Gawler History/ Attribution 2.0 Generic (CC BY 2.0)) Introduction Learning Outcomes After reading this chapter, you should be able to answer these questions: 1. Describe management in the ancient world.”</w:t>
+        <w:t>“Esto se debe principalmente a que el aprendizaje estructurado ayuda a reducir la incertidumbre inherente a una nueva situación y suaviza la transición a un nuevo puesto de trabajo. Un dato adicional acerca de la adaptación a un nuevo empleo es el valor que tienen los contactos dentro de la organización como valiosas fuentes de información. Los colegas, supervisores y mentores son más útiles como fuentes de información precisa acerca de su trabajo y de la organización que los programas de orientación formales o la documentación organizacional.”</w:t>
       </w:r>
     </w:p>
     <w:p>
@@ -66,7 +66,7 @@
         <w:pStyle w:val="Heading3"/>
       </w:pPr>
       <w:r>
-        <w:t>bright-et-al-2019-principles-of-management-openstax.pdf — p. 89 — similitud 0.2673</w:t>
+        <w:t>Robbins y Coulter - Administracion - 13a ed - 2018.pdf — p. 131 — similitud 0.1644</w:t>
       </w:r>
     </w:p>
     <w:p>
@@ -74,7 +74,7 @@
         <w:ind w:left="360"/>
       </w:pPr>
       <w:r>
-        <w:t>“management, due to a wide variety of variables that influence relationships. Modern management is based on theory.”</w:t>
+        <w:t>“La importancia de este tema es resaltada por la investiga­ ción que nos dice que el individuo promedio cambia de empleo 10.2 veces en 20 años, por lo que debe prepararse para adap­ tarse a muchas situaciones laborales nuevas. Una de sus metas en un nuevo empleo debería ser el logro de una adaptación exitosa. ¿Esto qué implica? Se logra una transición exitosa si, después de seis meses en su nuevo puesto, puede decir que se siente cómodo, confiado y acep­ tado por sus compañeros de trabajo.”</w:t>
       </w:r>
     </w:p>
     <w:p>
@@ -82,7 +82,7 @@
         <w:pStyle w:val="Heading3"/>
       </w:pPr>
       <w:r>
-        <w:t>bright-et-al-2019-principles-of-management-openstax.pdf — p. 88 — similitud 0.2623</w:t>
+        <w:t>Robbins y Judge - Comportamiento organizacional - 17a ed - 2017.pdf — p. 563 — similitud 0.1450</w:t>
       </w:r>
     </w:p>
     <w:p>
@@ -90,7 +90,7 @@
         <w:ind w:left="360"/>
       </w:pPr>
       <w:r>
-        <w:t>“This economic shifted created the need for managers. 3.4 Taylor-Made Management 4. How did Frederick Winslow Taylor influence management theory, and how did efficiency in management affect current management theory?”</w:t>
+        <w:t>“Ray Dalio (fotografía), fundador del fondo de cobertura masivo Bridgewater Associates, dice que para los nuevos empleados no es fácil hacer la transición hacia la cultura orientada a los datos que existe en su organización. Dalio comentó que “hay un periodo —generalmente de unos 18 meses— de adaptación. Y algunos logran adaptarse, pero otros no”.”</w:t>
       </w:r>
     </w:p>
     <w:p>
@@ -98,7 +98,7 @@
         <w:pStyle w:val="Heading3"/>
       </w:pPr>
       <w:r>
-        <w:t>bright-et-al-2019-principles-of-management-openstax.pdf — p. 11 — similitud 0.2294</w:t>
+        <w:t>Robbins y Judge - Comportamiento organizacional - 17a ed - 2017.pdf — p. 180 — similitud 0.1425</w:t>
       </w:r>
     </w:p>
     <w:p>
@@ -106,7 +106,7 @@
         <w:ind w:left="360"/>
       </w:pPr>
       <w:r>
-        <w:t>“2 Preface About Principles of Management Principles of Management is designed to meet the scope and sequence requirements of the introductory course on management. This is a traditional approach to management using the leading, planning, organizing, and controlling approach.”</w:t>
+        <w:t>“Suelen ser socialmente dominantes; las personas que son más asertivas suelen “tomar el control” en vez de los introvertidos.31 Rasgos más importantes para el éxito en los negocios en compañías de adquisiciones Figura 5-1 Más importantes Menos importantes Persistencia Buena comunicación oral Atención a los detalles Trabajo en equipo Eficiencia Flexibilidad/capacidad de adaptación Habilidades analíticas Entusiasmo Establecimiento de estándares elevados Habilidades para escuchar”</w:t>
       </w:r>
     </w:p>
     <w:p>
@@ -114,7 +114,7 @@
         <w:pStyle w:val="Heading3"/>
       </w:pPr>
       <w:r>
-        <w:t>bright-et-al-2019-principles-of-management-openstax.pdf — p. 89 — similitud 0.2267</w:t>
+        <w:t>Robbins y Judge - Comportamiento organizacional - 17a ed - 2017.pdf — p. 86 — similitud 0.1364</w:t>
       </w:r>
     </w:p>
     <w:p>
@@ -122,7 +122,7 @@
         <w:ind w:left="360"/>
       </w:pPr>
       <w:r>
-        <w:t>“80 Chapter 3 The History of Management focused on top managers, and Weber focused on middle managers. Fayol’s administrative theory was the first general statement on management theory.”</w:t>
+        <w:t>“El Public Utilities Board, el orga- nismo encargado del suministro del agua en Singapur, informa que 27 por ciento de su fuerza laboral tiene más de 55 años, ya que los trabajadores mayores dan estabilidad al personal.22 Por su parte, industrias como las del cuidado de la salud, la educación, el gobierno y las compañías sin fines de lucro a menudo dan la bienvenida a los traba- jadores mayores.23 Sin embargo, aún existe la percepción de que los adultos mayores tienen una menor capacidad de adaptación y están menos motivados para aprender el”</w:t>
       </w:r>
     </w:p>
     <w:p>
@@ -130,7 +130,7 @@
         <w:pStyle w:val="Heading3"/>
       </w:pPr>
       <w:r>
-        <w:t>bright-et-al-2019-principles-of-management-openstax.pdf — p. 73 — similitud 0.2075</w:t>
+        <w:t>Robbins y Coulter - Administracion - 13a ed - 2018.pdf — p. 189 — similitud 0.1214</w:t>
       </w:r>
     </w:p>
     <w:p>
@@ -138,7 +138,7 @@
         <w:ind w:left="360"/>
       </w:pPr>
       <w:r>
-        <w:t>“Allied fields, such as psychology and sociology, were in their infancy. Any management education that did exist was mostly learned from lessons of history and literature. Although there were numerous examples of both excellent and terrible management, this education was anecdotal and not systematic.”</w:t>
+        <w:t>“Por ejemplo, la ley reconoce que una persona con problemas visuales no po- dría desempeñarse como piloto de avión, alguien con parálisis cerebral severa no podría ser cirujano y un individuo afectado por profundas limitaciones motrices estaría imposibilitado para trabajar como bombero. Sin embargo, la tecnología de las computadoras y otros dispositivos de adaptación han derribado muchos obstáculos laborales para ciertos empleados con discapacidades. En una encuesta reciente de la Sociedad para la administración de recursos humanos, 61 por ciento de los profesionales de RH encuestados afirmaron que sus organizaciones ya incluyen las discapacidades en sus planes de diversidad e inclusión.”</w:t>
       </w:r>
     </w:p>
     <w:p>
@@ -146,7 +146,7 @@
         <w:pStyle w:val="Heading3"/>
       </w:pPr>
       <w:r>
-        <w:t>bright-et-al-2019-principles-of-management-openstax.pdf — p. 74 — similitud 0.1992</w:t>
+        <w:t>Robbins y Judge - Comportamiento organizacional - 17a ed - 2017.pdf — p. 90 — similitud 0.1204</w:t>
       </w:r>
     </w:p>
     <w:p>
@@ -154,7 +154,7 @@
         <w:ind w:left="360"/>
       </w:pPr>
       <w:r>
-        <w:t>“Management and the workforce should work together to ensure that work is performed according to the principles of management. Taylor’s observation went against the long-established principles of both management and the worker who believed that each was the other’s enemy.”</w:t>
+        <w:t>“Discapacidades Las políticas laborales, tanto oficiales como circunstanciales, con respecto a los indivi- duos con discapacidades físicas o mentales varían de una nación a otra. Países como Australia, Estados Unidos, Reino Unido y Japón cuentan con leyes específicas que pro- tegen a los individuos con discapacidad.58 Estas leyes han dado como resultado ma- yor aceptación y adaptación de las personas con impedimentos físicos o mentales.”</w:t>
       </w:r>
     </w:p>
     <w:p>
@@ -162,7 +162,7 @@
         <w:pStyle w:val="Heading3"/>
       </w:pPr>
       <w:r>
-        <w:t>bright-et-al-2019-principles-of-management-openstax.pdf — p. 372 — similitud 0.1989</w:t>
+        <w:t>Robbins y Judge - Comportamiento organizacional - 17a ed - 2017.pdf — p. 655 — similitud 0.1204</w:t>
       </w:r>
     </w:p>
     <w:p>
@@ -170,7 +170,7 @@
         <w:ind w:left="360"/>
       </w:pPr>
       <w:r>
-        <w:t>“internal HR audits help the organization plan and feel comfortable with its level of preparedness and illustrates the value that a strong HR group can bring to the organization. 11.3 Performance Management 3. How do performance management practices impact company performance?”</w:t>
+        <w:t>“Hay algunas evidencias de que los gerentes que piensan de manera integral, y reconocen la importancia de equilibrar los factores paradójicos, son más eficaces, especialmente para generar un comporta- miento creativo y de adaptación en sus subalternos.42 teoría de la paradoja Plantea que la paradoja fundamental en la administración es que no existe un estatus óptimo final para una organización. Estimulación de una cultura innovadora ¿Cómo se volvería más innovadora una organización?”</w:t>
       </w:r>
     </w:p>
     <w:p>
@@ -181,7 +181,7 @@
         <w:t xml:space="preserve">Observación automática: </w:t>
       </w:r>
       <w:r>
-        <w:t>La ficha presenta coincidencias útiles, pero conviene revisar la pertinencia de cada cita. Se agruparon varias referencias dentro de la misma fuente.</w:t>
+        <w:t>La ficha presenta coincidencias útiles, pero conviene revisar la pertinencia de cada cita. Se agruparon referencias de múltiples fuentes para enriquecer el concepto.</w:t>
       </w:r>
     </w:p>
     <w:p>
@@ -189,7 +189,7 @@
         <w:pStyle w:val="Heading2"/>
       </w:pPr>
       <w:r>
-        <w:t>Ficha 02. organization</w:t>
+        <w:t>Ficha 02. administrativa</w:t>
       </w:r>
     </w:p>
     <w:p>
@@ -200,7 +200,7 @@
         <w:t xml:space="preserve">Fuentes: </w:t>
       </w:r>
       <w:r>
-        <w:t>bright-et-al-2019-principles-of-management-openstax.pdf</w:t>
+        <w:t>Robbins y Coulter - Administracion - 13a ed - 2018.pdf; Robbins y Judge - Comportamiento organizacional - 17a ed - 2017.pdf</w:t>
       </w:r>
     </w:p>
     <w:p>
@@ -211,7 +211,7 @@
         <w:t xml:space="preserve">Ubicaciones: </w:t>
       </w:r>
       <w:r>
-        <w:t>bright-et-al-2019-principles-of-management-openstax.pdf, p. 316; bright-et-al-2019-principles-of-management-openstax.pdf, p. 319; bright-et-al-2019-principles-of-management-openstax.pdf, p. 320; bright-et-al-2019-principles-of-management-openstax.pdf, p. 323; bright-et-al-2019-principles-of-management-openstax.pdf, p. 393; bright-et-al-2019-principles-of-management-openstax.pdf, p. 568; bright-et-al-2019-principles-of-management-openstax.pdf, p. 570; bright-et-al-2019-principles-of-management-openstax.pdf, p. 572</w:t>
+        <w:t>Robbins y Coulter - Administracion - 13a ed - 2018.pdf, p. 30; Robbins y Coulter - Administracion - 13a ed - 2018.pdf, p. 440; Robbins y Coulter - Administracion - 13a ed - 2018.pdf, p. 45; Robbins y Coulter - Administracion - 13a ed - 2018.pdf, p. 483; Robbins y Coulter - Administracion - 13a ed - 2018.pdf, p. 69; Robbins y Coulter - Administracion - 13a ed - 2018.pdf, p. 74; Robbins y Judge - Comportamiento organizacional - 17a ed - 2017.pdf, p. 558</w:t>
       </w:r>
     </w:p>
     <w:p>
@@ -219,7 +219,7 @@
         <w:pStyle w:val="Heading3"/>
       </w:pPr>
       <w:r>
-        <w:t>bright-et-al-2019-principles-of-management-openstax.pdf — p. 320 — similitud 0.2372</w:t>
+        <w:t>Robbins y Coulter - Administracion - 13a ed - 2018.pdf — p. 45 — similitud 0.1862</w:t>
       </w:r>
     </w:p>
     <w:p>
@@ -227,7 +227,7 @@
         <w:ind w:left="360"/>
       </w:pPr>
       <w:r>
-        <w:t>“organization, it is common to see a horizontal organizational structure, in which many individuals across the whole system are empowered to make organizational decision. An organization with a horizontal structure is also known as a flat organization because it often features only a few levels of organizational hierarchy.”</w:t>
+        <w:t>“Si dichos objetivos no se han logrado, es labor del gerente corregir la situación. Este proceso de supervisar, comparar y corregir es la función de control. organización Función administrativa que tiene que ver con disponer y estructurar el trabajo para lograr los objetivos organizacionales dirección Función administrativa que involucra trabajar con y a través de las personas para lograr los objetivos organizacionales control Función administrativa que consiste en supervisar, comparar y corregir el desempeño laboral ¿Qué tan bien este enfoque en las funciones logra describir la labor gerencial? ¿En todos los casos, los gerentes planean, organizan, dirigen y luego controlan?”</w:t>
       </w:r>
     </w:p>
     <w:p>
@@ -235,7 +235,7 @@
         <w:pStyle w:val="Heading3"/>
       </w:pPr>
       <w:r>
-        <w:t>bright-et-al-2019-principles-of-management-openstax.pdf — p. 570 — similitud 0.2200</w:t>
+        <w:t>Robbins y Coulter - Administracion - 13a ed - 2018.pdf — p. 45 — similitud 0.1575</w:t>
       </w:r>
     </w:p>
     <w:p>
@@ -243,7 +243,7 @@
         <w:ind w:left="360"/>
       </w:pPr>
       <w:r>
-        <w:t>“Chapter 17 Organizational Planning and Controlling 561 environment. Strategic management formulates and implements tactics that try to match an organization as closely as possible to its task environment for the purpose of meeting its objectives. Strategic plans address the organization’s institutional-level needs.”</w:t>
+        <w:t>“Cuando los gerentes motivan a sus subordinados, ayudan a resolver los conflictos de los grupos de trabajo, influyen en los individuos o en los equipos durante la ejecución de las tareas, seleccionan los ca- nales de comunicación más efectivos o afrontan de cualquier manera problemas relacionados con el comportamiento del personal; es decir, están dirigiendo. planeación Función administrativa que involucra la definición de objetivos, el establecimiento de estrategias para lograrlos y el desarrollo de planes para integrar y coordinar las actividades La última función administrativa es el control.”</w:t>
       </w:r>
     </w:p>
     <w:p>
@@ -251,7 +251,7 @@
         <w:pStyle w:val="Heading3"/>
       </w:pPr>
       <w:r>
-        <w:t>bright-et-al-2019-principles-of-management-openstax.pdf — p. 568 — similitud 0.2026</w:t>
+        <w:t>Robbins y Coulter - Administracion - 13a ed - 2018.pdf — p. 69 — similitud 0.1471</w:t>
       </w:r>
     </w:p>
     <w:p>
@@ -259,7 +259,7 @@
         <w:ind w:left="360"/>
       </w:pPr>
       <w:r>
-        <w:t>“The three hierarchical plans are interdependent, as they support the fulfillment of the three organizational needs. In the organization’s hierarchy, the technical core plans day-to-day operations.”</w:t>
+        <w:t>“Un estudio reveló que al liberar a los empleados de tareas repetitivas, éstos podían realizar labores esenciales de destreza manual un 25 por ciento más rápido.4 En AAB, una compañía suiza de energía y automatización, el uso de robots de adaptación redujo el tiempo perdido de los trabajadores en un 85 por ciento.5 teoría general de la administración Modelo administrativo que se enfoca en describir lo que hacen los gerentes y lo que constituye una buena práctica administrativa Teoría general de la administración La teoría general de la administración se enfoca más en lo que hacen los gerentes y en lo que constituye una buena práctica administrativa.”</w:t>
       </w:r>
     </w:p>
     <w:p>
@@ -267,7 +267,7 @@
         <w:pStyle w:val="Heading3"/>
       </w:pPr>
       <w:r>
-        <w:t>bright-et-al-2019-principles-of-management-openstax.pdf — p. 393 — similitud 0.1997</w:t>
+        <w:t>Robbins y Coulter - Administracion - 13a ed - 2018.pdf — p. 74 — similitud 0.1464</w:t>
       </w:r>
     </w:p>
     <w:p>
@@ -275,7 +275,7 @@
         <w:ind w:left="360"/>
       </w:pPr>
       <w:r>
-        <w:t>“integrating them as a resource for pursuing the overall strategy of the organization. Using Human Resources Tools Strategically To effectively align diversity with an organization’s strategy, the human resources function must be able to engage employees at dynamic levels.”</w:t>
+        <w:t>“La administración de la calidad total (o TQM por sus siglas en inglés) es una filosofía administrativa para la mejora continua y para responder a las necesidades y expectativas del clien- te. (Vea la figura HA-6). El término cliente hace referencia a quienes interactúan con los productos o servicios de la organización, ya sea a nivel interno o externo.”</w:t>
       </w:r>
     </w:p>
     <w:p>
@@ -283,7 +283,7 @@
         <w:pStyle w:val="Heading3"/>
       </w:pPr>
       <w:r>
-        <w:t>bright-et-al-2019-principles-of-management-openstax.pdf — p. 316 — similitud 0.1969</w:t>
+        <w:t>Robbins y Coulter - Administracion - 13a ed - 2018.pdf — p. 30 — similitud 0.1366</w:t>
       </w:r>
     </w:p>
     <w:p>
@@ -291,7 +291,7 @@
         <w:ind w:left="360"/>
       </w:pPr>
       <w:r>
-        <w:t>“The formal organization is an officially defined set of relationships, responsibilities, and connections that exist across an organization. The traditional organizational chart, as illustrated in Exhibit 10.2, is perhaps the most common way of depicting the formal organization.”</w:t>
+        <w:t>“Personalización masiva y organizaciones esbeltas   659 Parte 6: Práctica administrativa   662 El dilema de un gerente   662 Perspectiva global   662 Caso continuo: Starbucks – Control   663 Glosario   667 Índice de nombres   679 Índice de organizaciones   699 Índice analítico   705”</w:t>
       </w:r>
     </w:p>
     <w:p>
@@ -299,7 +299,7 @@
         <w:pStyle w:val="Heading3"/>
       </w:pPr>
       <w:r>
-        <w:t>bright-et-al-2019-principles-of-management-openstax.pdf — p. 319 — similitud 0.1867</w:t>
+        <w:t>Robbins y Judge - Comportamiento organizacional - 17a ed - 2017.pdf — p. 558 — similitud 0.1289</w:t>
       </w:r>
     </w:p>
     <w:p>
@@ -307,7 +307,7 @@
         <w:ind w:left="360"/>
       </w:pPr>
       <w:r>
-        <w:t>“Each manager in a hierarchy works within the span of control of another manager at a level of the organization. Centralization The next element to consider is how to manage the flows of resources and information in an organization, or its centralization.”</w:t>
+        <w:t>“En cuanto al trabajo realizado en el extranjero, se podría con- siderar la posibilidad de reestructurar las relaciones jerárquicas para adoptar menores extensiones del control para incremen- tar la responsabilidad administrativa, y vincular a los proveedo- res con la estructura organizacional de la parte corporativa de Boeing. O bien, podrían asignar las labores de manufactura a proveedores que se encuentren cerca de la línea final de en- samblaje y que estén bajo el control de Boeing, centralizando la estructura organizacional.”</w:t>
       </w:r>
     </w:p>
     <w:p>
@@ -315,7 +315,7 @@
         <w:pStyle w:val="Heading3"/>
       </w:pPr>
       <w:r>
-        <w:t>bright-et-al-2019-principles-of-management-openstax.pdf — p. 323 — similitud 0.1845</w:t>
+        <w:t>Robbins y Coulter - Administracion - 13a ed - 2018.pdf — p. 440 — similitud 0.1272</w:t>
       </w:r>
     </w:p>
     <w:p>
@@ -323,7 +323,7 @@
         <w:ind w:left="360"/>
       </w:pPr>
       <w:r>
-        <w:t>“In a new venture, nearly every employee might contribute to many aspects of an organization’s work. As the business grows, the workload increases, and more workers are needed.”</w:t>
+        <w:t>“Los factores que influyen en las remuneraciones y prestaciones de los empleados incluyen su antigüedad y desempeño, el tipo de trabajo que llevan a cabo, el tipo de negocio o industria, la presencia de sindicatos, el hecho de que la empresa haga énfasis en la mano de obra o en el capital, la filosofía administrativa, la ubicación geográfica, así como la rentabilidad y el tamaño de la compañía. Los sistemas salariales basados en las habilidades recompensan a los empleados por las ca- pacidades y competencias que pueden demostrar.”</w:t>
       </w:r>
     </w:p>
     <w:p>
@@ -331,7 +331,7 @@
         <w:pStyle w:val="Heading3"/>
       </w:pPr>
       <w:r>
-        <w:t>bright-et-al-2019-principles-of-management-openstax.pdf — p. 572 — similitud 0.1651</w:t>
+        <w:t>Robbins y Coulter - Administracion - 13a ed - 2018.pdf — p. 483 — similitud 0.1263</w:t>
       </w:r>
     </w:p>
     <w:p>
@@ -339,7 +339,7 @@
         <w:ind w:left="360"/>
       </w:pPr>
       <w:r>
-        <w:t>“There are two different views about how organizational goals are formulated. The first view focuses on an organization and its external environment. You will recall that there are many stakeholders (e.g., owners, employees, managers) who have a vested interest in the organization.”</w:t>
+        <w:t>“Al unirse al equipo de alto liderazgo de Starbucks como vicepresidenta ejecutiva y directora de tecnología, Gerri Martin-Flickinger dirige la planeación estratégica relacionada con la función global de tecnología de información de la empresa. La ejecutiva llevó a la empresa una gran pericia técnica y administrativa, incluyendo su experiencia en la nube, el análisis de datos masivos, tecnología móvil y seguridad, áreas que constituyen elementos de tecnología importantes en la estrategia de crecimiento de la empresa. Fuente: Ted S.”</w:t>
       </w:r>
     </w:p>
     <w:p>
@@ -350,7 +350,7 @@
         <w:t xml:space="preserve">Observación automática: </w:t>
       </w:r>
       <w:r>
-        <w:t>La ficha presenta coincidencias útiles, pero conviene revisar la pertinencia de cada cita. Se agruparon varias referencias dentro de la misma fuente.</w:t>
+        <w:t>La ficha presenta coincidencias útiles, pero conviene revisar la pertinencia de cada cita. Se agruparon referencias de múltiples fuentes para enriquecer el concepto.</w:t>
       </w:r>
     </w:p>
     <w:p>
@@ -358,7 +358,7 @@
         <w:pStyle w:val="Heading2"/>
       </w:pPr>
       <w:r>
-        <w:t>Ficha 03. organizational</w:t>
+        <w:t>Ficha 03. basta estructura</w:t>
       </w:r>
     </w:p>
     <w:p>
@@ -369,7 +369,7 @@
         <w:t xml:space="preserve">Fuentes: </w:t>
       </w:r>
       <w:r>
-        <w:t>bright-et-al-2019-principles-of-management-openstax.pdf</w:t>
+        <w:t>Robbins y Coulter - Administracion - 13a ed - 2018.pdf; Robbins y Judge - Comportamiento organizacional - 17a ed - 2017.pdf</w:t>
       </w:r>
     </w:p>
     <w:p>
@@ -380,7 +380,7 @@
         <w:t xml:space="preserve">Ubicaciones: </w:t>
       </w:r>
       <w:r>
-        <w:t>bright-et-al-2019-principles-of-management-openstax.pdf, p. 100; bright-et-al-2019-principles-of-management-openstax.pdf, p. 108; bright-et-al-2019-principles-of-management-openstax.pdf, p. 122; bright-et-al-2019-principles-of-management-openstax.pdf, p. 123; bright-et-al-2019-principles-of-management-openstax.pdf, p. 316; bright-et-al-2019-principles-of-management-openstax.pdf, p. 341; bright-et-al-2019-principles-of-management-openstax.pdf, p. 342; bright-et-al-2019-principles-of-management-openstax.pdf, p. 344</w:t>
+        <w:t>Robbins y Coulter - Administracion - 13a ed - 2018.pdf, p. 22; Robbins y Coulter - Administracion - 13a ed - 2018.pdf, p. 395; Robbins y Coulter - Administracion - 13a ed - 2018.pdf, p. 404; Robbins y Coulter - Administracion - 13a ed - 2018.pdf, p. 707; Robbins y Judge - Comportamiento organizacional - 17a ed - 2017.pdf, p. 531; Robbins y Judge - Comportamiento organizacional - 17a ed - 2017.pdf, p. 540; Robbins y Judge - Comportamiento organizacional - 17a ed - 2017.pdf, p. 707</w:t>
       </w:r>
     </w:p>
     <w:p>
@@ -388,7 +388,7 @@
         <w:pStyle w:val="Heading3"/>
       </w:pPr>
       <w:r>
-        <w:t>bright-et-al-2019-principles-of-management-openstax.pdf — p. 344 — similitud 0.2131</w:t>
+        <w:t>Robbins y Judge - Comportamiento organizacional - 17a ed - 2017.pdf — p. 707 — similitud 0.1543</w:t>
       </w:r>
     </w:p>
     <w:p>
@@ -396,7 +396,7 @@
         <w:ind w:left="360"/>
       </w:pPr>
       <w:r>
-        <w:t>“Chapter 10 Organizational Structure and Change 335 2. What are different types of organizational structures?”</w:t>
+        <w:t>“estructura circular Estructura organizacional donde los ejecu- tivos se ubican en el centro y difunden su visión hacia afuera, en anillos agrupados de acuerdo con su función (gerentes, luego especialistas, después trabajadores). estructura de equipo Estructura organizacional que sustituye los departamentos con equipos facultados, y que elimina los límites horizontales y las barreras externas entre los clientes y los proveedores. estructura de iniciación El grado en que un líder tiende a de- finir y estructurar su rol y el de los subalternos, en la búsqueda del logro de las metas. estructura de la tarea Grado en que están definidos los proce- dimientos para las tareas del puesto. estructura...”</w:t>
       </w:r>
     </w:p>
     <w:p>
@@ -404,7 +404,7 @@
         <w:pStyle w:val="Heading3"/>
       </w:pPr>
       <w:r>
-        <w:t>bright-et-al-2019-principles-of-management-openstax.pdf — p. 122 — similitud 0.2103</w:t>
+        <w:t>Robbins y Coulter - Administracion - 13a ed - 2018.pdf — p. 395 — similitud 0.1155</w:t>
       </w:r>
     </w:p>
     <w:p>
@@ -412,7 +412,7 @@
         <w:ind w:left="360"/>
       </w:pPr>
       <w:r>
-        <w:t>“An organizational structure characterized by functional departments grouped under a division head. Domain The purpose of the organization from which its strategies, organizational capabilities, resources, and management systems are mobilized to support the enterprise’s purpose.”</w:t>
+        <w:t>“estructura simple Diseño organizacional con poca departamentalización, amplios tramos de control, autoridad centralizada y poca formalización Estructura funcional La estructura funcional es un diseño organizacional que agrupa especialidades ocupacionales similares o relacionadas.”</w:t>
       </w:r>
     </w:p>
     <w:p>
@@ -420,7 +420,7 @@
         <w:pStyle w:val="Heading3"/>
       </w:pPr>
       <w:r>
-        <w:t>bright-et-al-2019-principles-of-management-openstax.pdf — p. 342 — similitud 0.2019</w:t>
+        <w:t>Robbins y Coulter - Administracion - 13a ed - 2018.pdf — p. 404 — similitud 0.1149</w:t>
       </w:r>
     </w:p>
     <w:p>
@@ -428,7 +428,7 @@
         <w:ind w:left="360"/>
       </w:pPr>
       <w:r>
-        <w:t>“OD consultant Someone who has expertise in change management processes. organic bureaucratic structure Used in organizations that face unstable and dynamic environments and need to quickly adapt to change. organization development (OD) Techniques and methods that managers can use to increase the adaptability of their organization. organization-level change A change that affects an entire organizational system or several of its units.”</w:t>
+        <w:t>“La estructura de la organización debe respaldar su estrategia. Si la estrategia cambia, la estructura también debe cambiar.”</w:t>
       </w:r>
     </w:p>
     <w:p>
@@ -436,7 +436,7 @@
         <w:pStyle w:val="Heading3"/>
       </w:pPr>
       <w:r>
-        <w:t>bright-et-al-2019-principles-of-management-openstax.pdf — p. 341 — similitud 0.1986</w:t>
+        <w:t>Robbins y Judge - Comportamiento organizacional - 17a ed - 2017.pdf — p. 531 — similitud 0.1071</w:t>
       </w:r>
     </w:p>
     <w:p>
@@ -444,7 +444,7 @@
         <w:ind w:left="360"/>
       </w:pPr>
       <w:r>
-        <w:t>“A horizontal organizational structure in which many individuals across the whole system are empowered to make organizational decisions. formal organization A fixed set of rules of organizational procedures and structures. formalization The process of making a status formal for the practice of formal acceptance. geographic structures Occur when organizations are set up to deliver a range of products within a geographic area or region. group-level change Centers on the relationships between people and focuses on helping people to work more effectively together. horizontal organizational structure Flat organizational structure in which many individuals across the whole system are empowered to...”</w:t>
+        <w:t>“Fundamentos de la estructura organizacional CAPÍTULO 15 493 I ncluso para una nueva empresa con unos cuantos empleados, la elección de una estructura organizacional requiere mucho más que el simple hecho de decidir quién será el jefe y cuántos trabajadores se necesitan. La estructura de la organización deter- minará qué relaciones se deben formar, la formalidad de esas relaciones y muchos re- sultados del trabajo.”</w:t>
       </w:r>
     </w:p>
     <w:p>
@@ -452,7 +452,7 @@
         <w:pStyle w:val="Heading3"/>
       </w:pPr>
       <w:r>
-        <w:t>bright-et-al-2019-principles-of-management-openstax.pdf — p. 100 — similitud 0.1902</w:t>
+        <w:t>Robbins y Coulter - Administracion - 13a ed - 2018.pdf — p. 22 — similitud 0.1054</w:t>
       </w:r>
     </w:p>
     <w:p>
@@ -460,7 +460,7 @@
         <w:ind w:left="360"/>
       </w:pPr>
       <w:r>
-        <w:t>“Chapter 4 External and Internal Organizational Environments and Corporate Culture 91 C O N C E P T C H E C K 1. What factors within the economic environment affect businesses?”</w:t>
+        <w:t>“Tamaño y estructura   358 Tecnología y estructura   358 Incertidumbre del entorno y estructura   358 Diseños organizacionales tradicionales   359 Estructura simple   359 Estructura funcional   359 Estructura divisional   359 Organización para la flexibilidad en el siglo XXI   360 Estructuras de equipos   360 Estructuras matricial y de proyectos   361 La organización sin límites   362 Trabajo a distancia   364”</w:t>
       </w:r>
     </w:p>
     <w:p>
@@ -468,7 +468,7 @@
         <w:pStyle w:val="Heading3"/>
       </w:pPr>
       <w:r>
-        <w:t>bright-et-al-2019-principles-of-management-openstax.pdf — p. 316 — similitud 0.1847</w:t>
+        <w:t>Robbins y Judge - Comportamiento organizacional - 17a ed - 2017.pdf — p. 540 — similitud 0.0967</w:t>
       </w:r>
     </w:p>
     <w:p>
@@ -476,7 +476,7 @@
         <w:ind w:left="360"/>
       </w:pPr>
       <w:r>
-        <w:t>“Chapter 10 Organizational Structure and Change 307 distribution system for a company in Northern Europe. Almost overnight, Justin was responsible for hiring competent people, forming them into a coherent organization, training them, and establishing the needed infrastructure for sustained success in this new market.”</w:t>
+        <w:t>“Estructura funcional es adecuada si la organización se enfoca en un producto o servicio. Por desgracia, crea comunicaciones formales y rígidas debido a que la jerar- quía determina el protocolo de comunicación.”</w:t>
       </w:r>
     </w:p>
     <w:p>
@@ -484,7 +484,7 @@
         <w:pStyle w:val="Heading3"/>
       </w:pPr>
       <w:r>
-        <w:t>bright-et-al-2019-principles-of-management-openstax.pdf — p. 123 — similitud 0.1819</w:t>
+        <w:t>Robbins y Coulter - Administracion - 13a ed - 2018.pdf — p. 707 — similitud 0.0833</w:t>
       </w:r>
     </w:p>
     <w:p>
@@ -492,7 +492,7 @@
         <w:ind w:left="360"/>
       </w:pPr>
       <w:r>
-        <w:t>“Finally, the issue of organizational complexity and its impact on organizational structure needs to be understood. You should be able to discuss the evolution of different types of Organizational Structures.”</w:t>
+        <w:t>“de Fiedler que describe el grado de formalidad y estruc­ tura de las tareas laborales estructura de proyectos  Estructura organizacional en la decisiones de inversión flexibilidad estratégica  Capacidad para reconocer importan­ tes cambios externos para movilizar con rapidez recursos y reconocer cuando una decisión estratégica fue errónea Fondo Monetario Internacional (FMI)  Organización cons­ que los empleados trabajan continuamente en diferentes pro­- yectos estructura de red social  Patrones de conexión informal entre tituida por 185 países, que promueve la cooperación mone­ taria internacional y brinda asesoría, créditos y asistencia técnica a sus socios formalización  Nivel de...”</w:t>
       </w:r>
     </w:p>
     <w:p>
@@ -500,7 +500,7 @@
         <w:pStyle w:val="Heading3"/>
       </w:pPr>
       <w:r>
-        <w:t>bright-et-al-2019-principles-of-management-openstax.pdf — p. 108 — similitud 0.1791</w:t>
+        <w:t>Robbins y Coulter - Administracion - 13a ed - 2018.pdf — p. 395 — similitud 0.0814</w:t>
       </w:r>
     </w:p>
     <w:p>
@@ -508,7 +508,7 @@
         <w:ind w:left="360"/>
       </w:pPr>
       <w:r>
-        <w:t>“Chapter 4 External and Internal Organizational Environments and Corporate Culture 99 organizations that cut across geographies, time zones, skills, and traditional authority structures to solve customer and even enterprise organizational needs and demands. As part of the next discussed organizational type of structure, networked teams, organizational members in matrix structures must “learn how to collaborate with colleagues across distance, cultures and other barriers.”</w:t>
+        <w:t>“En este capítulo describiremos los diseños organizacionales tradicionales y también algunos de los tipos más contemporáneos. OA11.4 Cuando los gerentes diseñan una estructura, pueden elegir uno de los diseños tradicionales, los cuales tienden a ser más mecanicistas. En la figura 11-8 se presenta un resumen de las ventajas y desventajas de cada una de ellas.”</w:t>
       </w:r>
     </w:p>
     <w:p>
@@ -519,7 +519,7 @@
         <w:t xml:space="preserve">Observación automática: </w:t>
       </w:r>
       <w:r>
-        <w:t>La ficha presenta coincidencias útiles, pero conviene revisar la pertinencia de cada cita. Se agruparon varias referencias dentro de la misma fuente.</w:t>
+        <w:t>La ficha presenta coincidencias útiles, pero conviene revisar la pertinencia de cada cita. Se agruparon referencias de múltiples fuentes para enriquecer el concepto.</w:t>
       </w:r>
     </w:p>
     <w:p>
@@ -527,7 +527,7 @@
         <w:pStyle w:val="Heading2"/>
       </w:pPr>
       <w:r>
-        <w:t>Ficha 04. performance</w:t>
+        <w:t>Ficha 04. competitiva</w:t>
       </w:r>
     </w:p>
     <w:p>
@@ -538,7 +538,7 @@
         <w:t xml:space="preserve">Fuentes: </w:t>
       </w:r>
       <w:r>
-        <w:t>bright-et-al-2019-principles-of-management-openstax.pdf</w:t>
+        <w:t>Robbins y Coulter - Administracion - 13a ed - 2018.pdf</w:t>
       </w:r>
     </w:p>
     <w:p>
@@ -549,7 +549,7 @@
         <w:t xml:space="preserve">Ubicaciones: </w:t>
       </w:r>
       <w:r>
-        <w:t>bright-et-al-2019-principles-of-management-openstax.pdf, p. 355; bright-et-al-2019-principles-of-management-openstax.pdf, p. 357; bright-et-al-2019-principles-of-management-openstax.pdf, p. 358; bright-et-al-2019-principles-of-management-openstax.pdf, p. 359; bright-et-al-2019-principles-of-management-openstax.pdf, p. 372; bright-et-al-2019-principles-of-management-openstax.pdf, p. 373; bright-et-al-2019-principles-of-management-openstax.pdf, p. 493; bright-et-al-2019-principles-of-management-openstax.pdf, p. 582</w:t>
+        <w:t>Robbins y Coulter - Administracion - 13a ed - 2018.pdf, p. 302; Robbins y Coulter - Administracion - 13a ed - 2018.pdf, p. 323; Robbins y Coulter - Administracion - 13a ed - 2018.pdf, p. 324; Robbins y Coulter - Administracion - 13a ed - 2018.pdf, p. 325; Robbins y Coulter - Administracion - 13a ed - 2018.pdf, p. 333; Robbins y Coulter - Administracion - 13a ed - 2018.pdf, p. 351; Robbins y Coulter - Administracion - 13a ed - 2018.pdf, p. 665</w:t>
       </w:r>
     </w:p>
     <w:p>
@@ -557,7 +557,7 @@
         <w:pStyle w:val="Heading3"/>
       </w:pPr>
       <w:r>
-        <w:t>bright-et-al-2019-principles-of-management-openstax.pdf — p. 358 — similitud 0.2972</w:t>
+        <w:t>Robbins y Coulter - Administracion - 13a ed - 2018.pdf — p. 323 — similitud 0.2644</w:t>
       </w:r>
     </w:p>
     <w:p>
@@ -565,7 +565,7 @@
         <w:ind w:left="360"/>
       </w:pPr>
       <w:r>
-        <w:t>“Chapter 11 Human Resource Management 349 challenges over time. Human resource management professionals need to be aware of these challenges and design a performance management system that addresses them in the format and within the context of their culture. C O N C E P T C H E C K 1.”</w:t>
+        <w:t>“Estas empresas han generado una ventaja competitiva. Para desarrollar una estrategia competitiva eficaz, es preciso comprender qué es la ventaja competitiva, es decir, aquello que distingue a una organización respecto de las demás, es decir, su sello distintivo.27 Ese rasgo definitorio puede derivar de las competencias fundamentales de la organización, las cuales le permiten hacer algo que el resto no puede o hacerlo mejor que todas las demás.”</w:t>
       </w:r>
     </w:p>
     <w:p>
@@ -573,7 +573,7 @@
         <w:pStyle w:val="Heading3"/>
       </w:pPr>
       <w:r>
-        <w:t>bright-et-al-2019-principles-of-management-openstax.pdf — p. 372 — similitud 0.2700</w:t>
+        <w:t>Robbins y Coulter - Administracion - 13a ed - 2018.pdf — p. 302 — similitud 0.2278</w:t>
       </w:r>
     </w:p>
     <w:p>
@@ -581,7 +581,7 @@
         <w:ind w:left="360"/>
       </w:pPr>
       <w:r>
-        <w:t>“internal HR audits help the organization plan and feel comfortable with its level of preparedness and illustrates the value that a strong HR group can bring to the organization. 11.3 Performance Management 3. How do performance management practices impact company performance?”</w:t>
+        <w:t>“266    Parte 3  Planeación generando más adeptos es la inteligencia competitiva, que es el proceso de obtener información sobre los competidores para que los gerentes puedan anticipar sus acciones en lugar de limitarse a reac- cionar a ellas.41 La inteligencia competitiva se basa en información fundamental sobre los competidores: ¿Quiénes son? ¿Qué están ha- ciendo? ¿De qué manera nos afectan sus acciones?”</w:t>
       </w:r>
     </w:p>
     <w:p>
@@ -589,7 +589,7 @@
         <w:pStyle w:val="Heading3"/>
       </w:pPr>
       <w:r>
-        <w:t>bright-et-al-2019-principles-of-management-openstax.pdf — p. 355 — similitud 0.2670</w:t>
+        <w:t>Robbins y Coulter - Administracion - 13a ed - 2018.pdf — p. 351 — similitud 0.2245</w:t>
       </w:r>
     </w:p>
     <w:p>
@@ -597,7 +597,7 @@
         <w:ind w:left="360"/>
       </w:pPr>
       <w:r>
-        <w:t>“As the dissatisfaction with performance management processes began to increase, some companies began to change the way they thought about performance. In 2001, an “Agile Manifesto” was developed by software developers and “emphasized principles of collaboration, self-organization, self-direction, and regular reflection on how to work more effectively, with the aim of prototyping more quickly and responding in real-time to customer feedback and changes in requirements.” (Performance Management Revolution, HBR).”</w:t>
+        <w:t>“• 34.3 por ciento habló de una oportunidad o revelación repentinos • 23.5 por ciento dijo haber seguido una pasión • 11.8 por ciento habló de una sugerencia o colaboración • 11.8 por ciento dijo que se debió al producto o servicio de alguien más • 10.8 por ciento dijo que investigó el mercado • 7.8 por ciento respondió “otro” Estar alerta a las oportunidades empresariales es tan solo una parte de los esfuerzos ini- ciales de un emprendedor. También debe entender cuál es su ventaja competitiva. Como mencio- namos en el capítulo 9, cuando una organización cuenta con una ventaja competitiva, tiene algo que las otras no tienen; hace algo mejor que las otras; o hace algo que las demás no pueden.”</w:t>
       </w:r>
     </w:p>
     <w:p>
@@ -605,7 +605,7 @@
         <w:pStyle w:val="Heading3"/>
       </w:pPr>
       <w:r>
-        <w:t>bright-et-al-2019-principles-of-management-openstax.pdf — p. 582 — similitud 0.2648</w:t>
+        <w:t>Robbins y Coulter - Administracion - 13a ed - 2018.pdf — p. 324 — similitud 0.2226</w:t>
       </w:r>
     </w:p>
     <w:p>
@@ -613,7 +613,7 @@
         <w:ind w:left="360"/>
       </w:pPr>
       <w:r>
-        <w:t>“level of performance in relation to his aspiration level.44 Job satisfaction, therefore, stems from the employee’s evaluation of his actual performance in comparison to his aspiration level (or performance goal). In cases (see Exhibit 17.12) where performance reaches or passes the level aspired to, a positive emotion (job satisfaction) is likely to be produced.”</w:t>
+        <w:t>“288    Parte 3  Planeación LA CALIDAD COMO VENTAJA COMPETITIVA  Cuando W. K.”</w:t>
       </w:r>
     </w:p>
     <w:p>
@@ -621,7 +621,7 @@
         <w:pStyle w:val="Heading3"/>
       </w:pPr>
       <w:r>
-        <w:t>bright-et-al-2019-principles-of-management-openstax.pdf — p. 357 — similitud 0.2373</w:t>
+        <w:t>Robbins y Coulter - Administracion - 13a ed - 2018.pdf — p. 333 — similitud 0.2207</w:t>
       </w:r>
     </w:p>
     <w:p>
@@ -629,7 +629,7 @@
         <w:ind w:left="360"/>
       </w:pPr>
       <w:r>
-        <w:t>“The next key challenge to think about when designing a performance management process is rewarding performance. Reward structures are discussed later in this chapter, but reward systems must be rooted in performance management systems.”</w:t>
+        <w:t>“DESCRIBIR la ventaja competitiva y las estrategias competitivas que emplean las organizaciones para obtenerla. La ventaja competitiva de una organización es aquello que la distingue respecto de todas las de­ más, su sello distintivo.”</w:t>
       </w:r>
     </w:p>
     <w:p>
@@ -637,7 +637,7 @@
         <w:pStyle w:val="Heading3"/>
       </w:pPr>
       <w:r>
-        <w:t>bright-et-al-2019-principles-of-management-openstax.pdf — p. 373 — similitud 0.2252</w:t>
+        <w:t>Robbins y Coulter - Administracion - 13a ed - 2018.pdf — p. 323 — similitud 0.2015</w:t>
       </w:r>
     </w:p>
     <w:p>
@@ -645,7 +645,7 @@
         <w:ind w:left="360"/>
       </w:pPr>
       <w:r>
-        <w:t>“364 Chapter 11 Human Resource Management 11.4 Influencing Employee Performance and Motivation 4. How do companies use rewards strategies to influence employee performance and motivation?”</w:t>
+        <w:t>“Después de analizarlas con todo cuidado, tendrán que vender algunas y proteger estratégicamente a otras que pudieran progresar hasta convertirse en estrellas. ESTRATEGIAS competitivas La estrategia competitiva es aquella que determina cómo competirá la organi­ zación en sus líneas de negocio. En el caso de las pequeñas empresas que operan únicamente una línea de negocio o de las grandes compañías que no se han diversificado hacia di­ ferentes productos o mercados, la estrategia competitiva describe cómo competirán en su mercado principal.”</w:t>
       </w:r>
     </w:p>
     <w:p>
@@ -653,7 +653,7 @@
         <w:pStyle w:val="Heading3"/>
       </w:pPr>
       <w:r>
-        <w:t>bright-et-al-2019-principles-of-management-openstax.pdf — p. 493 — similitud 0.2093</w:t>
+        <w:t>Robbins y Coulter - Administracion - 13a ed - 2018.pdf — p. 325 — similitud 0.1928</w:t>
       </w:r>
     </w:p>
     <w:p>
@@ -661,7 +661,7 @@
         <w:ind w:left="360"/>
       </w:pPr>
       <w:r>
-        <w:t>“484 Chapter 14 Work Motivation for Performance Whatever the cause of rating errors, some employees may come to believe that no matter what they do they will never receive a high performance rating. They may in fact believe that they are excellent performers but that the performance rating system is flawed.”</w:t>
+        <w:t>“La inestabilidad del mercado, las nuevas tecnologías y otros cambios pueden poner en entredicho los intentos que hagan los gerentes por crear una ventaja competitiva sostenible en el largo plazo. Sin embargo, por medio de la administración estratégica, los gerentes pueden posicionar mejor a sus organizaciones y obtener una ventaja competitiva imperecedera.”</w:t>
       </w:r>
     </w:p>
     <w:p>
@@ -669,7 +669,7 @@
         <w:pStyle w:val="Heading3"/>
       </w:pPr>
       <w:r>
-        <w:t>bright-et-al-2019-principles-of-management-openstax.pdf — p. 359 — similitud 0.2072</w:t>
+        <w:t>Robbins y Coulter - Administracion - 13a ed - 2018.pdf — p. 665 — similitud 0.1879</w:t>
       </w:r>
     </w:p>
     <w:p>
@@ -677,7 +677,7 @@
         <w:ind w:left="360"/>
       </w:pPr>
       <w:r>
-        <w:t>“philosophy and the practices themselves are being carried out appropriately and legally. Human resource management’s role in establishing pay for performance is that HR must engage business leadership to establish the following elements of the framework: 1. Define the organization’s pay philosophy.”</w:t>
+        <w:t>“Los gerentes de la empresa empezaron a desarrollar de inmediato planes para contrarrestar aquel ataque compe- titivo.6 Sin embargo, actuar de inmediato no siempre es una decisión prudente. La inteligencia competitiva también sugiere que alejarse de un curso de acción puede ser lo más apropiado.”</w:t>
       </w:r>
     </w:p>
     <w:p>
@@ -688,7 +688,7 @@
         <w:t xml:space="preserve">Observación automática: </w:t>
       </w:r>
       <w:r>
-        <w:t>La ficha presenta una coincidencia fuerte con el concepto buscado. Se agruparon varias referencias dentro de la misma fuente.</w:t>
+        <w:t>La ficha presenta coincidencias útiles, pero conviene revisar la pertinencia de cada cita. Se agruparon varias referencias dentro de la misma fuente.</w:t>
       </w:r>
     </w:p>
     <w:p>
@@ -696,7 +696,7 @@
         <w:pStyle w:val="Heading2"/>
       </w:pPr>
       <w:r>
-        <w:t>Ficha 05. organizations</w:t>
+        <w:t>Ficha 05. estrategia</w:t>
       </w:r>
     </w:p>
     <w:p>
@@ -707,7 +707,7 @@
         <w:t xml:space="preserve">Fuentes: </w:t>
       </w:r>
       <w:r>
-        <w:t>bright-et-al-2019-principles-of-management-openstax.pdf</w:t>
+        <w:t>Robbins y Coulter - Administracion - 13a ed - 2018.pdf; Robbins y Judge - Comportamiento organizacional - 17a ed - 2017.pdf</w:t>
       </w:r>
     </w:p>
     <w:p>
@@ -718,7 +718,7 @@
         <w:t xml:space="preserve">Ubicaciones: </w:t>
       </w:r>
       <w:r>
-        <w:t>bright-et-al-2019-principles-of-management-openstax.pdf, p. 110; bright-et-al-2019-principles-of-management-openstax.pdf, p. 121; bright-et-al-2019-principles-of-management-openstax.pdf, p. 123; bright-et-al-2019-principles-of-management-openstax.pdf, p. 128; bright-et-al-2019-principles-of-management-openstax.pdf, p. 392; bright-et-al-2019-principles-of-management-openstax.pdf, p. 600; bright-et-al-2019-principles-of-management-openstax.pdf, p. 90</w:t>
+        <w:t>Robbins y Coulter - Administracion - 13a ed - 2018.pdf, p. 250; Robbins y Coulter - Administracion - 13a ed - 2018.pdf, p. 322; Robbins y Coulter - Administracion - 13a ed - 2018.pdf, p. 707; Robbins y Judge - Comportamiento organizacional - 17a ed - 2017.pdf, p. 548; Robbins y Judge - Comportamiento organizacional - 17a ed - 2017.pdf, p. 706</w:t>
       </w:r>
     </w:p>
     <w:p>
@@ -726,7 +726,7 @@
         <w:pStyle w:val="Heading3"/>
       </w:pPr>
       <w:r>
-        <w:t>bright-et-al-2019-principles-of-management-openstax.pdf — p. 392 — similitud 0.2190</w:t>
+        <w:t>Robbins y Coulter - Administracion - 13a ed - 2018.pdf — p. 707 — similitud 0.3091</w:t>
       </w:r>
     </w:p>
     <w:p>
@@ -734,7 +734,7 @@
         <w:ind w:left="360"/>
       </w:pPr>
       <w:r>
-        <w:t>“Studies show that women and minorities have greater job-pursuit intentions and higher attraction toward organizations that promote workplace diversity in their recruitment materials compared to organizations that do not.102 When employers attract minority applicants, their labor pool increases in size compared to organizations that are not attractive to them. As organizations attract more job candidates, the chances of hiring quality employees increases, especially for jobs that demand highly skilled labor.”</w:t>
+        <w:t>“decisiones y realice el trabajo de la forma que considere más conveniente estrategia competitiva  Estrategia organizacional que deter­ cuando el grupo es totalmente funcional y trabaja en el cum­ plimiento de una tarea específica etapa de disolución  Etapa final del desarrollo para los grupos mina cómo competirá la organización en sus líneas de negocio estrategia corporativa  Estrategia organizacional que deter­ temporales, durante la cual los integrantes del grupo tienen más interés en actividades de conclusión que en el desem­ peño de la tarea etapa de normalización  Tercera etapa del desarrollo grupal, mina en qué líneas de negocio opera o desea operar la empresa y qué quiere lograr al...”</w:t>
       </w:r>
     </w:p>
     <w:p>
@@ -742,7 +742,7 @@
         <w:pStyle w:val="Heading3"/>
       </w:pPr>
       <w:r>
-        <w:t>bright-et-al-2019-principles-of-management-openstax.pdf — p. 392 — similitud 0.1960</w:t>
+        <w:t>Robbins y Coulter - Administracion - 13a ed - 2018.pdf — p. 322 — similitud 0.2663</w:t>
       </w:r>
     </w:p>
     <w:p>
@@ -750,7 +750,7 @@
         <w:ind w:left="360"/>
       </w:pPr>
       <w:r>
-        <w:t>“Chapter 12 Diversity in Organizations 383 damages compared to other organizations that do not have such policies in place. Additionally, organizations with a more visible climate of diversity experience lower turnover among women and minorities compared to companies that are perceived to not value diversity.99 Turnover costs can be substantial for companies over time, and diverse companies may ameliorate turnover by retaining their female and minority employees.”</w:t>
+        <w:t>“La estrategia de racionalización es una estrategia de renovación de corto plazo, utili­ zada para solucionar problemas de desempeño no muy complejos. Esta estrategia contribuye a que la organización estabilice sus operaciones, revitalice sus recursos y capacidades, y se prepare para volver a la com­ petencia.”</w:t>
       </w:r>
     </w:p>
     <w:p>
@@ -758,7 +758,7 @@
         <w:pStyle w:val="Heading3"/>
       </w:pPr>
       <w:r>
-        <w:t>bright-et-al-2019-principles-of-management-openstax.pdf — p. 128 — similitud 0.1914</w:t>
+        <w:t>Robbins y Judge - Comportamiento organizacional - 17a ed - 2017.pdf — p. 706 — similitud 0.2656</w:t>
       </w:r>
     </w:p>
     <w:p>
@@ -766,7 +766,7 @@
         <w:ind w:left="360"/>
       </w:pPr>
       <w:r>
-        <w:t>“3. What are major ethical principles that can guide individuals and organizations? 4.”</w:t>
+        <w:t>“ercados, tan sólo des- pués de que se haya demostrado su viabilidad. estrategia de innovación Estrategia que enfatiza la introduc- ción de productos y servicios nuevos e importantes. estrategia de minimización de costos Estrategia que hace hincapié en control estricto de los costos, evitación de innova- ciones o gastos de comercialización innecesarios, y reducción de precios. estrés Proceso psicológico desagradable que ocurre en res- puesta a presiones ambientales.”</w:t>
       </w:r>
     </w:p>
     <w:p>
@@ -774,7 +774,7 @@
         <w:pStyle w:val="Heading3"/>
       </w:pPr>
       <w:r>
-        <w:t>bright-et-al-2019-principles-of-management-openstax.pdf — p. 123 — similitud 0.1867</w:t>
+        <w:t>Robbins y Coulter - Administracion - 13a ed - 2018.pdf — p. 250 — similitud 0.2285</w:t>
       </w:r>
     </w:p>
     <w:p>
@@ -782,7 +782,7 @@
         <w:ind w:left="360"/>
       </w:pPr>
       <w:r>
-        <w:t>“Define the external environment of organizations Organizations must react and adapt to many forces in their internal and external environments. The context of the firms such as size and geographic location impact how environmental forces affect each organization differently.”</w:t>
+        <w:t>“214    Parte 2  Fundamentos de la administración en el lugar de trabajo actual Estrategia Si una compañía no logra cambiar la estrategia cuando las circunstancias lo exigen, su éxito se podría haber comprometido. Consideremos el ejemplo de Ryanair, una línea aérea regional ubica- da en Europa.”</w:t>
       </w:r>
     </w:p>
     <w:p>
@@ -790,7 +790,7 @@
         <w:pStyle w:val="Heading3"/>
       </w:pPr>
       <w:r>
-        <w:t>bright-et-al-2019-principles-of-management-openstax.pdf — p. 90 — similitud 0.1544</w:t>
+        <w:t>Robbins y Coulter - Administracion - 13a ed - 2018.pdf — p. 707 — similitud 0.2284</w:t>
       </w:r>
     </w:p>
     <w:p>
@@ -798,7 +798,7 @@
         <w:ind w:left="360"/>
       </w:pPr>
       <w:r>
-        <w:t>“4 External and Internal Organizational Environments and Corporate Culture Exhibit 4.1 (Credit: Free-Photos/ Pixabay/ (CC BY 0)), modified from an original image by Ivan Mlinaric) Introduction Learning Outcomes After reading this chapter, you should be able to understand these statements: 1. Define the external environment of organizations. 2.”</w:t>
+        <w:t>“cuando los individuos se unen al grupo y definen el propó­ sito, la estructura y el liderazgo del mismo etapa de tormenta  Segunda etapa del desarrollo grupal, caracterizada por el conflicto intergrupal ética  Principios, valores y creencias que definen el comporta­ organización se apega a su actividad actual estrategia de renovación  Estrategia corporativa diseñada miento correcto e incorrecto euro  Moneda única que comparten actualmente 18 estados para tratar de solucionar un desempeño decadente estrategia funcional  Estrategia utilizada por los diversos miembros de la Unión Europea y que forman la zona del euro eventos  Puntos que representan la finalización de las princi­ departamentos...”</w:t>
       </w:r>
     </w:p>
     <w:p>
@@ -806,7 +806,7 @@
         <w:pStyle w:val="Heading3"/>
       </w:pPr>
       <w:r>
-        <w:t>bright-et-al-2019-principles-of-management-openstax.pdf — p. 110 — similitud 0.1501</w:t>
+        <w:t>Robbins y Judge - Comportamiento organizacional - 17a ed - 2017.pdf — p. 548 — similitud 0.2277</w:t>
       </w:r>
     </w:p>
     <w:p>
@@ -814,7 +814,7 @@
         <w:ind w:left="360"/>
       </w:pPr>
       <w:r>
-        <w:t>“Chapter 4 External and Internal Organizational Environments and Corporate Culture 101 Exhibit 4.13 Virtual Structure (Attribution: Copyright Rice University, OpenStax, under CC-BY 4.0 license) These organizations move beyond network team structures in that the headquarters or home base may be the only or part of part of a stable organizational base. Otherwise, this is a “boundaryless organization.” Examples of organizations that use virtual teams are Uber, Airbnb, Amazon, Reebok, Nike, Puma, and Dell.”</w:t>
+        <w:t>“De hecho, cierto grado de estructura mecánica puede beneficiar realmente la innovación. Canales de comunicación bien desarrollados, políticas para mejorar el compromiso de largo plazo y canales claros de autoridad ayudarían a que los cambios rápidos ocurran sin complicaciones. estrategia de innovación Estrategia que enfatiza la introducción de productos y servicios nuevos e importantes. estrategia de minimización de costos Estrategia que hace hincapié en control estricto de los costos, evitación de innovaciones o gastos de comercialización innecesarios, y reducción de precios.”</w:t>
       </w:r>
     </w:p>
     <w:p>
@@ -822,7 +822,7 @@
         <w:pStyle w:val="Heading3"/>
       </w:pPr>
       <w:r>
-        <w:t>bright-et-al-2019-principles-of-management-openstax.pdf — p. 600 — similitud 0.1492</w:t>
+        <w:t>Robbins y Judge - Comportamiento organizacional - 17a ed - 2017.pdf — p. 548 — similitud 0.2241</w:t>
       </w:r>
     </w:p>
     <w:p>
@@ -830,7 +830,7 @@
         <w:ind w:left="360"/>
       </w:pPr>
       <w:r>
-        <w:t>“Goal development is an important part of the planning process. Goals developed for employees, for departments, and for entire organizations greatly enhance organizational effectiveness. Evidence reveals that performance is higher when organizations, as well as individuals, operate under difficult (but attainable), specific goals.”</w:t>
+        <w:t>“Esto describe la estrategia seguida por Walmart y los fabricantes de artículos comestibles genéricos o con marca de la tienda. Las orga- nizaciones enfocadas en la minimización de costos utilizan menos políticas destinadas al desarrollo del compromiso entre su fuerza laboral. estrategia de imitación Estrategia que busca moverse hacia nuevos productos o ingresar a nuevos mercados, tan sólo después de que se haya demostrado su viabilidad.”</w:t>
       </w:r>
     </w:p>
     <w:p>
@@ -838,7 +838,7 @@
         <w:pStyle w:val="Heading3"/>
       </w:pPr>
       <w:r>
-        <w:t>bright-et-al-2019-principles-of-management-openstax.pdf — p. 121 — similitud 0.1482</w:t>
+        <w:t>Robbins y Coulter - Administracion - 13a ed - 2018.pdf — p. 322 — similitud 0.2221</w:t>
       </w:r>
     </w:p>
     <w:p>
@@ -846,7 +846,7 @@
         <w:ind w:left="360"/>
       </w:pPr>
       <w:r>
-        <w:t>“Secondly, integrative resilience underlines complex interconnections with the external context. Here the author suggests that organizations must be part of and aware of their contexts: geographically and the health of “individuals, families, neighborhoods, cities, provinces, and countries” that are affected. Relatedly, the author notes that organizations must rely on their social cohesion—such as the social capital an organization has to fall back on in times of crisis—which is a strong source of resilience.”</w:t>
+        <w:t>“Ejemplos de esta estrategia incluyen a las empresas que buscan seguir atendiendo a los mismos clientes ofreciéndoles los mismos productos o servicios, conservar su participación de mer­ cado y mantener inalteradas sus operaciones de negocio vigentes.”</w:t>
       </w:r>
     </w:p>
     <w:p>
@@ -857,7 +857,7 @@
         <w:t xml:space="preserve">Observación automática: </w:t>
       </w:r>
       <w:r>
-        <w:t>La ficha presenta coincidencias útiles, pero conviene revisar la pertinencia de cada cita. Se agruparon varias referencias dentro de la misma fuente.</w:t>
+        <w:t>La ficha presenta una coincidencia fuerte con el concepto buscado. Se agruparon referencias de múltiples fuentes para enriquecer el concepto.</w:t>
       </w:r>
     </w:p>
     <w:p>
@@ -865,7 +865,7 @@
         <w:pStyle w:val="Heading2"/>
       </w:pPr>
       <w:r>
-        <w:t>Ficha 06. leadership</w:t>
+        <w:t>Ficha 06. estructura</w:t>
       </w:r>
     </w:p>
     <w:p>
@@ -876,7 +876,7 @@
         <w:t xml:space="preserve">Fuentes: </w:t>
       </w:r>
       <w:r>
-        <w:t>bright-et-al-2019-principles-of-management-openstax.pdf</w:t>
+        <w:t>Robbins y Coulter - Administracion - 13a ed - 2018.pdf; Robbins y Judge - Comportamiento organizacional - 17a ed - 2017.pdf</w:t>
       </w:r>
     </w:p>
     <w:p>
@@ -887,7 +887,7 @@
         <w:t xml:space="preserve">Ubicaciones: </w:t>
       </w:r>
       <w:r>
-        <w:t>bright-et-al-2019-principles-of-management-openstax.pdf, p. 428; bright-et-al-2019-principles-of-management-openstax.pdf, p. 430; bright-et-al-2019-principles-of-management-openstax.pdf, p. 450; bright-et-al-2019-principles-of-management-openstax.pdf, p. 451; bright-et-al-2019-principles-of-management-openstax.pdf, p. 452; bright-et-al-2019-principles-of-management-openstax.pdf, p. 453; bright-et-al-2019-principles-of-management-openstax.pdf, p. 659</w:t>
+        <w:t>Robbins y Coulter - Administracion - 13a ed - 2018.pdf, p. 22; Robbins y Coulter - Administracion - 13a ed - 2018.pdf, p. 395; Robbins y Coulter - Administracion - 13a ed - 2018.pdf, p. 404; Robbins y Coulter - Administracion - 13a ed - 2018.pdf, p. 707; Robbins y Judge - Comportamiento organizacional - 17a ed - 2017.pdf, p. 531; Robbins y Judge - Comportamiento organizacional - 17a ed - 2017.pdf, p. 540; Robbins y Judge - Comportamiento organizacional - 17a ed - 2017.pdf, p. 707</w:t>
       </w:r>
     </w:p>
     <w:p>
@@ -895,7 +895,7 @@
         <w:pStyle w:val="Heading3"/>
       </w:pPr>
       <w:r>
-        <w:t>bright-et-al-2019-principles-of-management-openstax.pdf — p. 453 — similitud 0.3423</w:t>
+        <w:t>Robbins y Judge - Comportamiento organizacional - 17a ed - 2017.pdf — p. 707 — similitud 0.4166</w:t>
       </w:r>
     </w:p>
     <w:p>
@@ -903,7 +903,7 @@
         <w:ind w:left="360"/>
       </w:pPr>
       <w:r>
-        <w:t>“cultural leadership research will no doubt intensify as the global economy becomes an ever more dominant force in the world. Chapter Review Questions 1.”</w:t>
+        <w:t>“estructura circular Estructura organizacional donde los ejecu- tivos se ubican en el centro y difunden su visión hacia afuera, en anillos agrupados de acuerdo con su función (gerentes, luego especialistas, después trabajadores). estructura de equipo Estructura organizacional que sustituye los departamentos con equipos facultados, y que elimina los límites horizontales y las barreras externas entre los clientes y los proveedores. estructura de iniciación El grado en que un líder tiende a de- finir y estructurar su rol y el de los subalternos, en la búsqueda del logro de las metas. estructura de la tarea Grado en que están definidos los proce- dimientos para las tareas del puesto. estructura...”</w:t>
       </w:r>
     </w:p>
     <w:p>
@@ -911,7 +911,7 @@
         <w:pStyle w:val="Heading3"/>
       </w:pPr>
       <w:r>
-        <w:t>bright-et-al-2019-principles-of-management-openstax.pdf — p. 452 — similitud 0.2839</w:t>
+        <w:t>Robbins y Coulter - Administracion - 13a ed - 2018.pdf — p. 395 — similitud 0.3234</w:t>
       </w:r>
     </w:p>
     <w:p>
@@ -919,7 +919,7 @@
         <w:ind w:left="360"/>
       </w:pPr>
       <w:r>
-        <w:t>“Chapter 13 Leadership 443 13.3 Types of Leaders and Leader Emergence 3. How do leaders influence and move their followers to action?”</w:t>
+        <w:t>“estructura simple Diseño organizacional con poca departamentalización, amplios tramos de control, autoridad centralizada y poca formalización Estructura funcional La estructura funcional es un diseño organizacional que agrupa especialidades ocupacionales similares o relacionadas.”</w:t>
       </w:r>
     </w:p>
     <w:p>
@@ -927,7 +927,7 @@
         <w:pStyle w:val="Heading3"/>
       </w:pPr>
       <w:r>
-        <w:t>bright-et-al-2019-principles-of-management-openstax.pdf — p. 450 — similitud 0.2677</w:t>
+        <w:t>Robbins y Judge - Comportamiento organizacional - 17a ed - 2017.pdf — p. 531 — similitud 0.3033</w:t>
       </w:r>
     </w:p>
     <w:p>
@@ -935,7 +935,7 @@
         <w:ind w:left="360"/>
       </w:pPr>
       <w:r>
-        <w:t>“of leadership have emerged; among them are leader-member exchange theory, implicit leadership theory, neocharismatic theory, value-based theory of leadership, and visionary leadership,111 each of which over time will add to our bank of knowledge about leaders and the leadership process. Leaders of the 21st-century organization have a monumental challenge awaiting them and a wealth of self- enriching and fulfilling opportunities.”</w:t>
+        <w:t>“Fundamentos de la estructura organizacional CAPÍTULO 15 493 I ncluso para una nueva empresa con unos cuantos empleados, la elección de una estructura organizacional requiere mucho más que el simple hecho de decidir quién será el jefe y cuántos trabajadores se necesitan. La estructura de la organización deter- minará qué relaciones se deben formar, la formalidad de esas relaciones y muchos re- sultados del trabajo.”</w:t>
       </w:r>
     </w:p>
     <w:p>
@@ -943,7 +943,7 @@
         <w:pStyle w:val="Heading3"/>
       </w:pPr>
       <w:r>
-        <w:t>bright-et-al-2019-principles-of-management-openstax.pdf — p. 451 — similitud 0.2602</w:t>
+        <w:t>Robbins y Coulter - Administracion - 13a ed - 2018.pdf — p. 22 — similitud 0.2991</w:t>
       </w:r>
     </w:p>
     <w:p>
@@ -951,7 +951,7 @@
         <w:ind w:left="360"/>
       </w:pPr>
       <w:r>
-        <w:t>“theorists, researchers, and practitioners have devoted a tremendous amount of attention and energy to unlocking the secrets of effective leadership. They have kept at this search for perhaps a greater period of time than for any other single issue related to management.”</w:t>
+        <w:t>“Tamaño y estructura   358 Tecnología y estructura   358 Incertidumbre del entorno y estructura   358 Diseños organizacionales tradicionales   359 Estructura simple   359 Estructura funcional   359 Estructura divisional   359 Organización para la flexibilidad en el siglo XXI   360 Estructuras de equipos   360 Estructuras matricial y de proyectos   361 La organización sin límites   362 Trabajo a distancia   364”</w:t>
       </w:r>
     </w:p>
     <w:p>
@@ -959,7 +959,7 @@
         <w:pStyle w:val="Heading3"/>
       </w:pPr>
       <w:r>
-        <w:t>bright-et-al-2019-principles-of-management-openstax.pdf — p. 451 — similitud 0.2543</w:t>
+        <w:t>Robbins y Coulter - Administracion - 13a ed - 2018.pdf — p. 404 — similitud 0.2980</w:t>
       </w:r>
     </w:p>
     <w:p>
@@ -967,7 +967,7 @@
         <w:ind w:left="360"/>
       </w:pPr>
       <w:r>
-        <w:t>“A “task-oriented” leader behavior that is focused on goal attainment, organizing and scheduling work, solving problems, and maintaining work processes. leadership A social (interpersonal) influence relationship between two or more persons who depend on each other to attain certain mutual goals in a group situation.”</w:t>
+        <w:t>“La estructura de la organización debe respaldar su estrategia. Si la estrategia cambia, la estructura también debe cambiar.”</w:t>
       </w:r>
     </w:p>
     <w:p>
@@ -975,7 +975,7 @@
         <w:pStyle w:val="Heading3"/>
       </w:pPr>
       <w:r>
-        <w:t>bright-et-al-2019-principles-of-management-openstax.pdf — p. 430 — similitud 0.2440</w:t>
+        <w:t>Robbins y Judge - Comportamiento organizacional - 17a ed - 2017.pdf — p. 540 — similitud 0.2784</w:t>
       </w:r>
     </w:p>
     <w:p>
@@ -983,7 +983,7 @@
         <w:ind w:left="360"/>
       </w:pPr>
       <w:r>
-        <w:t>“Chapter 13 Leadership 421 Exhibit 13.8 Jeff Bezos Jeff Bezos, founder and CEO of Amazon, used to bring an empty chair to meetings to signal and remind participants of the most important people that did not have a seat at the table: the customers. He has now replaced the empty chair with Amazon employees with the job title Customer Experience Bar Raisers.”</w:t>
+        <w:t>“Estructura funcional es adecuada si la organización se enfoca en un producto o servicio. Por desgracia, crea comunicaciones formales y rígidas debido a que la jerar- quía determina el protocolo de comunicación.”</w:t>
       </w:r>
     </w:p>
     <w:p>
@@ -991,7 +991,7 @@
         <w:pStyle w:val="Heading3"/>
       </w:pPr>
       <w:r>
-        <w:t>bright-et-al-2019-principles-of-management-openstax.pdf — p. 659 — similitud 0.2270</w:t>
+        <w:t>Robbins y Coulter - Administracion - 13a ed - 2018.pdf — p. 707 — similitud 0.2460</w:t>
       </w:r>
     </w:p>
     <w:p>
@@ -999,7 +999,7 @@
         <w:ind w:left="360"/>
       </w:pPr>
       <w:r>
-        <w:t>“Leadership: Multidisciplinary perspectives. Englewood Cliffs, NJ: Prentice-Hall; F.”</w:t>
+        <w:t>“de Fiedler que describe el grado de formalidad y estruc­ tura de las tareas laborales estructura de proyectos  Estructura organizacional en la decisiones de inversión flexibilidad estratégica  Capacidad para reconocer importan­ tes cambios externos para movilizar con rapidez recursos y reconocer cuando una decisión estratégica fue errónea Fondo Monetario Internacional (FMI)  Organización cons­ que los empleados trabajan continuamente en diferentes pro­- yectos estructura de red social  Patrones de conexión informal entre tituida por 185 países, que promueve la cooperación mone­ taria internacional y brinda asesoría, créditos y asistencia técnica a sus socios formalización  Nivel de...”</w:t>
       </w:r>
     </w:p>
     <w:p>
@@ -1007,7 +1007,7 @@
         <w:pStyle w:val="Heading3"/>
       </w:pPr>
       <w:r>
-        <w:t>bright-et-al-2019-principles-of-management-openstax.pdf — p. 428 — similitud 0.2264</w:t>
+        <w:t>Robbins y Coulter - Administracion - 13a ed - 2018.pdf — p. 395 — similitud 0.2414</w:t>
       </w:r>
     </w:p>
     <w:p>
@@ -1015,7 +1015,7 @@
         <w:ind w:left="360"/>
       </w:pPr>
       <w:r>
-        <w:t>“Chapter 13 Leadership 419 Exhibit 13.6 Tannenbaum and Schmidt’s Leadership Continuum Source: Modified from R. Tannenbaum and W.”</w:t>
+        <w:t>“En este capítulo describiremos los diseños organizacionales tradicionales y también algunos de los tipos más contemporáneos. OA11.4 Cuando los gerentes diseñan una estructura, pueden elegir uno de los diseños tradicionales, los cuales tienden a ser más mecanicistas. En la figura 11-8 se presenta un resumen de las ventajas y desventajas de cada una de ellas.”</w:t>
       </w:r>
     </w:p>
     <w:p>
@@ -1026,7 +1026,7 @@
         <w:t xml:space="preserve">Observación automática: </w:t>
       </w:r>
       <w:r>
-        <w:t>La ficha presenta una coincidencia fuerte con el concepto buscado. Se agruparon varias referencias dentro de la misma fuente.</w:t>
+        <w:t>La ficha presenta una coincidencia fuerte con el concepto buscado. Se agruparon referencias de múltiples fuentes para enriquecer el concepto.</w:t>
       </w:r>
     </w:p>
     <w:p>
@@ -1034,7 +1034,7 @@
         <w:pStyle w:val="Heading2"/>
       </w:pPr>
       <w:r>
-        <w:t>Ficha 07. environment</w:t>
+        <w:t>Ficha 07. innovación</w:t>
       </w:r>
     </w:p>
     <w:p>
@@ -1045,7 +1045,7 @@
         <w:t xml:space="preserve">Fuentes: </w:t>
       </w:r>
       <w:r>
-        <w:t>bright-et-al-2019-principles-of-management-openstax.pdf</w:t>
+        <w:t>Robbins y Coulter - Administracion - 13a ed - 2018.pdf; Robbins y Judge - Comportamiento organizacional - 17a ed - 2017.pdf</w:t>
       </w:r>
     </w:p>
     <w:p>
@@ -1056,7 +1056,7 @@
         <w:t xml:space="preserve">Ubicaciones: </w:t>
       </w:r>
       <w:r>
-        <w:t>bright-et-al-2019-principles-of-management-openstax.pdf, p. 256; bright-et-al-2019-principles-of-management-openstax.pdf, p. 258; bright-et-al-2019-principles-of-management-openstax.pdf, p. 262; bright-et-al-2019-principles-of-management-openstax.pdf, p. 270; bright-et-al-2019-principles-of-management-openstax.pdf, p. 282; bright-et-al-2019-principles-of-management-openstax.pdf, p. 98</w:t>
+        <w:t>Robbins y Coulter - Administracion - 13a ed - 2018.pdf, p. 257; Robbins y Coulter - Administracion - 13a ed - 2018.pdf, p. 264; Robbins y Coulter - Administracion - 13a ed - 2018.pdf, p. 272; Robbins y Coulter - Administracion - 13a ed - 2018.pdf, p. 276; Robbins y Coulter - Administracion - 13a ed - 2018.pdf, p. 331; Robbins y Coulter - Administracion - 13a ed - 2018.pdf, p. 344; Robbins y Coulter - Administracion - 13a ed - 2018.pdf, p. 362; Robbins y Judge - Comportamiento organizacional - 17a ed - 2017.pdf, p. 656</w:t>
       </w:r>
     </w:p>
     <w:p>
@@ -1064,7 +1064,7 @@
         <w:pStyle w:val="Heading3"/>
       </w:pPr>
       <w:r>
-        <w:t>bright-et-al-2019-principles-of-management-openstax.pdf — p. 98 — similitud 0.2138</w:t>
+        <w:t>Robbins y Judge - Comportamiento organizacional - 17a ed - 2017.pdf — p. 656 — similitud 0.2606</w:t>
       </w:r>
     </w:p>
     <w:p>
@@ -1072,7 +1072,7 @@
         <w:ind w:left="360"/>
       </w:pPr>
       <w:r>
-        <w:t>“Of course unpredicted conditions, such as global and international turmoil, economic downturns, and so on, could affect these industries, but generally, these alignments have served as an ideal type and starting point for understanding the “fit” between environment and industries. In a stable but complex, low- to moderate-uncertainty environment, cell 2 in Exhibit 4.4, universities, appliance manufacturers, chemical companies, and insurances companies would generally prosper.”</w:t>
+        <w:t>“618 PARTE 4 El sistema de la organización Basada en su frase publicitaria “Piensa diferente”, Apple ha construido una cultura de innovación, donde los empleados comparten la pasión por crear productos de consumo amigables como el Apple Watch, mostrado en la fotografía por un cliente de una tienda Apple en Toronto, Canadá. La cultura de apoyo de Apple involucra la creación conjunta de ideas, colaboración, experimentación y toma de riesgos.”</w:t>
       </w:r>
     </w:p>
     <w:p>
@@ -1080,7 +1080,7 @@
         <w:pStyle w:val="Heading3"/>
       </w:pPr>
       <w:r>
-        <w:t>bright-et-al-2019-principles-of-management-openstax.pdf — p. 282 — similitud 0.2091</w:t>
+        <w:t>Robbins y Coulter - Administracion - 13a ed - 2018.pdf — p. 272 — similitud 0.2507</w:t>
       </w:r>
     </w:p>
     <w:p>
@@ -1088,7 +1088,7 @@
         <w:ind w:left="360"/>
       </w:pPr>
       <w:r>
-        <w:t>“SWOT is not a comprehensive analytical tool, because the four categories for analysis are too broad and will not necessarily identify all of the factors important to a firm’s success that a more thorough analysis would. 8.3 A Firm's External Macro Environment: PESTEL 3. What makes up a firm’s external macro environment, and what tools do strategists use to understand it?”</w:t>
+        <w:t>“Existe una relación cercana y estrecha entre la innovación y el pensamiento de diseño, la cual consiste en reconocer que los clientes son personas reales con problemas reales y en convertir ese conocimiento en productos reales y utilizables. EXPLICAR por qué es importante manejar la innovación disruptiva.”</w:t>
       </w:r>
     </w:p>
     <w:p>
@@ -1096,7 +1096,7 @@
         <w:pStyle w:val="Heading3"/>
       </w:pPr>
       <w:r>
-        <w:t>bright-et-al-2019-principles-of-management-openstax.pdf — p. 262 — similitud 0.1888</w:t>
+        <w:t>Robbins y Coulter - Administracion - 13a ed - 2018.pdf — p. 276 — similitud 0.2506</w:t>
       </w:r>
     </w:p>
     <w:p>
@@ -1104,7 +1104,7 @@
         <w:ind w:left="360"/>
       </w:pPr>
       <w:r>
-        <w:t>“Chapter 8 Strategic Analysis: Understanding a Firm’s Competitive Environment 253 contend with, regardless of the industry they are in or type of business they are. In the Exhibit 8.4, the macro environment is indicated in blue.”</w:t>
+        <w:t>“240    Parte 2  Fundamentos de la administración en el lugar de trabajo actual PREGUNTAS DE ANÁLISIS 7-11. ¿Qué opina del método de innovación de UA? ¿Habría esperado ver este tipo de innovación en una empresa especializada en ropa deportiva? Explique su respuesta.”</w:t>
       </w:r>
     </w:p>
     <w:p>
@@ -1112,7 +1112,7 @@
         <w:pStyle w:val="Heading3"/>
       </w:pPr>
       <w:r>
-        <w:t>bright-et-al-2019-principles-of-management-openstax.pdf — p. 256 — similitud 0.1802</w:t>
+        <w:t>Robbins y Coulter - Administracion - 13a ed - 2018.pdf — p. 362 — similitud 0.2386</w:t>
       </w:r>
     </w:p>
     <w:p>
@@ -1120,7 +1120,7 @@
         <w:ind w:left="360"/>
       </w:pPr>
       <w:r>
-        <w:t>“8 Strategic Analysis: Understanding a Firm’s Competitive Environment Exhibit 8.1 (Credit: Antii T. Nussinen/ flickr/ Attribution 2.0 Generic (CC BY 2.0)) Introduction Learning Outcomes After reading this chapter, you should be able to answer these questions: 1.”</w:t>
+        <w:t>“326    Parte 3  Planeación La importancia de la innovación continua Si quieren competir con éxito en el caótico y muy dinámico mundo actual, dominado por la com- petencia global, las organizaciones tienen que innovar permanentemente sus productos y servi- cios. La innovación es una característica fundamental de las iniciativas empresariales; de hecho, es su rasgo distintivo. ¿Qué debe hacer el emprendedor para fomentar la innovación?”</w:t>
       </w:r>
     </w:p>
     <w:p>
@@ -1128,7 +1128,7 @@
         <w:pStyle w:val="Heading3"/>
       </w:pPr>
       <w:r>
-        <w:t>bright-et-al-2019-principles-of-management-openstax.pdf — p. 282 — similitud 0.1768</w:t>
+        <w:t>Robbins y Coulter - Administracion - 13a ed - 2018.pdf — p. 264 — similitud 0.2361</w:t>
       </w:r>
     </w:p>
     <w:p>
@@ -1136,7 +1136,7 @@
         <w:ind w:left="360"/>
       </w:pPr>
       <w:r>
-        <w:t>“Chapter 8 Strategic Analysis: Understanding a Firm’s Competitive Environment 273 weaknesses Things that a firm does not have good capabilities to perform or gaps in firm resources. Summary of Learning Outcomes 8.1 Gaining Advantages by Understanding the Competitive Environment 1.”</w:t>
+        <w:t>“228    Parte 2  Fundamentos de la administración en el lugar de trabajo actual FYI VARIABLES ESTRUCTURALES  La estructura organizacional puede tener un enorme im- pacto en la capacidad de innovación. Las investigaciones del efecto que tienen las variables estructurales sobre la innovación indican cinco cosas.82 En primer lugar, que una estructura de tipo orgánico influye positivamente en la innovación.”</w:t>
       </w:r>
     </w:p>
     <w:p>
@@ -1144,7 +1144,7 @@
         <w:pStyle w:val="Heading3"/>
       </w:pPr>
       <w:r>
-        <w:t>bright-et-al-2019-principles-of-management-openstax.pdf — p. 258 — similitud 0.1750</w:t>
+        <w:t>Robbins y Coulter - Administracion - 13a ed - 2018.pdf — p. 344 — similitud 0.2288</w:t>
       </w:r>
     </w:p>
     <w:p>
@@ -1152,7 +1152,7 @@
         <w:ind w:left="360"/>
       </w:pPr>
       <w:r>
-        <w:t>“Chapter 8 Strategic Analysis: Understanding a Firm’s Competitive Environment 249 8.1 Gaining Advantages by Understanding the Competitive Environment 1. What is strategic analysis, and why do firms need to analyze their competitive environment?”</w:t>
+        <w:t>“El emprendimiento es y seguirá siendo importante en todos los sectores industriales de Estados Unidos y de los países más avanzados.3 En Estados Unidos, su importancia ha sido evidente en tres áreas: la innovación, el número de nuevas empresas y la creación de empleos. INNOVACIÓN  La innovación es un proceso de cambio, experimentación, transformación y re- volución que juega un papel esencial en la actividad emprendedora.”</w:t>
       </w:r>
     </w:p>
     <w:p>
@@ -1160,7 +1160,7 @@
         <w:pStyle w:val="Heading3"/>
       </w:pPr>
       <w:r>
-        <w:t>bright-et-al-2019-principles-of-management-openstax.pdf — p. 270 — similitud 0.1736</w:t>
+        <w:t>Robbins y Coulter - Administracion - 13a ed - 2018.pdf — p. 331 — similitud 0.2285</w:t>
       </w:r>
     </w:p>
     <w:p>
@@ -1168,7 +1168,7 @@
         <w:ind w:left="360"/>
       </w:pPr>
       <w:r>
-        <w:t>“understand her firm’s micro environment? 8.5 The Internal Environment 5.”</w:t>
+        <w:t>“Como indica el ejemplo anterior, las estrategias de innovación no tienen por qué enfocarse exclusivamente en el desarrollo de productos novedosos; también pueden consistir en aplicar la tecnología existente a nuevos usos, y hay organizaciones que han tenido éxito en la implemen­ tación de ambos enfoques. ¿Qué tipos de estrategias de innovación necesitan las empresas en el entorno actual? Aquellas que reflejen su filosofía de innovación, misma que se basa en dos decisio­ nes estratégicas: el énfasis en la innovación y saber cuándo es el momento adecuado para innovar.”</w:t>
       </w:r>
     </w:p>
     <w:p>
@@ -1176,7 +1176,7 @@
         <w:pStyle w:val="Heading3"/>
       </w:pPr>
       <w:r>
-        <w:t>bright-et-al-2019-principles-of-management-openstax.pdf — p. 282 — similitud 0.1732</w:t>
+        <w:t>Robbins y Coulter - Administracion - 13a ed - 2018.pdf — p. 257 — similitud 0.2183</w:t>
       </w:r>
     </w:p>
     <w:p>
@@ -1184,7 +1184,7 @@
         <w:ind w:left="360"/>
       </w:pPr>
       <w:r>
-        <w:t>“8.4 A Firm's Micro Environment: Porter's Five Forces 4. What makes up a firm’s external micro environment, and what tools do strategists use to understand it?”</w:t>
+        <w:t>“Una última condición fa- vorable es cuando la cultura organizacional es débil, pues en ese caso habrá mayor receptividad al cambio.50 diferencia Cuando se dio a conocer la noticia de la renuncia del director general de Microsoft (Steve Ballmer) a finales del verano de 2013, la búsqueda de su re- emplazo ya había iniciado. Los analistas decían que quienquiera que lo reemplazara se vería obligado a enfrentar el desafío de “reiniciar la cultura cor- porativa de Microsoft, en donde la planeación de un camino seguro pero redituable… con gran frecuencia se impone a la innovación…”48 Satya Nadella es esa persona.”</w:t>
       </w:r>
     </w:p>
     <w:p>
@@ -1195,7 +1195,7 @@
         <w:t xml:space="preserve">Observación automática: </w:t>
       </w:r>
       <w:r>
-        <w:t>La ficha presenta coincidencias útiles, pero conviene revisar la pertinencia de cada cita. Se agruparon varias referencias dentro de la misma fuente.</w:t>
+        <w:t>La ficha presenta coincidencias útiles, pero conviene revisar la pertinencia de cada cita. Se agruparon referencias de múltiples fuentes para enriquecer el concepto.</w:t>
       </w:r>
     </w:p>
     <w:p>
@@ -1203,7 +1203,7 @@
         <w:pStyle w:val="Heading2"/>
       </w:pPr>
       <w:r>
-        <w:t>Ficha 08. motivation</w:t>
+        <w:t>Ficha 08. motivación</w:t>
       </w:r>
     </w:p>
     <w:p>
@@ -1214,7 +1214,7 @@
         <w:t xml:space="preserve">Fuentes: </w:t>
       </w:r>
       <w:r>
-        <w:t>bright-et-al-2019-principles-of-management-openstax.pdf</w:t>
+        <w:t>Robbins y Coulter - Administracion - 13a ed - 2018.pdf; Robbins y Judge - Comportamiento organizacional - 17a ed - 2017.pdf</w:t>
       </w:r>
     </w:p>
     <w:p>
@@ -1225,7 +1225,7 @@
         <w:t xml:space="preserve">Ubicaciones: </w:t>
       </w:r>
       <w:r>
-        <w:t>bright-et-al-2019-principles-of-management-openstax.pdf, p. 458; bright-et-al-2019-principles-of-management-openstax.pdf, p. 462; bright-et-al-2019-principles-of-management-openstax.pdf, p. 477; bright-et-al-2019-principles-of-management-openstax.pdf, p. 478; bright-et-al-2019-principles-of-management-openstax.pdf, p. 500; bright-et-al-2019-principles-of-management-openstax.pdf, p. 501</w:t>
+        <w:t>Robbins y Coulter - Administracion - 13a ed - 2018.pdf, p. 555; Robbins y Coulter - Administracion - 13a ed - 2018.pdf, p. 579; Robbins y Judge - Comportamiento organizacional - 17a ed - 2017.pdf, p. 14; Robbins y Judge - Comportamiento organizacional - 17a ed - 2017.pdf, p. 245; Robbins y Judge - Comportamiento organizacional - 17a ed - 2017.pdf, p. 253; Robbins y Judge - Comportamiento organizacional - 17a ed - 2017.pdf, p. 284</w:t>
       </w:r>
     </w:p>
     <w:p>
@@ -1233,7 +1233,7 @@
         <w:pStyle w:val="Heading3"/>
       </w:pPr>
       <w:r>
-        <w:t>bright-et-al-2019-principles-of-management-openstax.pdf — p. 458 — similitud 0.2690</w:t>
+        <w:t>Robbins y Coulter - Administracion - 13a ed - 2018.pdf — p. 579 — similitud 0.2398</w:t>
       </w:r>
     </w:p>
     <w:p>
@@ -1241,7 +1241,7 @@
         <w:ind w:left="360"/>
       </w:pPr>
       <w:r>
-        <w:t>“14 Work Motivation for Performance Exhibit 14.1 (Credit: mohamed_hassan/ Pixabay/ (CC BY 0)) Introduction Learning Outcomes After reading this chapter, you should be able to answer these questions: 1. Define motivation, and distinguish direction and intensity of motivation.”</w:t>
+        <w:t>“Describa las cuatro primeras teorías de la motivación. 16-3. ¿De qué manera las teorías del establecimiento de fuerza laboral actual?”</w:t>
       </w:r>
     </w:p>
     <w:p>
@@ -1249,7 +1249,7 @@
         <w:pStyle w:val="Heading3"/>
       </w:pPr>
       <w:r>
-        <w:t>bright-et-al-2019-principles-of-management-openstax.pdf — p. 462 — similitud 0.2668</w:t>
+        <w:t>Robbins y Judge - Comportamiento organizacional - 17a ed - 2017.pdf — p. 14 — similitud 0.2375</w:t>
       </w:r>
     </w:p>
     <w:p>
@@ -1257,7 +1257,7 @@
         <w:ind w:left="360"/>
       </w:pPr>
       <w:r>
-        <w:t>“Employees with accurate role perceptions understand their purpose in the organization and how the performance of their job duties contributes to organizational objectives. Some motivation theorists assume that employees know the correct direction for their jobs. Others do not.”</w:t>
+        <w:t>“xii CONTENIDO 7 Conceptos de motivación 206 La motivación y las primeras teorías 209 Primeras teorías sobre la motivación 210 Teoría de la jerarquía de las necesidades 210 • Teoría de los dos factores 211 • Teoría de las necesidades de McClelland 212 Objetivos de carrera ¿Por qué no siguen mi consejo? 214 Teorías contemporáneas de la motivación 214 Teoría de la autodeterminación 215 ¿Mito o ciencia?”</w:t>
       </w:r>
     </w:p>
     <w:p>
@@ -1265,7 +1265,7 @@
         <w:pStyle w:val="Heading3"/>
       </w:pPr>
       <w:r>
-        <w:t>bright-et-al-2019-principles-of-management-openstax.pdf — p. 500 — similitud 0.2602</w:t>
+        <w:t>Robbins y Judge - Comportamiento organizacional - 17a ed - 2017.pdf — p. 253 — similitud 0.2241</w:t>
       </w:r>
     </w:p>
     <w:p>
@@ -1273,7 +1273,7 @@
         <w:ind w:left="360"/>
       </w:pPr>
       <w:r>
-        <w:t>“A belief about the probability that one can successfully execute some future action or task, or achieve some result. state of equity Occurs when people perceive their outcome/input ratio to be equal to that of their referent other. underreward inequity Occurs when people perceive their outcome/input ratio to be less than that of their referent other. valences The degree to which a person perceives an outcome as being desirable, neutral, or undesirable. work motivation The amount of effort a person exerts to achieve a level of job performance Summary of Learning Outcomes 14.1 Motivation: Direction and Intensity 1. Define motivation, and distinguish direction and intensity of motivation.”</w:t>
+        <w:t>“Sugiere que es recomendable tener cierta cautela en el uso de las recompensas extrínse- cas como medio de motivación, y que la búsqueda de metas usando motivos intrínsecos (como un gran interés por el trabajo en sí) incrementa más la motivación de los seres humanos que las recompensas extrínsecas. De manera similar, la teoría de la evaluación cognitiva sugiere que, en muchos casos, proporcionar incentivos extrínsecos socava la motivación intrínseca.”</w:t>
       </w:r>
     </w:p>
     <w:p>
@@ -1281,7 +1281,7 @@
         <w:pStyle w:val="Heading3"/>
       </w:pPr>
       <w:r>
-        <w:t>bright-et-al-2019-principles-of-management-openstax.pdf — p. 501 — similitud 0.2470</w:t>
+        <w:t>Robbins y Coulter - Administracion - 13a ed - 2018.pdf — p. 555 — similitud 0.2201</w:t>
       </w:r>
     </w:p>
     <w:p>
@@ -1289,7 +1289,7 @@
         <w:ind w:left="360"/>
       </w:pPr>
       <w:r>
-        <w:t>“492 Chapter 14 Work Motivation for Performance intensity. Direction is what a person is trying to achieve.”</w:t>
+        <w:t>“Objetivos de aprendizaje 16.1 Definir el concepto de motivación. 16.2 Comparar las primeras teorías de la motivación.”</w:t>
       </w:r>
     </w:p>
     <w:p>
@@ -1297,7 +1297,7 @@
         <w:pStyle w:val="Heading3"/>
       </w:pPr>
       <w:r>
-        <w:t>bright-et-al-2019-principles-of-management-openstax.pdf — p. 462 — similitud 0.2462</w:t>
+        <w:t>Robbins y Judge - Comportamiento organizacional - 17a ed - 2017.pdf — p. 253 — similitud 0.2172</w:t>
       </w:r>
     </w:p>
     <w:p>
@@ -1305,7 +1305,7 @@
         <w:ind w:left="360"/>
       </w:pPr>
       <w:r>
-        <w:t>“Chapter 14 Work Motivation for Performance 453 Motivation is of great interest to employers: All employers want their people to perform to the best of their abilities. They take great pains to screen applicants to make sure they have the necessary abilities and motivation to perform well.”</w:t>
+        <w:t>“Conceptos de motivación CAPÍTULO 7 215 Teoría de la autodeterminación “Es extraño”, dijo Marcia, “comencé a trabajar en Humane Society como voluntaria. Dedicaba 15 horas a la semana a ayudar a las personas a adoptar mascotas y me en- cantaba venir a trabajar.”</w:t>
       </w:r>
     </w:p>
     <w:p>
@@ -1313,7 +1313,7 @@
         <w:pStyle w:val="Heading3"/>
       </w:pPr>
       <w:r>
-        <w:t>bright-et-al-2019-principles-of-management-openstax.pdf — p. 478 — similitud 0.2459</w:t>
+        <w:t>Robbins y Judge - Comportamiento organizacional - 17a ed - 2017.pdf — p. 245 — similitud 0.2117</w:t>
       </w:r>
     </w:p>
     <w:p>
@@ -1321,7 +1321,7 @@
         <w:ind w:left="360"/>
       </w:pPr>
       <w:r>
-        <w:t>“Chapter 14 Work Motivation for Performance 469 C O N C E P T C H E C K 1. Understand the content theories of motivation.”</w:t>
+        <w:t>“Conceptos de motivación CHAPTER 7 207 OBJETIVOS DE APRENDIZAJE Cuando termine de estudiar este capítulo, usted será capaz de: 7- 1 Describir los tres elementos fundamentales de la 7- 5 Identificar las implicaciones del compromiso motivación. 7- 2 Comparar las primeras teorías sobre la motivación.”</w:t>
       </w:r>
     </w:p>
     <w:p>
@@ -1329,7 +1329,7 @@
         <w:pStyle w:val="Heading3"/>
       </w:pPr>
       <w:r>
-        <w:t>bright-et-al-2019-principles-of-management-openstax.pdf — p. 477 — similitud 0.2254</w:t>
+        <w:t>Robbins y Coulter - Administracion - 13a ed - 2018.pdf — p. 555 — similitud 0.2016</w:t>
       </w:r>
     </w:p>
     <w:p>
@@ -1337,7 +1337,7 @@
         <w:ind w:left="360"/>
       </w:pPr>
       <w:r>
-        <w:t>“motivation. For example, some people steal to satisfy their lower-order needs (they have high intensity).”</w:t>
+        <w:t>“Éste es un tema importante en la administración y los investigadores se han interesado en él desde hace mucho tiempo.2 Todos los gerentes deben ser capaces de motivar a sus empleados, pero primero es necesario que comprendan qué es la mo­ tivación. Empecemos señalando lo que no es motivación. ¿Por qué? Porque, de manera incorrecta, muchas personas consideran que la motivación es un rasgo personal, es decir, piensan que algunos individuos están motivados y otros no.”</w:t>
       </w:r>
     </w:p>
     <w:p>
@@ -1345,7 +1345,7 @@
         <w:pStyle w:val="Heading3"/>
       </w:pPr>
       <w:r>
-        <w:t>bright-et-al-2019-principles-of-management-openstax.pdf — p. 477 — similitud 0.2126</w:t>
+        <w:t>Robbins y Judge - Comportamiento organizacional - 17a ed - 2017.pdf — p. 284 — similitud 0.2006</w:t>
       </w:r>
     </w:p>
     <w:p>
@@ -1353,7 +1353,7 @@
         <w:ind w:left="360"/>
       </w:pPr>
       <w:r>
-        <w:t>“468 Chapter 14 Work Motivation for Performance Factors “inside” the person that cause people to perform tasks, intrinsic motivation, arise out of performing a task in and of itself, because it is interesting or “fun” to do. The task is enjoyable, so we continue to do it even in the absence of extrinsic rewards.”</w:t>
+        <w:t>“PPM = Variedad de habilidades + Identidad de la tarea + Importancia de la tarea * Autonomía * Retroalimentación 3 Los trabajos con gran potencial de motivación deben tener un alto valor en, al menos, uno de los tres factores que conducen a experimentar relevancia, así como un alto nivel de autonomía y retroalimentación. Si los puestos tienen un gran potencial de motivación, el modelo predice que aumentarán la motivación, el desempeño y la satis- facción, en tanto que se reducirán el ausentismo y la rotación.”</w:t>
       </w:r>
     </w:p>
     <w:p>
@@ -1364,7 +1364,7 @@
         <w:t xml:space="preserve">Observación automática: </w:t>
       </w:r>
       <w:r>
-        <w:t>La ficha presenta coincidencias útiles, pero conviene revisar la pertinencia de cada cita. Se agruparon varias referencias dentro de la misma fuente.</w:t>
+        <w:t>La ficha presenta coincidencias útiles, pero conviene revisar la pertinencia de cada cita. Se agruparon referencias de múltiples fuentes para enriquecer el concepto.</w:t>
       </w:r>
     </w:p>
     <w:p>
@@ -1372,7 +1372,7 @@
         <w:pStyle w:val="Heading2"/>
       </w:pPr>
       <w:r>
-        <w:t>Ficha 09. information</w:t>
+        <w:t>Ficha 09. organización</w:t>
       </w:r>
     </w:p>
     <w:p>
@@ -1383,7 +1383,7 @@
         <w:t xml:space="preserve">Fuentes: </w:t>
       </w:r>
       <w:r>
-        <w:t>bright-et-al-2019-principles-of-management-openstax.pdf</w:t>
+        <w:t>Robbins y Coulter - Administracion - 13a ed - 2018.pdf; Robbins y Judge - Comportamiento organizacional - 17a ed - 2017.pdf</w:t>
       </w:r>
     </w:p>
     <w:p>
@@ -1394,7 +1394,7 @@
         <w:t xml:space="preserve">Ubicaciones: </w:t>
       </w:r>
       <w:r>
-        <w:t>bright-et-al-2019-principles-of-management-openstax.pdf, p. 33; bright-et-al-2019-principles-of-management-openstax.pdf, p. 369; bright-et-al-2019-principles-of-management-openstax.pdf, p. 40; bright-et-al-2019-principles-of-management-openstax.pdf, p. 47; bright-et-al-2019-principles-of-management-openstax.pdf, p. 52; bright-et-al-2019-principles-of-management-openstax.pdf, p. 540; bright-et-al-2019-principles-of-management-openstax.pdf, p. 58; bright-et-al-2019-principles-of-management-openstax.pdf, p. 59</w:t>
+        <w:t>Robbins y Coulter - Administracion - 13a ed - 2018.pdf, p. 318; Robbins y Coulter - Administracion - 13a ed - 2018.pdf, p. 392; Robbins y Coulter - Administracion - 13a ed - 2018.pdf, p. 404; Robbins y Coulter - Administracion - 13a ed - 2018.pdf, p. 710; Robbins y Judge - Comportamiento organizacional - 17a ed - 2017.pdf, p. 45; Robbins y Judge - Comportamiento organizacional - 17a ed - 2017.pdf, p. 568; Robbins y Judge - Comportamiento organizacional - 17a ed - 2017.pdf, p. 657</w:t>
       </w:r>
     </w:p>
     <w:p>
@@ -1402,7 +1402,7 @@
         <w:pStyle w:val="Heading3"/>
       </w:pPr>
       <w:r>
-        <w:t>bright-et-al-2019-principles-of-management-openstax.pdf — p. 33 — similitud 0.2233</w:t>
+        <w:t>Robbins y Judge - Comportamiento organizacional - 17a ed - 2017.pdf — p. 657 — similitud 0.2045</w:t>
       </w:r>
     </w:p>
     <w:p>
@@ -1410,7 +1410,7 @@
         <w:ind w:left="360"/>
       </w:pPr>
       <w:r>
-        <w:t>“24 Chapter 2 Managerial Decision-Making Deciding When to Decide While some decisions are simple, a manager’s decisions are often complex ones that involve a range of options and uncertain outcomes. When deciding among various options and uncertain outcomes, managers need to gather information, which leads them to another necessary decision: how much information is needed to make a good decision? Managers frequently make decisions without complete information; indeed, one of the hallmarks of an effective leader is the ability to determine when to hold off on a decision and gather more information, and when to make a decision with the information at hand.”</w:t>
+        <w:t>“Creación de una organización que aprende Otra forma como las organizaciones administran el cambio de manera proactiva con- siste en lograr que el crecimiento continuo forme parte de su cultura: al convertirse en una organización que aprende.57 ¿Qué es una organización que aprende? Así como los individuos aprenden, también lo hacen las organizaciones.”</w:t>
       </w:r>
     </w:p>
     <w:p>
@@ -1418,7 +1418,7 @@
         <w:pStyle w:val="Heading3"/>
       </w:pPr>
       <w:r>
-        <w:t>bright-et-al-2019-principles-of-management-openstax.pdf — p. 58 — similitud 0.1631</w:t>
+        <w:t>Robbins y Judge - Comportamiento organizacional - 17a ed - 2017.pdf — p. 45 — similitud 0.1900</w:t>
       </w:r>
     </w:p>
     <w:p>
@@ -1426,7 +1426,7 @@
         <w:ind w:left="360"/>
       </w:pPr>
       <w:r>
-        <w:t>“Chapter 2 Managerial Decision-Making 49 Key Terms Bounded rationality The concept that when we make decisions, we cannot be fully rational because we don’t have all the possible information or the cognitive processing ability to make fully informed, completely rational decisions. Brainstorming A process of generating as many ideas or alternatives as possible, often in groups.”</w:t>
+        <w:t>“Líder Es responsable por la motivación y dirección de los empleados Enlace Mantiene una red de contactos externos que lo apoyan y le brindan información Informativos Vigilante Recibe una amplia variedad de información; sirve como centro neurálgico de la información interna y externa de la organización Divulgador Transmite la información recibida de los asociados externos, u otros empleados, a los miembros de la organización Vocero Transmite información a los asociados externos acerca de los planes, políticas, acciones y resultados de la organización; funge como experto en la industria de la organización De toma de decisiones Emprendedor Busca oportunidades en la organización y en su...”</w:t>
       </w:r>
     </w:p>
     <w:p>
@@ -1434,7 +1434,7 @@
         <w:pStyle w:val="Heading3"/>
       </w:pPr>
       <w:r>
-        <w:t>bright-et-al-2019-principles-of-management-openstax.pdf — p. 40 — similitud 0.1621</w:t>
+        <w:t>Robbins y Coulter - Administracion - 13a ed - 2018.pdf — p. 710 — similitud 0.1833</w:t>
       </w:r>
     </w:p>
     <w:p>
@@ -1442,7 +1442,7 @@
         <w:ind w:left="360"/>
       </w:pPr>
       <w:r>
-        <w:t>“rationality is the idea that for complex issues we cannot be completely rational because we cannot fully grasp all the possible alternatives, nor can we understand all the implications of every possible alternative. Our brains have limitations in terms of the amount of information they can process. Similarly, as was alluded to earlier in the chapter, even when managers have the cognitive ability to process all the relevant information, they often must make decisions without first having time to collect all the relevant data—their information is incomplete.”</w:t>
+        <w:t>“deliberada para cumplir un propósito específico organización esbelta (delgada)  Organización que com­ nuestro entorno, organizando e interpretando las impresiones sensoriales percepción de respaldo organizacional  Creencia general de prende qué quieren sus consumidores, identifica lo que tiene valor para el cliente analizando todas las actividades reque­ ridas para fabricar productos, y luego optimiza el proceso completo para adaptarlo a la perspectiva del cliente organización mecanicista  Diseño organizacional rígido y los empleados de que la organización a la que pertenecen valora sus aportaciones y se preocupa por su bienestar perjuicio  Creencia, opinión o juicio preconcebidos con res­...”</w:t>
       </w:r>
     </w:p>
     <w:p>
@@ -1450,7 +1450,7 @@
         <w:pStyle w:val="Heading3"/>
       </w:pPr>
       <w:r>
-        <w:t>bright-et-al-2019-principles-of-management-openstax.pdf — p. 59 — similitud 0.1594</w:t>
+        <w:t>Robbins y Coulter - Administracion - 13a ed - 2018.pdf — p. 318 — similitud 0.1832</w:t>
       </w:r>
     </w:p>
     <w:p>
@@ -1458,7 +1458,7 @@
         <w:ind w:left="360"/>
       </w:pPr>
       <w:r>
-        <w:t>“Managers can establish rules and guidelines for programmed decisions based on known fact, which enables them to reach decisions quickly. Nonprogrammed decisions require more time to resolve; the decision maker may need to conduct research, collect additional information, gather opinions and ideas from other people, and so on. 2.4 Barriers to Effective Decision-Making 4.”</w:t>
+        <w:t>“fortalezas Cualquier actividad en cuya realización se destaca la organización o los recursos únicos que tiene a su disposición Una vez concluido el análisis interno, los gerentes deben ser capaces de identificar las forta­ lezas y las debilidades de la organización. Cualquier actividad en cuya realización se destaca la organización o los recursos únicos que tiene a su disposición, constituyen sus fortalezas.”</w:t>
       </w:r>
     </w:p>
     <w:p>
@@ -1466,7 +1466,7 @@
         <w:pStyle w:val="Heading3"/>
       </w:pPr>
       <w:r>
-        <w:t>bright-et-al-2019-principles-of-management-openstax.pdf — p. 52 — similitud 0.1592</w:t>
+        <w:t>Robbins y Coulter - Administracion - 13a ed - 2018.pdf — p. 710 — similitud 0.1776</w:t>
       </w:r>
     </w:p>
     <w:p>
@@ -1474,7 +1474,7 @@
         <w:ind w:left="360"/>
       </w:pPr>
       <w:r>
-        <w:t>“Effective managers recognize that they will not always make optimal (best possible) decisions because they don’t have complete information and/or don’t have the time or resources to gather and process all the possible information. They accept that their decision-making will not be perfect and strive to make good decisions overall.”</w:t>
+        <w:t>“conductuales y de pensamiento, que afecta la manera de reaccionar de las personas ante ciertas situaciones o su interacción con sus semejantes personalidad proactiva  Rasgo de personalidad que describe tivo y flexible Organización para la Cooperación y el Desarrollo a los individuos que son más propensos a actuar para influir en su entorno personalidad tipo A  Personas que presentan una sensación Económico (OCDE)  Organismo internacional que contri­ buye al crecimiento económico sustentable y al aumento de empleos en los 34 países que la integran organización sin límites  Organización cuyo diseño no está crónica de urgencia y un impulso excesivo por competir personalidad tipo B  Personas...”</w:t>
       </w:r>
     </w:p>
     <w:p>
@@ -1482,7 +1482,7 @@
         <w:pStyle w:val="Heading3"/>
       </w:pPr>
       <w:r>
-        <w:t>bright-et-al-2019-principles-of-management-openstax.pdf — p. 369 — similitud 0.1571</w:t>
+        <w:t>Robbins y Judge - Comportamiento organizacional - 17a ed - 2017.pdf — p. 568 — similitud 0.1761</w:t>
       </w:r>
     </w:p>
     <w:p>
@@ -1490,7 +1490,7 @@
         <w:ind w:left="360"/>
       </w:pPr>
       <w:r>
-        <w:t>“management will have a lot of quality information on the internal successor candidates. It is important to include external successor candidates in the succession planning analysis as well.”</w:t>
+        <w:t>“530 PARTE 4 El sistema de la organización Cultura y formalización En este texto hemos visto que altos niveles de formalización facilitan el orden, la con- sistencia y la posibilidad de predicción. Una cultura fuerte también modifica el com- portamiento.”</w:t>
       </w:r>
     </w:p>
     <w:p>
@@ -1498,7 +1498,7 @@
         <w:pStyle w:val="Heading3"/>
       </w:pPr>
       <w:r>
-        <w:t>bright-et-al-2019-principles-of-management-openstax.pdf — p. 540 — similitud 0.1535</w:t>
+        <w:t>Robbins y Coulter - Administracion - 13a ed - 2018.pdf — p. 392 — similitud 0.1753</w:t>
       </w:r>
     </w:p>
     <w:p>
@@ -1506,7 +1506,7 @@
         <w:ind w:left="360"/>
       </w:pPr>
       <w:r>
-        <w:t>“moving quickly from the role of gatherer to the role of disseminator in minutes. Although many business organizations install large, expensive management information systems to perform many of those functions, nothing can match the speed and intuitive power of a well-trained manager’s brain for information processing. Not surprisingly, most managers prefer it that way.”</w:t>
+        <w:t>“En términos generales, los diseños organizacionales tienen como base dos formas estructurales, mismas que se describen en la figura 11-6.27 OA11.2 La organización mecanicista (o burocracia) fue el resultado natural de combinar los seis elementos estructurales. La adopción del principio de cadena de mando permitió la existencia de una jerarquía de autoridad formal, donde cada persona es controlada y supervisada por un superior.”</w:t>
       </w:r>
     </w:p>
     <w:p>
@@ -1514,7 +1514,7 @@
         <w:pStyle w:val="Heading3"/>
       </w:pPr>
       <w:r>
-        <w:t>bright-et-al-2019-principles-of-management-openstax.pdf — p. 47 — similitud 0.1417</w:t>
+        <w:t>Robbins y Coulter - Administracion - 13a ed - 2018.pdf — p. 404 — similitud 0.1748</w:t>
       </w:r>
     </w:p>
     <w:p>
@@ -1522,7 +1522,7 @@
         <w:ind w:left="360"/>
       </w:pPr>
       <w:r>
-        <w:t>“38 Chapter 2 Managerial Decision-Making try to combine information in news ways, search for overarching patterns, and use their imaginations to generate new solutions to existing problems. We’ll review creativity in more detail in Chapter 18.”</w:t>
+        <w:t>“La estructura de la organización debe respaldar su estrategia. Si la estrategia cambia, la estructura también debe cambiar.”</w:t>
       </w:r>
     </w:p>
     <w:p>
@@ -1533,7 +1533,7 @@
         <w:t xml:space="preserve">Observación automática: </w:t>
       </w:r>
       <w:r>
-        <w:t>La ficha presenta coincidencias útiles, pero conviene revisar la pertinencia de cada cita. Se agruparon varias referencias dentro de la misma fuente.</w:t>
+        <w:t>La ficha presenta coincidencias útiles, pero conviene revisar la pertinencia de cada cita. Se agruparon referencias de múltiples fuentes para enriquecer el concepto.</w:t>
       </w:r>
     </w:p>
     <w:p>
@@ -1541,7 +1541,7 @@
         <w:pStyle w:val="Heading2"/>
       </w:pPr>
       <w:r>
-        <w:t>Ficha 10. technology</w:t>
+        <w:t>Ficha 10. precisión larrarte</w:t>
       </w:r>
     </w:p>
     <w:p>
@@ -1552,7 +1552,7 @@
         <w:t xml:space="preserve">Fuentes: </w:t>
       </w:r>
       <w:r>
-        <w:t>bright-et-al-2019-principles-of-management-openstax.pdf</w:t>
+        <w:t>Robbins y Coulter - Administracion - 13a ed - 2018.pdf; Robbins y Judge - Comportamiento organizacional - 17a ed - 2017.pdf</w:t>
       </w:r>
     </w:p>
     <w:p>
@@ -1563,7 +1563,7 @@
         <w:t xml:space="preserve">Ubicaciones: </w:t>
       </w:r>
       <w:r>
-        <w:t>bright-et-al-2019-principles-of-management-openstax.pdf, p. 38; bright-et-al-2019-principles-of-management-openstax.pdf, p. 606; bright-et-al-2019-principles-of-management-openstax.pdf, p. 610; bright-et-al-2019-principles-of-management-openstax.pdf, p. 624; bright-et-al-2019-principles-of-management-openstax.pdf, p. 625; bright-et-al-2019-principles-of-management-openstax.pdf, p. 626; bright-et-al-2019-principles-of-management-openstax.pdf, p. 627</w:t>
+        <w:t>Robbins y Coulter - Administracion - 13a ed - 2018.pdf, p. 269; Robbins y Coulter - Administracion - 13a ed - 2018.pdf, p. 428; Robbins y Coulter - Administracion - 13a ed - 2018.pdf, p. 471; Robbins y Coulter - Administracion - 13a ed - 2018.pdf, p. 531; Robbins y Judge - Comportamiento organizacional - 17a ed - 2017.pdf, p. 165; Robbins y Judge - Comportamiento organizacional - 17a ed - 2017.pdf, p. 186; Robbins y Judge - Comportamiento organizacional - 17a ed - 2017.pdf, p. 224; Robbins y Judge - Comportamiento organizacional - 17a ed - 2017.pdf, p. 97</w:t>
       </w:r>
     </w:p>
     <w:p>
@@ -1571,7 +1571,7 @@
         <w:pStyle w:val="Heading3"/>
       </w:pPr>
       <w:r>
-        <w:t>bright-et-al-2019-principles-of-management-openstax.pdf — p. 627 — similitud 0.2645</w:t>
+        <w:t>Robbins y Coulter - Administracion - 13a ed - 2018.pdf — p. 269 — similitud 0.0615</w:t>
       </w:r>
     </w:p>
     <w:p>
@@ -1579,7 +1579,7 @@
         <w:ind w:left="360"/>
       </w:pPr>
       <w:r>
-        <w:t>“618 Chapter 18 Management of Technology and Innovation Chapter Review Questions 1. How do we define technology and innovation, and how are they related?”</w:t>
+        <w:t>“El tamaño reducido de las nuevas empresas suele ir acompañado de costos fijos bajos y de una mínima estructura de costos, lo cual se puede traducir en una enorme ventaja competitiva. Las compañías grandes implican elevados costos fijos; reglas, regulaciones y jerarquías burocráticas que limitan la flexibilidad y la rapidez de respuesta; así como culturas arraigadas que son muy efi- cientes para eliminar las ideas que no se ajustan con precisión a sus modelos actuales de negocios. PARA LOS GERENTES CORPORATIVOS  A los gerentes de las organizaciones grandes y exitosas, la innovación disruptiva les plantea el desafío de producir una respuesta adecuada.”</w:t>
       </w:r>
     </w:p>
     <w:p>
@@ -1587,7 +1587,7 @@
         <w:pStyle w:val="Heading3"/>
       </w:pPr>
       <w:r>
-        <w:t>bright-et-al-2019-principles-of-management-openstax.pdf — p. 610 — similitud 0.2604</w:t>
+        <w:t>Robbins y Judge - Comportamiento organizacional - 17a ed - 2017.pdf — p. 97 — similitud 0.0604</w:t>
       </w:r>
     </w:p>
     <w:p>
@@ -1595,7 +1595,7 @@
         <w:ind w:left="360"/>
       </w:pPr>
       <w:r>
-        <w:t>“Chapter 18 Management of Technology and Innovation 601 Exhibit 18.2 Technology and Innovation Defined (Attribution: Copyright Rice University, OpenStax, under CC-BY 4.0 license) Technology can be defined in a number of ways. The basic purpose of a system (such as an organization) is to convert inputs into outputs.”</w:t>
+        <w:t>“Los posibles beneficios de la diversidad son enormes para los gerentes progresistas. Por ejemplo, un programa piloto de la compañía de software SAP en Alemania, India e Irlanda descubrió que los empleados con autismo tienen un desempeño sobresaliente en tareas que requieren de gran precisión, como la localización de errores de software.95 Desde luego, para integrar empleados diversos en una fuerza laboral con un nivel de productividad óptimo se requiere de una gran habilidad. En la siguiente sección anali- zaremos la manera de reunir los talentos de una fuerza laboral diversa.”</w:t>
       </w:r>
     </w:p>
     <w:p>
@@ -1603,7 +1603,7 @@
         <w:pStyle w:val="Heading3"/>
       </w:pPr>
       <w:r>
-        <w:t>bright-et-al-2019-principles-of-management-openstax.pdf — p. 606 — similitud 0.2466</w:t>
+        <w:t>Robbins y Coulter - Administracion - 13a ed - 2018.pdf — p. 531 — similitud 0.0594</w:t>
       </w:r>
     </w:p>
     <w:p>
@@ -1611,7 +1611,7 @@
         <w:ind w:left="360"/>
       </w:pPr>
       <w:r>
-        <w:t>“18 Management of Technology and Innovation Exhibit 18.1 (Credit: 6eo tech/ flickr/ Attribution 2.0 Generic (CC BY 2.0)) Introduction Learning Outcome After reading this chapter, you should be able to answer these questions: 1. What do we mean by management of technology and innovation (MTI), and why is it crucial?”</w:t>
+        <w:t>“Por ejemplo, un estudio en el que se pidió a un grupo de gerentes que trabajaran en ejercicios de simulación que les exigían tomar decisiones de contratación, aquellos con fuerte propensión a asumir riesgos necesitaron menos tiempo para tomar decisiones y usaron menos información para hacer una elección que los gerentes con poca inclinación al riesgo.72 Es interesante mencionar que la precisión de la decisión fue la misma para ambos grupos. Si se desea maximizar la eficacia organizacional, es recomendable que los gerentes traten de alinear la propensión a la toma de riesgos de sus empleados con las demandas específicas de los puestos de trabajo.”</w:t>
       </w:r>
     </w:p>
     <w:p>
@@ -1619,7 +1619,7 @@
         <w:pStyle w:val="Heading3"/>
       </w:pPr>
       <w:r>
-        <w:t>bright-et-al-2019-principles-of-management-openstax.pdf — p. 38 — similitud 0.2354</w:t>
+        <w:t>Robbins y Judge - Comportamiento organizacional - 17a ed - 2017.pdf — p. 224 — similitud 0.0582</w:t>
       </w:r>
     </w:p>
     <w:p>
@@ -1627,7 +1627,7 @@
         <w:ind w:left="360"/>
       </w:pPr>
       <w:r>
-        <w:t>“unknowns in situations of this nature. Will the new technology really be better than the existing technology? Will it become widely accepted over time, or will some other technology become the standard?”</w:t>
+        <w:t>“186 PARTE 2 El individuo Habilidad mental Sabemos que las personas con mayores niveles de habilidad mental son capaces de procesar la información con mayor rapidez, de resolver los problemas con mayor precisión y de aprender de forma más rápida, de modo que se esperaría que también sean menos susceptibles a los errores de decisión comunes.”</w:t>
       </w:r>
     </w:p>
     <w:p>
@@ -1635,7 +1635,7 @@
         <w:pStyle w:val="Heading3"/>
       </w:pPr>
       <w:r>
-        <w:t>bright-et-al-2019-principles-of-management-openstax.pdf — p. 625 — similitud 0.2237</w:t>
+        <w:t>Robbins y Judge - Comportamiento organizacional - 17a ed - 2017.pdf — p. 165 — similitud 0.0578</w:t>
       </w:r>
     </w:p>
     <w:p>
@@ -1643,7 +1643,7 @@
         <w:ind w:left="360"/>
       </w:pPr>
       <w:r>
-        <w:t>“Management of technology and innovation is critical to the organization. Because of innovations and new technologies, we have historically seen the emergence of innovative organizational structures and new ways of performing work.”</w:t>
+        <w:t>“Se ha de- mostrado que la escala de felicidad PANAS es un fuerte indicador de felicidad. ¿Cree que la prueba midió con precisión su nivel de felicidad? ¿Por qué? DILEMA ÉTICO Minería de datos acerca de las emociones ¿Alguna vez le han dicho que es una persona que va con el cora- zón en la mano?”</w:t>
       </w:r>
     </w:p>
     <w:p>
@@ -1651,7 +1651,7 @@
         <w:pStyle w:val="Heading3"/>
       </w:pPr>
       <w:r>
-        <w:t>bright-et-al-2019-principles-of-management-openstax.pdf — p. 625 — similitud 0.2077</w:t>
+        <w:t>Robbins y Coulter - Administracion - 13a ed - 2018.pdf — p. 471 — similitud 0.0573</w:t>
       </w:r>
     </w:p>
     <w:p>
@@ -1659,7 +1659,7 @@
         <w:ind w:left="360"/>
       </w:pPr>
       <w:r>
-        <w:t>“616 Chapter 18 Management of Technology and Innovation Key Terms entrepreneurial activities The implementation of new ventures and idea generation in organizations. explicit knowledge Information codified or written down as rules or guidelines. followship The process of seeking or accepting influence. formal and informal contracts Used to allow firms to share technology between each other. franchise agreements Long-term agreements that involve long payoffs for the sharing of known technology. innovation Invention, new product development, and process-improvement methods are all examples of innovation. joint ventures Long-term alliances that involve the creation of a new entity to...”</w:t>
+        <w:t>“Por un lado, a menudo surgen problemas de comunicación debido a que quizá no todos los miem- bros del equipo hablan con fluidez el idioma domi- nante en el equipo. Esto podría derivar en falta de precisión, malentendidos e ineficacia.62 No obstante, las investigaciones indican también que un equipo global multicultural está mejor capacitado para capi- talizar la diversidad de ideas que se obtiene al utilizar un amplio rango de información.63 El manejo de conflictos no es sencillo en los equipos globales, y menos en aquellos que se basan en el trabajo virtual. El conflicto puede interferir en la manera en que el equipo utiliza la información.”</w:t>
       </w:r>
     </w:p>
     <w:p>
@@ -1667,7 +1667,7 @@
         <w:pStyle w:val="Heading3"/>
       </w:pPr>
       <w:r>
-        <w:t>bright-et-al-2019-principles-of-management-openstax.pdf — p. 626 — similitud 0.2009</w:t>
+        <w:t>Robbins y Coulter - Administracion - 13a ed - 2018.pdf — p. 428 — similitud 0.0570</w:t>
       </w:r>
     </w:p>
     <w:p>
@@ -1675,7 +1675,7 @@
         <w:ind w:left="360"/>
       </w:pPr>
       <w:r>
-        <w:t>“The most common types of external processes used to enhance technology and innovation in a firm include: mergers/acquisitions (M&amp;A), joint ventures, franchise agreements, licensing agreements, and formal and informal contracts. 18.4 Internal Sources of Technology and Innovation 4.”</w:t>
+        <w:t>“La figura 12-7 lista las ventajas y desventajas de cada una de ellas.60 Debido a que muchas herramien- tas de selección tienen un valor limitado para tomar decisiones, es recomendable que los gerentes utilicen aquellas que puedan pronosticar con eficacia el desempeño para un puesto de trabajo en particular. DESCRIPCIONES REALISTAS DEL PUESTO DE TRABAJO  En el Hilton Baltimore BWI Airport, los aspirantes a puestos de limpieza son llevados a una habitación de huéspedes, donde se les pide que tiendan una cama con la misma precisión que demuestra el entrevistador.”</w:t>
       </w:r>
     </w:p>
     <w:p>
@@ -1683,7 +1683,7 @@
         <w:pStyle w:val="Heading3"/>
       </w:pPr>
       <w:r>
-        <w:t>bright-et-al-2019-principles-of-management-openstax.pdf — p. 624 — similitud 0.1995</w:t>
+        <w:t>Robbins y Judge - Comportamiento organizacional - 17a ed - 2017.pdf — p. 186 — similitud 0.0563</w:t>
       </w:r>
     </w:p>
     <w:p>
@@ -1691,7 +1691,7 @@
         <w:ind w:left="360"/>
       </w:pPr>
       <w:r>
-        <w:t>“Chapter 18 Management of Technology and Innovation 615 C O N C E P T C H E C K 1. What is organizational learning?”</w:t>
+        <w:t>“148 PARTE 2 El individuo ¿Mito o ciencia? Es posible juzgar con precisión la personalidad de los individuos pocos segundos después de conocerlos D e manera sorprendente, parece que esta afirmación es verdadera. entrevista. Aunque difícilmente ésta sea la forma ideal para tomar decisiones de con- tratación importantes, los estudios sobre la personalidad indican que estos juicios tienen cierto nivel de validez.”</w:t>
       </w:r>
     </w:p>
     <w:p>
@@ -1702,7 +1702,7 @@
         <w:t xml:space="preserve">Observación automática: </w:t>
       </w:r>
       <w:r>
-        <w:t>La ficha presenta coincidencias útiles, pero conviene revisar la pertinencia de cada cita. Se agruparon varias referencias dentro de la misma fuente.</w:t>
+        <w:t>La ficha presenta coincidencias débiles; se recomienda validar manualmente las citas. Se agruparon referencias de múltiples fuentes para enriquecer el concepto. Hay 8 referencia(s) de baja similitud que podrían introducir ruido.</w:t>
       </w:r>
     </w:p>
     <w:p>
@@ -1710,7 +1710,7 @@
         <w:pStyle w:val="Heading2"/>
       </w:pPr>
       <w:r>
-        <w:t>Ficha 11. decision-making</w:t>
+        <w:t>Ficha 11. racionalidad limitada</w:t>
       </w:r>
     </w:p>
     <w:p>
@@ -1721,7 +1721,7 @@
         <w:t xml:space="preserve">Fuentes: </w:t>
       </w:r>
       <w:r>
-        <w:t>bright-et-al-2019-principles-of-management-openstax.pdf</w:t>
+        <w:t>Robbins y Coulter - Administracion - 13a ed - 2018.pdf; Robbins y Judge - Comportamiento organizacional - 17a ed - 2017.pdf</w:t>
       </w:r>
     </w:p>
     <w:p>
@@ -1732,7 +1732,7 @@
         <w:t xml:space="preserve">Ubicaciones: </w:t>
       </w:r>
       <w:r>
-        <w:t>bright-et-al-2019-principles-of-management-openstax.pdf, p. 36; bright-et-al-2019-principles-of-management-openstax.pdf, p. 40; bright-et-al-2019-principles-of-management-openstax.pdf, p. 54; bright-et-al-2019-principles-of-management-openstax.pdf, p. 55; bright-et-al-2019-principles-of-management-openstax.pdf, p. 57; bright-et-al-2019-principles-of-management-openstax.pdf, p. 59; bright-et-al-2019-principles-of-management-openstax.pdf, p. 60</w:t>
+        <w:t>Robbins y Coulter - Administracion - 13a ed - 2018.pdf, p. 101; Robbins y Coulter - Administracion - 13a ed - 2018.pdf, p. 106; Robbins y Coulter - Administracion - 13a ed - 2018.pdf, p. 87; Robbins y Coulter - Administracion - 13a ed - 2018.pdf, p. 96; Robbins y Judge - Comportamiento organizacional - 17a ed - 2017.pdf, p. 218</w:t>
       </w:r>
     </w:p>
     <w:p>
@@ -1740,7 +1740,7 @@
         <w:pStyle w:val="Heading3"/>
       </w:pPr>
       <w:r>
-        <w:t>bright-et-al-2019-principles-of-management-openstax.pdf — p. 54 — similitud 0.2731</w:t>
+        <w:t>Robbins y Judge - Comportamiento organizacional - 17a ed - 2017.pdf — p. 218 — similitud 0.2858</w:t>
       </w:r>
     </w:p>
     <w:p>
@@ -1748,7 +1748,7 @@
         <w:ind w:left="360"/>
       </w:pPr>
       <w:r>
-        <w:t>“2. What are the six steps in the decision-making process? 3.”</w:t>
+        <w:t>“Racionalidad limitada A menudo no utilizamos el modelo racional de toma de deci- siones por un motivo: nuestra capacidad limitada para procesar información hace im- posible que asimilemos toda la información que se necesitaría para tomar decisiones óptimas, incluso si esa información está disponible.35 Asimismo, muchos problemas no tienen una solución óptima porque es demasiado complicado aplicar el modelo racio- nal de la toma de decisiones, y la gente sacrifica, es decir, busca soluciones que sean tanto satisfactorias como suficientes. Los seres humanos tienden a reducir los problemas complejos a un nivel comprensible.”</w:t>
       </w:r>
     </w:p>
     <w:p>
@@ -1756,7 +1756,7 @@
         <w:pStyle w:val="Heading3"/>
       </w:pPr>
       <w:r>
-        <w:t>bright-et-al-2019-principles-of-management-openstax.pdf — p. 59 — similitud 0.2531</w:t>
+        <w:t>Robbins y Coulter - Administracion - 13a ed - 2018.pdf — p. 87 — similitud 0.2616</w:t>
       </w:r>
     </w:p>
     <w:p>
@@ -1764,7 +1764,7 @@
         <w:ind w:left="360"/>
       </w:pPr>
       <w:r>
-        <w:t>“addition, managers, like all humans, have biases that influence their decision-making, and that can make it difficult for them to make good decisions. One of the most common biases that can confound decision-making is confirmation bias, the tendency for a person to pay attention to information that confirms her existing beliefs and ignore information that conflicts with these existing beliefs.”</w:t>
+        <w:t>“Sin embargo, un enfoque más realista para describir cómo toman decisiones los gerentes parte del concepto de racionalidad limitada, según el cual los gerentes toman decisiones racionales, pero están limitados por su ca- pacidad para procesar la información.16 Debido a que no les es posible analizar toda la información de todas las alternativas, los gerentes transigen con una solución aceptable, en lugar de maximizar el beneficio. Esto significa que aceptan soluciones que son “suficientemente buenas”; son racionales dentro de los límites que les impone su capacidad para procesar la información.”</w:t>
       </w:r>
     </w:p>
     <w:p>
@@ -1772,7 +1772,7 @@
         <w:pStyle w:val="Heading3"/>
       </w:pPr>
       <w:r>
-        <w:t>bright-et-al-2019-principles-of-management-openstax.pdf — p. 60 — similitud 0.2481</w:t>
+        <w:t>Robbins y Judge - Comportamiento organizacional - 17a ed - 2017.pdf — p. 218 — similitud 0.2578</w:t>
       </w:r>
     </w:p>
     <w:p>
@@ -1780,7 +1780,7 @@
         <w:ind w:left="360"/>
       </w:pPr>
       <w:r>
-        <w:t>“2. What are the two systems that the brain uses in decision-making? How are they related to programmed and nonprogrammed decisions?”</w:t>
+        <w:t>“racionalidad limitada Proceso de toma de decisiones mediante la construcción de modelos simplificados que extraen las características esenciales de los problemas, sin incluir toda su complejidad. ¿Cómo funciona para la persona común la racionalidad limitada? Una vez identifi- cado un problema, comienza la búsqueda de criterios y alternativas, pero la lista aún está muy lejos de ser exhaustiva.”</w:t>
       </w:r>
     </w:p>
     <w:p>
@@ -1788,7 +1788,7 @@
         <w:pStyle w:val="Heading3"/>
       </w:pPr>
       <w:r>
-        <w:t>bright-et-al-2019-principles-of-management-openstax.pdf — p. 57 — similitud 0.2467</w:t>
+        <w:t>Robbins y Coulter - Administracion - 13a ed - 2018.pdf — p. 106 — similitud 0.2203</w:t>
       </w:r>
     </w:p>
     <w:p>
@@ -1796,7 +1796,7 @@
         <w:ind w:left="360"/>
       </w:pPr>
       <w:r>
-        <w:t>“C O N C E P T C H E C K 1. Explain why group decision-making can be more effective than individual decision-making. 2.”</w:t>
+        <w:t>“2-16. Describa cómo podrían aprovechar los ejecutivos que ocupan cargos administrativos en los equipos de béisbol y los entrenadores de equipos colegiales cada uno de los factores siguientes para tomar mejores decisiones: (a) la racionalidad, (b) la racionalidad limitada, (c) la intuición y (d) la administración basada en evidencias. 2-17. ¿Podría darse el caso de que haya un exceso de información en la administración del negocio del béisbol?”</w:t>
       </w:r>
     </w:p>
     <w:p>
@@ -1804,7 +1804,7 @@
         <w:pStyle w:val="Heading3"/>
       </w:pPr>
       <w:r>
-        <w:t>bright-et-al-2019-principles-of-management-openstax.pdf — p. 59 — similitud 0.2433</w:t>
+        <w:t>Robbins y Coulter - Administracion - 13a ed - 2018.pdf — p. 101 — similitud 0.1880</w:t>
       </w:r>
     </w:p>
     <w:p>
@@ -1812,7 +1812,7 @@
         <w:ind w:left="360"/>
       </w:pPr>
       <w:r>
-        <w:t>“in evidence-based decision-making: doing research and collecting data and information on which to base the decision. Effective managers also think critically about the quality of the evidence that they collect, and they carefully consider long-term outcomes and ethical implications prior to making a decision.”</w:t>
+        <w:t>“OA2.2 La racionalidad se basa en los siguientes supuestos: el problema es claro y sin ambigüedad; se busca lograr una sola meta bien definida; se conocen todas las alternativas posibles y sus conse- cuencias; y la elección final maximizará los beneficios. Por su parte, el concepto de racionalidad limitada sostiene que los gerentes toman decisiones racionales pero están limitados por su capa- cidad para procesar la información.”</w:t>
       </w:r>
     </w:p>
     <w:p>
@@ -1820,7 +1820,7 @@
         <w:pStyle w:val="Heading3"/>
       </w:pPr>
       <w:r>
-        <w:t>bright-et-al-2019-principles-of-management-openstax.pdf — p. 55 — similitud 0.2050</w:t>
+        <w:t>Robbins y Coulter - Administracion - 13a ed - 2018.pdf — p. 87 — similitud 0.1833</w:t>
       </w:r>
     </w:p>
     <w:p>
@@ -1828,7 +1828,7 @@
         <w:ind w:left="360"/>
       </w:pPr>
       <w:r>
-        <w:t>“46 Chapter 2 Managerial Decision-Making themselves). But with a hiring committee made up of an equal number of men and women, the bias should be cancelled out, resulting in more applicants being hired based on their qualifications rather than their physical attributes.”</w:t>
+        <w:t>“Los supuestos de racionalidad no son muy realistas y los gerentes no siempre actúan de manera racional; sin embargo, el siguiente concepto ayudará a explicar cómo se toman casi todas las decisiones en las organizaciones. Racionalidad limitada A pesar de los supuestos poco realistas, se espera que los gerentes sean racionales cuando toman decisiones.15 Los supuestos plantean que los individuos que toman “buenas” decisiones hacen ciertas cosas y muestran buenas conductas de toma de decisiones al identificar los problemas, con- siderar alternativas y obtener información, y que actúan con determinación pero de forma pruden- te.”</w:t>
       </w:r>
     </w:p>
     <w:p>
@@ -1836,7 +1836,7 @@
         <w:pStyle w:val="Heading3"/>
       </w:pPr>
       <w:r>
-        <w:t>bright-et-al-2019-principles-of-management-openstax.pdf — p. 40 — similitud 0.1986</w:t>
+        <w:t>Robbins y Coulter - Administracion - 13a ed - 2018.pdf — p. 101 — similitud 0.1799</w:t>
       </w:r>
     </w:p>
     <w:p>
@@ -1844,7 +1844,7 @@
         <w:ind w:left="360"/>
       </w:pPr>
       <w:r>
-        <w:t>“Chapter 2 Managerial Decision-Making 31 C O N C E P T C H E C K 1. Give an example of a programmed decision that a manager might face.”</w:t>
+        <w:t>“El modelo gerencial de la toma de decisiones contribuye a explicar cómo se utiliza el proceso de toma de decisiones para elegir la mejor alternativa —ya sea para maximizar el beneficio o transigir con una solución aceptable— y luego implementar y evaluar la alternativa. También ayuda a explicar qué factores afectan el proceso de toma de decisiones, incluyendo el enfoque empleado (racionalidad, racionalidad limitada, intuición), los tipos de problemas y de- cisiones (bien estructurados y programados o no estructurados y no programados), así como las condiciones imperantes (certidumbre, riesgo, incertidumbre).”</w:t>
       </w:r>
     </w:p>
     <w:p>
@@ -1852,7 +1852,7 @@
         <w:pStyle w:val="Heading3"/>
       </w:pPr>
       <w:r>
-        <w:t>bright-et-al-2019-principles-of-management-openstax.pdf — p. 36 — similitud 0.1937</w:t>
+        <w:t>Robbins y Coulter - Administracion - 13a ed - 2018.pdf — p. 96 — similitud 0.1789</w:t>
       </w:r>
     </w:p>
     <w:p>
@@ -1860,7 +1860,7 @@
         <w:ind w:left="360"/>
       </w:pPr>
       <w:r>
-        <w:t>“Chapter 2 Managerial Decision-Making 27 deal with it, the brain shifts immediately to the quick, intuitive decision-making system.5 Reflective Decision-Making The quick route is not always the best decision-making path to take, however. When faced with novel and complex situations, it is better to process available information logically, analytically, and methodically.”</w:t>
+        <w:t>“Figura 2-12 Descripción general de la toma de decisiones gerenciales Método para la toma de decisiones • Racionalidad • Racionalidad limitada • Intuición Errores y sesgos en la toma de decisiones Tipos de problemas y decisiones • Bien estructurados – programadas • No estructurados – no programadas Decisión • Elección de la mejor alternativa satisfacción máxima transigencia • Implementación • Evaluación Proceso de toma de decisiones Condiciones para la toma de decisiones”</w:t>
       </w:r>
     </w:p>
     <w:p>
@@ -1871,7 +1871,7 @@
         <w:t xml:space="preserve">Observación automática: </w:t>
       </w:r>
       <w:r>
-        <w:t>La ficha presenta coincidencias útiles, pero conviene revisar la pertinencia de cada cita. Se agruparon varias referencias dentro de la misma fuente.</w:t>
+        <w:t>La ficha presenta una coincidencia fuerte con el concepto buscado. Se agruparon referencias de múltiples fuentes para enriquecer el concepto.</w:t>
       </w:r>
     </w:p>
     <w:p>
@@ -1879,7 +1879,7 @@
         <w:pStyle w:val="Heading2"/>
       </w:pPr>
       <w:r>
-        <w:t>Ficha 12. organización</w:t>
+        <w:t>Ficha 12. relaciones</w:t>
       </w:r>
     </w:p>
     <w:p>
@@ -1890,7 +1890,7 @@
         <w:t xml:space="preserve">Fuentes: </w:t>
       </w:r>
       <w:r>
-        <w:t>larrarte-sf-fundamentos-administracion.pdf; sanchez-banuelos-2017-evolucion-gestion-organizacional.pdf</w:t>
+        <w:t>Robbins y Coulter - Administracion - 13a ed - 2018.pdf; Robbins y Judge - Comportamiento organizacional - 17a ed - 2017.pdf</w:t>
       </w:r>
     </w:p>
     <w:p>
@@ -1901,7 +1901,7 @@
         <w:t xml:space="preserve">Ubicaciones: </w:t>
       </w:r>
       <w:r>
-        <w:t>larrarte-sf-fundamentos-administracion.pdf, p. 11; sanchez-banuelos-2017-evolucion-gestion-organizacional.pdf, p. 5; sanchez-banuelos-2017-evolucion-gestion-organizacional.pdf, p. 6; sanchez-banuelos-2017-evolucion-gestion-organizacional.pdf, p. 7; sanchez-banuelos-2017-evolucion-gestion-organizacional.pdf, p. 8</w:t>
+        <w:t>Robbins y Coulter - Administracion - 13a ed - 2018.pdf, p. 122; Robbins y Coulter - Administracion - 13a ed - 2018.pdf, p. 283; Robbins y Coulter - Administracion - 13a ed - 2018.pdf, p. 328; Robbins y Coulter - Administracion - 13a ed - 2018.pdf, p. 421; Robbins y Judge - Comportamiento organizacional - 17a ed - 2017.pdf, p. 190; Robbins y Judge - Comportamiento organizacional - 17a ed - 2017.pdf, p. 286; Robbins y Judge - Comportamiento organizacional - 17a ed - 2017.pdf, p. 646; Robbins y Judge - Comportamiento organizacional - 17a ed - 2017.pdf, p. 665</w:t>
       </w:r>
     </w:p>
     <w:p>
@@ -1909,7 +1909,7 @@
         <w:pStyle w:val="Heading3"/>
       </w:pPr>
       <w:r>
-        <w:t>larrarte-sf-fundamentos-administracion.pdf — p. 11 — similitud 0.2424</w:t>
+        <w:t>Robbins y Coulter - Administracion - 13a ed - 2018.pdf — p. 421 — similitud 0.1939</w:t>
       </w:r>
     </w:p>
     <w:p>
@@ -1917,7 +1917,7 @@
         <w:ind w:left="360"/>
       </w:pPr>
       <w:r>
-        <w:t>“La atención se centró en el método de trabajo, en la ejecución de una tarea y en el tiem- po estándar para ejecutarla. Esta orientación permitió la especialización del obrero y la reagrupación de los movimientos, las operaciones, tareas y los cargos que constituyeron la organización racional del trabajo (Chiavenato, 2004) . b . Corriente de los anatomistas y fisiólogos de la organización: sus principales ex- ponentes fueron Henry Fayol, James Mooney, Lyndall Urwick y Luther Gulick .”</w:t>
+        <w:t>“Por otro lado, una proporción significativa de la fuerza laboral australiana está sindicalizada. Esta condición ha incrementado la importancia de los espe- cialistas en relaciones industriales, además de disminuir el control de los gerentes de línea sobre los problemas que se presentan en el ámbito laboral. En 1997, Austra- lia hizo una revisión de sus leyes de trabajo y relaciones industriales con el objetivo de incrementar la producti- vidad y reducir el poder sindical.”</w:t>
       </w:r>
     </w:p>
     <w:p>
@@ -1925,7 +1925,7 @@
         <w:pStyle w:val="Heading3"/>
       </w:pPr>
       <w:r>
-        <w:t>sanchez-banuelos-2017-evolucion-gestion-organizacional.pdf — p. 8 — similitud 0.2381</w:t>
+        <w:t>Robbins y Coulter - Administracion - 13a ed - 2018.pdf — p. 122 — similitud 0.1882</w:t>
       </w:r>
     </w:p>
     <w:p>
@@ -1933,7 +1933,7 @@
         <w:ind w:left="360"/>
       </w:pPr>
       <w:r>
-        <w:t>“Según Perrow (1984), estos autores han dedicado sus estudios a describir cierto tipo de organización y han cometido uno de los más grandes errores al asumir que los resultados de sus estudios pueden ser aplicados para el entendimiento de una organización típica, es decir, que este conocimiento es generalizado para cualquier organización, ya que estas se basaron en la necesidad de solucionar problemas en un determinado tiempo y contexto. Es evidente la trascendencia de las aportaciones generadas a través de la historia a la vida actual, lo cual no se puede dejar de lado ya que estas han construido los cimientos a lo largo de la historia y del transcurso de los años.”</w:t>
+        <w:t>“Cualquier persona puede hacer un video y subirlo al sitio de YouTube para que los demás lo disfruten. Un factor de su éxito es la formación de relaciones con sus diver- sos participantes: espectadores, celebridades y protagonistas de reality shows, grupos de servicio público y otros. La esencia de las relaciones de los participantes es otra de las formas en que el entorno influye en los gerentes.”</w:t>
       </w:r>
     </w:p>
     <w:p>
@@ -1941,7 +1941,7 @@
         <w:pStyle w:val="Heading3"/>
       </w:pPr>
       <w:r>
-        <w:t>sanchez-banuelos-2017-evolucion-gestion-organizacional.pdf — p. 6 — similitud 0.2111</w:t>
+        <w:t>Robbins y Judge - Comportamiento organizacional - 17a ed - 2017.pdf — p. 190 — similitud 0.1872</w:t>
       </w:r>
     </w:p>
     <w:p>
@@ -1949,7 +1949,7 @@
         <w:ind w:left="360"/>
       </w:pPr>
       <w:r>
-        <w:t>“El conocimiento, de acuerdo a Grant (1996), debe ser transferible, tener la capacidad de agregación, ser propio, especializado y verse reﬂejado en la producción. De tal forma que este se da en la organización a distintos niveles, como lo es individual, grupal, organizacional e interorganizacional. A su vez este puede ser tácito o explícito.”</w:t>
+        <w:t>“Equilibrio entre el trabajo y su vida personal, orientados a los equipos, no les gustan las reglas; lealtad a las relaciones Generación del milenio De 2000 a la actualidad Hasta mediados de los 30 Confiados, con éxito económico, independientes pero orientados a equipos; lealtad tanto a sí mismos como a sus relaciones”</w:t>
       </w:r>
     </w:p>
     <w:p>
@@ -1957,7 +1957,7 @@
         <w:pStyle w:val="Heading3"/>
       </w:pPr>
       <w:r>
-        <w:t>sanchez-banuelos-2017-evolucion-gestion-organizacional.pdf — p. 7 — similitud 0.1806</w:t>
+        <w:t>Robbins y Judge - Comportamiento organizacional - 17a ed - 2017.pdf — p. 286 — similitud 0.1652</w:t>
       </w:r>
     </w:p>
     <w:p>
@@ -1965,7 +1965,7 @@
         <w:ind w:left="360"/>
       </w:pPr>
       <w:r>
-        <w:t>“Se beneﬁcia así a la organización mediante el cumplimiento de las expectativas de la sociedad, generando un nuevo reto en la organización, que es la capacidad de los directivos de resistir y hacer caso a las presiones sociales. El estudio de esta teoría ha sido constante y recientemente, gracias al neo-institucionalismo, se ha permitido buscar un mejor entendimiento de la organización mediante la relación que se presenta entre el agente y el principal (Berrone y Gomez, 2009; Canales, 2007).”</w:t>
+        <w:t>“Diseño del puesto de trabajo por las relaciones Mientras que el rediseño de puestos de trabajo con base en la teoría de las características del puesto suele hacer que la tarea sea más motivante a nivel intrínseco, las investigaciones se concentran en lograr que los puestos motiven más al personal a mostrar comportamien- tos prosociales. En otras palabras, ¿de qué manera podrían los gerentes diseñar el trabajo para que los empleados se sientan motivados a fomentar el bienestar de los beneficiarios de la organización (clientes, pacientes y empleados)?”</w:t>
       </w:r>
     </w:p>
     <w:p>
@@ -1973,7 +1973,7 @@
         <w:pStyle w:val="Heading3"/>
       </w:pPr>
       <w:r>
-        <w:t>sanchez-banuelos-2017-evolucion-gestion-organizacional.pdf — p. 7 — similitud 0.1776</w:t>
+        <w:t>Robbins y Coulter - Administracion - 13a ed - 2018.pdf — p. 283 — similitud 0.1646</w:t>
       </w:r>
     </w:p>
     <w:p>
@@ -1981,7 +1981,7 @@
         <w:ind w:left="360"/>
       </w:pPr>
       <w:r>
-        <w:t>“Surgen así la teoría de relaciones interorganizacionales, institucionalismo y la teoría de la agencia, que sin duda alguna son vistas como sistemas abiertos que comparten y reciben información tanto interna y externa. Sin embargo, cada una diﬁere en la forma de ver la organización en conjunto, así mismo se enfocan en diferentes sectores y áreas. La teoría de las relaciones interorganizacionales menciona que toda organización formal se encuentra en un ambiente donde interactúa con otras organizaciones, así como con un conjunto de normas, valores y colectividades de la sociedad (Evan, 1967).”</w:t>
+        <w:t>“La cultura de Starbucks se enfoca en mantener a los trabajadores motivados y contentos. Una cosa que ha sido importan- te para Howard Schultz desde el primer día es la relación que tiene con sus empleados, ya que atesora esas relaciones y siente que son sumamente importantes para la manera en que la empresa establece relaciones con sus clientes y por la forma en que el público la per- cibe. Schultz comenta lo siguiente: “Sabemos que nuestro personal es la clave de nuestro éxito”.”</w:t>
       </w:r>
     </w:p>
     <w:p>
@@ -1989,7 +1989,7 @@
         <w:pStyle w:val="Heading3"/>
       </w:pPr>
       <w:r>
-        <w:t>sanchez-banuelos-2017-evolucion-gestion-organizacional.pdf — p. 7 — similitud 0.1652</w:t>
+        <w:t>Robbins y Judge - Comportamiento organizacional - 17a ed - 2017.pdf — p. 646 — similitud 0.1613</w:t>
       </w:r>
     </w:p>
     <w:p>
@@ -1997,7 +1997,7 @@
         <w:ind w:left="360"/>
       </w:pPr>
       <w:r>
-        <w:t>“De acuerdo a Di Maggio y Powel (1983), existen diferentes tipos de isomorﬁsmos: el competitivo, que se encuentra basado en el mercado; el institucional, que se basa en la relación con otras organizaciones; isomorﬁsmo coercitivo, en donde se encuentra regulado de acuerdo a políticas mediante las cuales la empresa busca su legitimidad; por otra parte gracias a la incertidumbre en la que se desarrollan las organizaciones, surge la necesidad de imitación dando lugar al isomorﬁsmo mimético; ﬁnalmente se encuentra el isomorﬁsmo normativo el cual es el resultado de personalización de la organización, creando reglas y directrices.”</w:t>
+        <w:t>“Amenaza a la pericia: Los cambios en los patrones organizacionales podrían amenazar la pericia de grupos especializados. Amenaza a las relaciones de poder establecidas: Cualquier redistribución de la autoridad para tomar decisiones amenaza las relaciones de poder establecidas desde hace mucho tiempo dentro de la organización.”</w:t>
       </w:r>
     </w:p>
     <w:p>
@@ -2005,7 +2005,7 @@
         <w:pStyle w:val="Heading3"/>
       </w:pPr>
       <w:r>
-        <w:t>larrarte-sf-fundamentos-administracion.pdf — p. 11 — similitud 0.1636</w:t>
+        <w:t>Robbins y Coulter - Administracion - 13a ed - 2018.pdf — p. 328 — similitud 0.1532</w:t>
       </w:r>
     </w:p>
     <w:p>
@@ -2013,7 +2013,7 @@
         <w:ind w:left="360"/>
       </w:pPr>
       <w:r>
-        <w:t>“Se identifican como logros de la Teoría clásica la organización formal, la representativi- dad anatómica y estructural de una organización, el establecimiento de los principios de la administración, la definición de las funciones del administrador, el establecimiento de las funciones y las actividades industriales (técnicas, comerciales, financieras, de seguri- dad, administrativas y contables) . Las seis funciones de la empresa son: 1 .”</w:t>
+        <w:t>“Crear y sostener una sólida formulando preguntas perspicaces y cuestionando las presuposiciones cultura organizacional Crear y mantener las relaciones organizacionales”</w:t>
       </w:r>
     </w:p>
     <w:p>
@@ -2021,7 +2021,7 @@
         <w:pStyle w:val="Heading3"/>
       </w:pPr>
       <w:r>
-        <w:t>sanchez-banuelos-2017-evolucion-gestion-organizacional.pdf — p. 5 — similitud 0.1552</w:t>
+        <w:t>Robbins y Judge - Comportamiento organizacional - 17a ed - 2017.pdf — p. 665 — similitud 0.1515</w:t>
       </w:r>
     </w:p>
     <w:p>
@@ -2029,7 +2029,7 @@
         <w:ind w:left="360"/>
       </w:pPr>
       <w:r>
-        <w:t>“10, July-December, ISSN: 2314-3738 Dentro de los principales autores en dichas teorías se pueden encontrar las aportaciones de Chandler (1962); Ansoﬀ (1965); Mintzberg (1978). De acuerdo a Alfred Chandler (1962), se concluye que el rol principal de la Estrategia de una empresa está ligado indeleblemente a la estructura de una organización, concluyendo en último término que la estructura debe estar en línea y seguir a la Estrategia que una organización ha deﬁnido.”</w:t>
+        <w:t>“Cambio organizacional y manejo del estrés CAPÍTULO 18 627 Kristen Reineke, que trabaja para DentalPlans.com, celebra después de anotar un punto mientras juega futbolín en la sala de empleados. Al proporcionar a su personal la oportunidad de formar relaciones con sus compañeros con juegos como futbolín y Wii, la compañía les brinda el apoyo social que les ayuda a reducir el impacto del estrés laboral. Fuente: Charles Trainor Jr/MCT/Newscom Como esto toma tiempo, los miembros más antiguos de la organización tienen mayor probabilidad de adaptarse por completo y deberían de experimentar menores niveles de estrés.”</w:t>
       </w:r>
     </w:p>
     <w:p>
@@ -2048,7 +2048,7 @@
         <w:pStyle w:val="Heading2"/>
       </w:pPr>
       <w:r>
-        <w:t>Ficha 13. activities</w:t>
+        <w:t>Ficha 13. suficiente precisión</w:t>
       </w:r>
     </w:p>
     <w:p>
@@ -2059,7 +2059,7 @@
         <w:t xml:space="preserve">Fuentes: </w:t>
       </w:r>
       <w:r>
-        <w:t>bright-et-al-2019-principles-of-management-openstax.pdf</w:t>
+        <w:t>Robbins y Coulter - Administracion - 13a ed - 2018.pdf; Robbins y Judge - Comportamiento organizacional - 17a ed - 2017.pdf</w:t>
       </w:r>
     </w:p>
     <w:p>
@@ -2070,7 +2070,7 @@
         <w:t xml:space="preserve">Ubicaciones: </w:t>
       </w:r>
       <w:r>
-        <w:t>bright-et-al-2019-principles-of-management-openstax.pdf, p. 12; bright-et-al-2019-principles-of-management-openstax.pdf, p. 163; bright-et-al-2019-principles-of-management-openstax.pdf, p. 24; bright-et-al-2019-principles-of-management-openstax.pdf, p. 276; bright-et-al-2019-principles-of-management-openstax.pdf, p. 407; bright-et-al-2019-principles-of-management-openstax.pdf, p. 560; bright-et-al-2019-principles-of-management-openstax.pdf, p. 568; bright-et-al-2019-principles-of-management-openstax.pdf, p. 574</w:t>
+        <w:t>Robbins y Coulter - Administracion - 13a ed - 2018.pdf, p. 262; Robbins y Coulter - Administracion - 13a ed - 2018.pdf, p. 269; Robbins y Coulter - Administracion - 13a ed - 2018.pdf, p. 439; Robbins y Coulter - Administracion - 13a ed - 2018.pdf, p. 461; Robbins y Coulter - Administracion - 13a ed - 2018.pdf, p. 531; Robbins y Judge - Comportamiento organizacional - 17a ed - 2017.pdf, p. 224; Robbins y Judge - Comportamiento organizacional - 17a ed - 2017.pdf, p. 281; Robbins y Judge - Comportamiento organizacional - 17a ed - 2017.pdf, p. 97</w:t>
       </w:r>
     </w:p>
     <w:p>
@@ -2078,7 +2078,7 @@
         <w:pStyle w:val="Heading3"/>
       </w:pPr>
       <w:r>
-        <w:t>bright-et-al-2019-principles-of-management-openstax.pdf — p. 407 — similitud 0.1663</w:t>
+        <w:t>Robbins y Coulter - Administracion - 13a ed - 2018.pdf — p. 262 — similitud 0.0606</w:t>
       </w:r>
     </w:p>
     <w:p>
@@ -2086,7 +2086,7 @@
         <w:ind w:left="360"/>
       </w:pPr>
       <w:r>
-        <w:t>“important, but training has a greater effect when the other factors are also included. A recent study investigated various diversity-training methods, including having participants engage in activities on perspective taking and goal setting. For perspective-taking activities, participants were asked to write a few sentences about the challenges they believed minority group members might experience.”</w:t>
+        <w:t>“Sin embargo, contar con personal creativo no es suficiente. También se requiere un entorno adecuado que contribuya a transformar los insumos en productos o métodos de trabajo innovadores.”</w:t>
       </w:r>
     </w:p>
     <w:p>
@@ -2094,7 +2094,7 @@
         <w:pStyle w:val="Heading3"/>
       </w:pPr>
       <w:r>
-        <w:t>bright-et-al-2019-principles-of-management-openstax.pdf — p. 163 — similitud 0.1480</w:t>
+        <w:t>Robbins y Coulter - Administracion - 13a ed - 2018.pdf — p. 461 — similitud 0.0514</w:t>
       </w:r>
     </w:p>
     <w:p>
@@ -2102,7 +2102,7 @@
         <w:ind w:left="360"/>
       </w:pPr>
       <w:r>
-        <w:t>“2. Who were some of the primary decision makers that led to the illegal sales activities? 3.”</w:t>
+        <w:t>“Dilucidar si los grupos son eficaces para tomar decisiones depende del criterio utilizado para realizar la evaluación.29 Si la precisión, la creatividad y el grado de aceptación son importantes, las decisiones grupales podrían funcionar mejor. No obstante, si la velocidad y la eficiencia son más relevantes, quizá la mejor alternativa sea la toma individual de decisiones.”</w:t>
       </w:r>
     </w:p>
     <w:p>
@@ -2110,7 +2110,7 @@
         <w:pStyle w:val="Heading3"/>
       </w:pPr>
       <w:r>
-        <w:t>bright-et-al-2019-principles-of-management-openstax.pdf — p. 560 — similitud 0.1451</w:t>
+        <w:t>Robbins y Coulter - Administracion - 13a ed - 2018.pdf — p. 439 — similitud 0.0498</w:t>
       </w:r>
     </w:p>
     <w:p>
@@ -2118,7 +2118,7 @@
         <w:ind w:left="360"/>
       </w:pPr>
       <w:r>
-        <w:t>“organizational units: (1) to offset uncertainty and change; (2) to focus organizational activity on a set of objectives; (3) to provide a coordinated, systematic road map for future activities; (4) to increase economic efficiency; and (5) to facilitate control by establishing a standard for later activity. Several forces contribute to the necessity for organizational planning.”</w:t>
+        <w:t>“Las pensiones han formado parte de las responsabilidades corporativas desde el siglo XIX.119 No obstante, han quedado atrás los días en que las empresas podían darse el lujo de ofrecer pensiones capaces de garantizar a sus trabajadores un ingreso suficiente después de la jubilación. Los com- promisos de las pensiones se han convertido en una enorme carga y las empresas ya no pueden costearlas.”</w:t>
       </w:r>
     </w:p>
     <w:p>
@@ -2126,7 +2126,7 @@
         <w:pStyle w:val="Heading3"/>
       </w:pPr>
       <w:r>
-        <w:t>bright-et-al-2019-principles-of-management-openstax.pdf — p. 568 — similitud 0.1450</w:t>
+        <w:t>Robbins y Judge - Comportamiento organizacional - 17a ed - 2017.pdf — p. 281 — similitud 0.0494</w:t>
       </w:r>
     </w:p>
     <w:p>
@@ -2134,7 +2134,7 @@
         <w:ind w:left="360"/>
       </w:pPr>
       <w:r>
-        <w:t>“Identify different types of plans and control systems employed by organizations. From an activity perspective, organizations are relatively complex systems, as they are involved in numerous activities. Many of these activities require management’s attention from both a planning and controlling perspective.”</w:t>
+        <w:t>“Sin lugar a dudas, contaba con la inteligencia y los conocimientos necesarios para pasar de la pobreza a la riqueza de manera honesta: sin un centavo ni experiencia alguna en finanzas, compró Taylor, Bean &amp; Whitaker (TBW), una pequeña compañía hipotecaria; con el préstamo de un fondo por $75,000 (él dice que fueron $25,000) en una década la convirtió en una de las principales empresas de créditos hipotecarios. Sin embargo, ese éxito no fue suficiente para él, y comenzó a crear y a vender hipotecas falsas, depositando las ga-”</w:t>
       </w:r>
     </w:p>
     <w:p>
@@ -2142,7 +2142,7 @@
         <w:pStyle w:val="Heading3"/>
       </w:pPr>
       <w:r>
-        <w:t>bright-et-al-2019-principles-of-management-openstax.pdf — p. 24 — similitud 0.1436</w:t>
+        <w:t>Robbins y Coulter - Administracion - 13a ed - 2018.pdf — p. 269 — similitud 0.0474</w:t>
       </w:r>
     </w:p>
     <w:p>
@@ -2150,7 +2150,7 @@
         <w:ind w:left="360"/>
       </w:pPr>
       <w:r>
-        <w:t>“Chapter 1 Managing and Performing 15 Exhibit 1.5 Levels in the Management Hierarchy (Attribution: Copyright Rice University, OpenStax, under CC-BY 4.0 license) Exhibit 1.5 shows differences in managerial activities by hierarchical level. Senior executives will devote more of their time to conceptual issues, while front-line managers will concentrate their efforts on technical issues.”</w:t>
+        <w:t>“El tamaño reducido de las nuevas empresas suele ir acompañado de costos fijos bajos y de una mínima estructura de costos, lo cual se puede traducir en una enorme ventaja competitiva. Las compañías grandes implican elevados costos fijos; reglas, regulaciones y jerarquías burocráticas que limitan la flexibilidad y la rapidez de respuesta; así como culturas arraigadas que son muy efi- cientes para eliminar las ideas que no se ajustan con precisión a sus modelos actuales de negocios. PARA LOS GERENTES CORPORATIVOS  A los gerentes de las organizaciones grandes y exitosas, la innovación disruptiva les plantea el desafío de producir una respuesta adecuada.”</w:t>
       </w:r>
     </w:p>
     <w:p>
@@ -2158,7 +2158,7 @@
         <w:pStyle w:val="Heading3"/>
       </w:pPr>
       <w:r>
-        <w:t>bright-et-al-2019-principles-of-management-openstax.pdf — p. 276 — similitud 0.1423</w:t>
+        <w:t>Robbins y Judge - Comportamiento organizacional - 17a ed - 2017.pdf — p. 97 — similitud 0.0466</w:t>
       </w:r>
     </w:p>
     <w:p>
@@ -2166,7 +2166,7 @@
         <w:ind w:left="360"/>
       </w:pPr>
       <w:r>
-        <w:t>“Chapter 8 Strategic Analysis: Understanding a Firm’s Competitive Environment 267 rivals in the industry. Generic Business-Level Competitive Strategies When discussing business strategy, a business is a firm or a unit of a firm that centers its activities around one primary type of product or service line. Business-level strategy is the general way that a business organizes its activities to compete against rivals in its product’s industry.”</w:t>
+        <w:t>“Los posibles beneficios de la diversidad son enormes para los gerentes progresistas. Por ejemplo, un programa piloto de la compañía de software SAP en Alemania, India e Irlanda descubrió que los empleados con autismo tienen un desempeño sobresaliente en tareas que requieren de gran precisión, como la localización de errores de software.95 Desde luego, para integrar empleados diversos en una fuerza laboral con un nivel de productividad óptimo se requiere de una gran habilidad. En la siguiente sección anali- zaremos la manera de reunir los talentos de una fuerza laboral diversa.”</w:t>
       </w:r>
     </w:p>
     <w:p>
@@ -2174,7 +2174,7 @@
         <w:pStyle w:val="Heading3"/>
       </w:pPr>
       <w:r>
-        <w:t>bright-et-al-2019-principles-of-management-openstax.pdf — p. 12 — similitud 0.1421</w:t>
+        <w:t>Robbins y Coulter - Administracion - 13a ed - 2018.pdf — p. 531 — similitud 0.0458</w:t>
       </w:r>
     </w:p>
     <w:p>
@@ -2182,7 +2182,7 @@
         <w:ind w:left="360"/>
       </w:pPr>
       <w:r>
-        <w:t>“Principles of Management helps students develop a solid grounding in the skills that they can apply throughout their managerial careers. These skill-building activities and resources help build and polish competencies that future employers will value. Chapter Review Questions.”</w:t>
+        <w:t>“Por ejemplo, un estudio en el que se pidió a un grupo de gerentes que trabajaran en ejercicios de simulación que les exigían tomar decisiones de contratación, aquellos con fuerte propensión a asumir riesgos necesitaron menos tiempo para tomar decisiones y usaron menos información para hacer una elección que los gerentes con poca inclinación al riesgo.72 Es interesante mencionar que la precisión de la decisión fue la misma para ambos grupos. Si se desea maximizar la eficacia organizacional, es recomendable que los gerentes traten de alinear la propensión a la toma de riesgos de sus empleados con las demandas específicas de los puestos de trabajo.”</w:t>
       </w:r>
     </w:p>
     <w:p>
@@ -2190,7 +2190,7 @@
         <w:pStyle w:val="Heading3"/>
       </w:pPr>
       <w:r>
-        <w:t>bright-et-al-2019-principles-of-management-openstax.pdf — p. 574 — similitud 0.1408</w:t>
+        <w:t>Robbins y Judge - Comportamiento organizacional - 17a ed - 2017.pdf — p. 224 — similitud 0.0450</w:t>
       </w:r>
     </w:p>
     <w:p>
@@ -2198,7 +2198,7 @@
         <w:ind w:left="360"/>
       </w:pPr>
       <w:r>
-        <w:t>“In situations where we want to encourage preplanning, certain techniques facilitate the process: • Develop an organizational climate that encourages planning. • Top managers support lower-level managers’ planning activities—for example, by providing such resources as personnel, computers, and funds—and serve as role models through their own planning activities. • Train people in planning. • Create a reward system that encourages and supports planning activity and carefully avoids punishment for failure to achieve newly set goals. • Use plans once they are created.”</w:t>
+        <w:t>“186 PARTE 2 El individuo Habilidad mental Sabemos que las personas con mayores niveles de habilidad mental son capaces de procesar la información con mayor rapidez, de resolver los problemas con mayor precisión y de aprender de forma más rápida, de modo que se esperaría que también sean menos susceptibles a los errores de decisión comunes.”</w:t>
       </w:r>
     </w:p>
     <w:p>
@@ -2209,7 +2209,7 @@
         <w:t xml:space="preserve">Observación automática: </w:t>
       </w:r>
       <w:r>
-        <w:t>La ficha presenta coincidencias útiles, pero conviene revisar la pertinencia de cada cita. Se agruparon varias referencias dentro de la misma fuente.</w:t>
+        <w:t>La ficha presenta coincidencias débiles; se recomienda validar manualmente las citas. Se agruparon referencias de múltiples fuentes para enriquecer el concepto. Hay 8 referencia(s) de baja similitud que podrían introducir ruido.</w:t>
       </w:r>
     </w:p>
     <w:p>
@@ -2217,7 +2217,7 @@
         <w:pStyle w:val="Heading2"/>
       </w:pPr>
       <w:r>
-        <w:t>Ficha 14. development</w:t>
+        <w:t>Ficha 14. teoría administrativa</w:t>
       </w:r>
     </w:p>
     <w:p>
@@ -2228,7 +2228,7 @@
         <w:t xml:space="preserve">Fuentes: </w:t>
       </w:r>
       <w:r>
-        <w:t>bright-et-al-2019-principles-of-management-openstax.pdf</w:t>
+        <w:t>Robbins y Coulter - Administracion - 13a ed - 2018.pdf; Robbins y Judge - Comportamiento organizacional - 17a ed - 2017.pdf</w:t>
       </w:r>
     </w:p>
     <w:p>
@@ -2239,7 +2239,7 @@
         <w:t xml:space="preserve">Ubicaciones: </w:t>
       </w:r>
       <w:r>
-        <w:t>bright-et-al-2019-principles-of-management-openstax.pdf, p. 190; bright-et-al-2019-principles-of-management-openstax.pdf, p. 369; bright-et-al-2019-principles-of-management-openstax.pdf, p. 370; bright-et-al-2019-principles-of-management-openstax.pdf, p. 371; bright-et-al-2019-principles-of-management-openstax.pdf, p. 373; bright-et-al-2019-principles-of-management-openstax.pdf, p. 526</w:t>
+        <w:t>Robbins y Coulter - Administracion - 13a ed - 2018.pdf, p. 69; Robbins y Judge - Comportamiento organizacional - 17a ed - 2017.pdf, p. 14; Robbins y Judge - Comportamiento organizacional - 17a ed - 2017.pdf, p. 245; Robbins y Judge - Comportamiento organizacional - 17a ed - 2017.pdf, p. 253; Robbins y Judge - Comportamiento organizacional - 17a ed - 2017.pdf, p. 271; Robbins y Judge - Comportamiento organizacional - 17a ed - 2017.pdf, p. 427; Robbins y Judge - Comportamiento organizacional - 17a ed - 2017.pdf, p. 712</w:t>
       </w:r>
     </w:p>
     <w:p>
@@ -2247,7 +2247,7 @@
         <w:pStyle w:val="Heading3"/>
       </w:pPr>
       <w:r>
-        <w:t>bright-et-al-2019-principles-of-management-openstax.pdf — p. 370 — similitud 0.1882</w:t>
+        <w:t>Robbins y Judge - Comportamiento organizacional - 17a ed - 2017.pdf — p. 14 — similitud 0.1700</w:t>
       </w:r>
     </w:p>
     <w:p>
@@ -2255,7 +2255,7 @@
         <w:ind w:left="360"/>
       </w:pPr>
       <w:r>
-        <w:t>“Chapter 11 Human Resource Management 361 manager, peers, direct reports, customers, or others who interact with the employee regularly. Finally, an individual development plan is an important document that employees should use to map out their personal development goals and actions, and to track their own status and progress toward those goals. Talent development is a collection of organization-wide processes that help to evaluate talent strengths and gaps within the organization.”</w:t>
+        <w:t>“xii CONTENIDO 7 Conceptos de motivación 206 La motivación y las primeras teorías 209 Primeras teorías sobre la motivación 210 Teoría de la jerarquía de las necesidades 210 • Teoría de los dos factores 211 • Teoría de las necesidades de McClelland 212 Objetivos de carrera ¿Por qué no siguen mi consejo? 214 Teorías contemporáneas de la motivación 214 Teoría de la autodeterminación 215 ¿Mito o ciencia?”</w:t>
       </w:r>
     </w:p>
     <w:p>
@@ -2263,7 +2263,7 @@
         <w:pStyle w:val="Heading3"/>
       </w:pPr>
       <w:r>
-        <w:t>bright-et-al-2019-principles-of-management-openstax.pdf — p. 369 — similitud 0.1848</w:t>
+        <w:t>Robbins y Judge - Comportamiento organizacional - 17a ed - 2017.pdf — p. 712 — similitud 0.1649</w:t>
       </w:r>
     </w:p>
     <w:p>
@@ -2271,7 +2271,7 @@
         <w:ind w:left="360"/>
       </w:pPr>
       <w:r>
-        <w:t>“360 Chapter 11 Human Resource Management team should discuss key development actions for each employee. (If there isn’t time to discuss development activities for each employee, the group should start with the high-potential employees.) After the talent review calibration process is complete, human resources should keep a master list of the documented outcomes, as well as the development activities that were suggested for everyone. HR should follow up with each of the leaders to help with the planning and execution of the development activities as needed.”</w:t>
+        <w:t>“También se le llama teoría de la motivación e higiene. teoría de los eventos afectivos (TEA) Modelo que sugiere que los eventos en el lugar de trabajo ocasionan reacciones emo- cionales en los empleados, las cuales influyen después en sus actitudes y comportamientos laborales. teoría del ajuste entre la personalidad y el puesto de tra- bajo Identifica seis tipos de personalidad, y propone que el ajuste entre el tipo de personalidad y el ambiente ocupacional determina la satisfacción y la rotación del personal. teoría del aprendizaje social Perspectiva de que los individuos aprenden tanto de la observación como de la propia experiencia. teoría del camino hacia la meta Plantea que es trabajo...”</w:t>
       </w:r>
     </w:p>
     <w:p>
@@ -2279,7 +2279,7 @@
         <w:pStyle w:val="Heading3"/>
       </w:pPr>
       <w:r>
-        <w:t>bright-et-al-2019-principles-of-management-openstax.pdf — p. 371 — similitud 0.1846</w:t>
+        <w:t>Robbins y Judge - Comportamiento organizacional - 17a ed - 2017.pdf — p. 271 — similitud 0.1565</w:t>
       </w:r>
     </w:p>
     <w:p>
@@ -2287,7 +2287,7 @@
         <w:ind w:left="360"/>
       </w:pPr>
       <w:r>
-        <w:t>“discussed, with input and sharing from organizational leadership. Total rewards strategy As coined by World at Work, includes compensation, benefits, work-life effectiveness, recognition, performance management, and talent development.”</w:t>
+        <w:t>“Resumen Las teorías sobre la motivación que se estudian en este capítulo tienen diferente valor predictivo. La jerarquía de Maslow, la teoría de los dos factores y la teoría de McCle- lland se centran en las necesidades. La teoría de la autodeterminación y los modelos relacionados tienen méritos que hay que considerar.”</w:t>
       </w:r>
     </w:p>
     <w:p>
@@ -2295,7 +2295,7 @@
         <w:pStyle w:val="Heading3"/>
       </w:pPr>
       <w:r>
-        <w:t>bright-et-al-2019-principles-of-management-openstax.pdf — p. 373 — similitud 0.1670</w:t>
+        <w:t>Robbins y Judge - Comportamiento organizacional - 17a ed - 2017.pdf — p. 253 — similitud 0.1463</w:t>
       </w:r>
     </w:p>
     <w:p>
@@ -2303,7 +2303,7 @@
         <w:ind w:left="360"/>
       </w:pPr>
       <w:r>
-        <w:t>“assess and develop employees and to make the appropriate decisions on their internal movement and development. One important talent development process involves a talent review, in which leadership discusses the employees in its groups in terms of their performance and potential.”</w:t>
+        <w:t>“Gran parte de los estudios sobre la teoría de la autodeterminación en el CO se ha enfocado en la teoría de la evaluación cognitiva, una teoría complementaria que pro- pone que las recompensas extrínsecas tienden a disminuir el interés intrínseco en una tarea. Cuando los individuos reciben un pago por su trabajo, sienten que se trata de algo que tienen que hacer y no algo que quieren hacer.”</w:t>
       </w:r>
     </w:p>
     <w:p>
@@ -2311,7 +2311,7 @@
         <w:pStyle w:val="Heading3"/>
       </w:pPr>
       <w:r>
-        <w:t>bright-et-al-2019-principles-of-management-openstax.pdf — p. 369 — similitud 0.1662</w:t>
+        <w:t>Robbins y Judge - Comportamiento organizacional - 17a ed - 2017.pdf — p. 245 — similitud 0.1453</w:t>
       </w:r>
     </w:p>
     <w:p>
@@ -2319,7 +2319,7 @@
         <w:ind w:left="360"/>
       </w:pPr>
       <w:r>
-        <w:t>“Some examples of follow-up development activities that may be appropriate based on the outputs of the succession and 9-box events include training, stretch assignments, individual assessments, and individual development plans. Training and training plans identify the learning events that an individual would benefit from, either in a classroom or online format.”</w:t>
+        <w:t>“7- 2 Comparar las primeras teorías sobre la motivación. 7- 3 Comparar los elementos de la teoría de la laboral del trabajador para la gerencia. 7- 6 Describir la manera como las teorías contemporáneas acerca de la motivación se complementan entre sí. autodeterminación y de la teoría del establecimiento de metas.”</w:t>
       </w:r>
     </w:p>
     <w:p>
@@ -2327,7 +2327,7 @@
         <w:pStyle w:val="Heading3"/>
       </w:pPr>
       <w:r>
-        <w:t>bright-et-al-2019-principles-of-management-openstax.pdf — p. 526 — similitud 0.1620</w:t>
+        <w:t>Robbins y Judge - Comportamiento organizacional - 17a ed - 2017.pdf — p. 712 — similitud 0.1371</w:t>
       </w:r>
     </w:p>
     <w:p>
@@ -2335,7 +2335,7 @@
         <w:ind w:left="360"/>
       </w:pPr>
       <w:r>
-        <w:t>“Some of the practices that make a team effective are that they have a sense of urgency and direction; they set clear rules of behavior; they spend lots of time together; and they utilize feedback, recognition, and reward. 15.2 Team Development Over Time 2. How do teams develop over time?”</w:t>
+        <w:t>“674 Glosario teoría de la identidad social Perspectiva que establece cuándo y por qué los individuos se consideran miembros de un grupo. teoría de la paradoja Plantea que la paradoja fundamental en la administración es que no existe un estatus óptimo final para una organización. teoría de las características del estatus Perspectiva que señala que las diferencias en las características del estatus crean jerar- quías dentro de los grupos. teoría de las expectativas Establece que la fortaleza de una tendencia para actuar de cierta manera depende de la fortaleza de la expectativa de que el acto irá seguido por un resultado dado que sea atractivo para el individuo. teoría de las necesidades de...”</w:t>
       </w:r>
     </w:p>
     <w:p>
@@ -2343,7 +2343,7 @@
         <w:pStyle w:val="Heading3"/>
       </w:pPr>
       <w:r>
-        <w:t>bright-et-al-2019-principles-of-management-openstax.pdf — p. 190 — similitud 0.1396</w:t>
+        <w:t>Robbins y Coulter - Administracion - 13a ed - 2018.pdf — p. 69 — similitud 0.1366</w:t>
       </w:r>
     </w:p>
     <w:p>
@@ -2351,7 +2351,7 @@
         <w:ind w:left="360"/>
       </w:pPr>
       <w:r>
-        <w:t>“Through Protestantism, wealth and hard work were for the glory of God. This emphasis therefore allowed a focus on goals attached to economic development and wealth accumulation. This belief explains much of the sustained development of capitalism in the Western Protestant societies.”</w:t>
+        <w:t>“Un estudio reveló que al liberar a los empleados de tareas repetitivas, éstos podían realizar labores esenciales de destreza manual un 25 por ciento más rápido.4 En AAB, una compañía suiza de energía y automatización, el uso de robots de adaptación redujo el tiempo perdido de los trabajadores en un 85 por ciento.5 teoría general de la administración Modelo administrativo que se enfoca en describir lo que hacen los gerentes y lo que constituye una buena práctica administrativa Teoría general de la administración La teoría general de la administración se enfoca más en lo que hacen los gerentes y en lo que constituye una buena práctica administrativa.”</w:t>
       </w:r>
     </w:p>
     <w:p>
@@ -2359,7 +2359,7 @@
         <w:pStyle w:val="Heading3"/>
       </w:pPr>
       <w:r>
-        <w:t>bright-et-al-2019-principles-of-management-openstax.pdf — p. 373 — similitud 0.1384</w:t>
+        <w:t>Robbins y Judge - Comportamiento organizacional - 17a ed - 2017.pdf — p. 427 — similitud 0.1268</w:t>
       </w:r>
     </w:p>
     <w:p>
@@ -2367,7 +2367,7 @@
         <w:ind w:left="360"/>
       </w:pPr>
       <w:r>
-        <w:t>“HR should work with the business to assess need and specifics of the job, develop a pool of candidates, and then assess candidates for the right person to bring into the organization. 11.6 Talent Development and Succession Planning 6. What are the benefits of talent development and succession planning?”</w:t>
+        <w:t>“Liderazgo CAPÍTULO 12 389 realizado para probar y respaldar la teoría han sido desalentadoras.15 ¿Por qué? Las explicaciones posibles incluyen ambigüedades internas e inconsistencias del propio modelo, así como problemas con la metodología de investigación.”</w:t>
       </w:r>
     </w:p>
     <w:p>
@@ -2378,7 +2378,7 @@
         <w:t xml:space="preserve">Observación automática: </w:t>
       </w:r>
       <w:r>
-        <w:t>La ficha presenta coincidencias útiles, pero conviene revisar la pertinencia de cada cita. Se agruparon varias referencias dentro de la misma fuente.</w:t>
+        <w:t>La ficha presenta coincidencias útiles, pero conviene revisar la pertinencia de cada cita. Se agruparon referencias de múltiples fuentes para enriquecer el concepto.</w:t>
       </w:r>
     </w:p>
     <w:p>
@@ -2386,7 +2386,7 @@
         <w:pStyle w:val="Heading2"/>
       </w:pPr>
       <w:r>
-        <w:t>Ficha 15. individuals</w:t>
+        <w:t>Ficha 15. trayectoria</w:t>
       </w:r>
     </w:p>
     <w:p>
@@ -2397,7 +2397,7 @@
         <w:t xml:space="preserve">Fuentes: </w:t>
       </w:r>
       <w:r>
-        <w:t>bright-et-al-2019-principles-of-management-openstax.pdf</w:t>
+        <w:t>Robbins y Coulter - Administracion - 13a ed - 2018.pdf</w:t>
       </w:r>
     </w:p>
     <w:p>
@@ -2408,7 +2408,7 @@
         <w:t xml:space="preserve">Ubicaciones: </w:t>
       </w:r>
       <w:r>
-        <w:t>bright-et-al-2019-principles-of-management-openstax.pdf, p. 135; bright-et-al-2019-principles-of-management-openstax.pdf, p. 161; bright-et-al-2019-principles-of-management-openstax.pdf, p. 400; bright-et-al-2019-principles-of-management-openstax.pdf, p. 402; bright-et-al-2019-principles-of-management-openstax.pdf, p. 408; bright-et-al-2019-principles-of-management-openstax.pdf, p. 410; bright-et-al-2019-principles-of-management-openstax.pdf, p. 418; bright-et-al-2019-principles-of-management-openstax.pdf, p. 622</w:t>
+        <w:t>Robbins y Coulter - Administracion - 13a ed - 2018.pdf, p. 157; Robbins y Coulter - Administracion - 13a ed - 2018.pdf, p. 174; Robbins y Coulter - Administracion - 13a ed - 2018.pdf, p. 195; Robbins y Coulter - Administracion - 13a ed - 2018.pdf, p. 301; Robbins y Coulter - Administracion - 13a ed - 2018.pdf, p. 423; Robbins y Coulter - Administracion - 13a ed - 2018.pdf, p. 538</w:t>
       </w:r>
     </w:p>
     <w:p>
@@ -2416,7 +2416,7 @@
         <w:pStyle w:val="Heading3"/>
       </w:pPr>
       <w:r>
-        <w:t>bright-et-al-2019-principles-of-management-openstax.pdf — p. 622 — similitud 0.1674</w:t>
+        <w:t>Robbins y Coulter - Administracion - 13a ed - 2018.pdf — p. 195 — similitud 0.1314</w:t>
       </w:r>
     </w:p>
     <w:p>
@@ -2424,7 +2424,7 @@
         <w:ind w:left="360"/>
       </w:pPr>
       <w:r>
-        <w:t>“learning about industry and general environment trends can help individuals and teams forecast more accurately. Individuals within the firm also need to have certain skills to enhance the management of technology and innovation processes.”</w:t>
+        <w:t>“Capítulo 5  Administración de la diversidad    159 una “brecha de ambición de liderazgo”; es decir, las mujeres no tienen puestos altos debido a que realmente no quieren tenerlos.104 Sugiere que las mujeres deben “ir hacia delante” y ser tan aserti- vas como son los hombres para impulsar su desarrollo profesional.105 Sin importar cuál sea la razón de que muy pocas mujeres lleguen a puestos ejecutivos, y como otros han dicho, es momento de romper el techo de cristal para todos los empleados. Cada traba- jador debe tener la oportunidad de utilizar sus habilidades y capacidades de forma que les permita crear una trayectoria profesional en la cual puedan progresar tanto como lo deseen.”</w:t>
       </w:r>
     </w:p>
     <w:p>
@@ -2432,7 +2432,7 @@
         <w:pStyle w:val="Heading3"/>
       </w:pPr>
       <w:r>
-        <w:t>bright-et-al-2019-principles-of-management-openstax.pdf — p. 161 — similitud 0.1416</w:t>
+        <w:t>Robbins y Coulter - Administracion - 13a ed - 2018.pdf — p. 538 — similitud 0.1296</w:t>
       </w:r>
     </w:p>
     <w:p>
@@ -2440,7 +2440,7 @@
         <w:ind w:left="360"/>
       </w:pPr>
       <w:r>
-        <w:t>“There may be high pressure from coworkers, managers, or any other constituent of business culture to be unethical. Individuals may hate such pressures, and they tend to work to avoid the dilemmas. 5.3 Ethical Principles and Responsible Decision-Making 3.”</w:t>
+        <w:t>“Desde la perspectiva de la atribución, si existe un consenso elevado, lo más probable es que la responsabilidad del retraso del empleado se atribuya a algún factor externo (quizá que están haciendo reparaciones en el camino o que hubo un accidente de tránsito). Sin embargo, si otros empleados que siguen la misma trayectoria hacia el trabajo llegan a tiempo, tenderíamos a concluir que la causa del comportamiento fue interna. Finalmente, el observador busca consistencia en las acciones de una persona. ¿El individuo se comporta de esa forma con regularidad y consistencia? ¿Siempre responde de la misma ma- nera?”</w:t>
       </w:r>
     </w:p>
     <w:p>
@@ -2448,7 +2448,7 @@
         <w:pStyle w:val="Heading3"/>
       </w:pPr>
       <w:r>
-        <w:t>bright-et-al-2019-principles-of-management-openstax.pdf — p. 408 — similitud 0.1415</w:t>
+        <w:t>Robbins y Coulter - Administracion - 13a ed - 2018.pdf — p. 174 — similitud 0.1294</w:t>
       </w:r>
     </w:p>
     <w:p>
@@ -2456,7 +2456,7 @@
         <w:ind w:left="360"/>
       </w:pPr>
       <w:r>
-        <w:t>“In this way culture serves as a control mechanism for shaping behaviors. Strategies for Employees Individuals can increase positive employment outcomes by obtaining high levels of education, because for all groups education is a predictor of employment and increased earnings. Individuals can also seek employment in larger firms, which are more likely to have formal hiring programs and specific diversity provisions in place.”</w:t>
+        <w:t>“Estos individuos, llamados patrocinadores o mentores, pueden ser una maravillosa fuente de apoyo para el desarrollo profesional. ¿Cómo? Apoyando su trayectoria y desarrollo profesionales; auxiliándolo para resolver problemas y conflictos; ampliando su percepción de lo que cree que es usted capaz de hacer; ayudándolo a “conectarse” con altos ejecutivos y con otras personas influyentes, y aconsejándole sobre la “manera” de avanzar en su carrera profesional. Ahora que usted sabe cómo se les llama… ¿qué nombre recibiría usted?”</w:t>
       </w:r>
     </w:p>
     <w:p>
@@ -2464,7 +2464,7 @@
         <w:pStyle w:val="Heading3"/>
       </w:pPr>
       <w:r>
-        <w:t>bright-et-al-2019-principles-of-management-openstax.pdf — p. 135 — similitud 0.1404</w:t>
+        <w:t>Robbins y Coulter - Administracion - 13a ed - 2018.pdf — p. 301 — similitud 0.1291</w:t>
       </w:r>
     </w:p>
     <w:p>
@@ -2472,7 +2472,7 @@
         <w:ind w:left="360"/>
       </w:pPr>
       <w:r>
-        <w:t>“of the most widely used principles by corporations, institutions, nations, and individuals, given the limitations that accompany it. Use of this principle generally applies when resources are scarce, there is a conflict in priorities, and no clear choice meets everyone’s needs—that is, a zero-sum decision is imminent Universalism: A Duty-Based Approach Universalism is a principle that considers the welfare and risks of all parties when considering policy decisions and outcomes.”</w:t>
+        <w:t>“Los planes sirven como mapas de ruta, pero siempre hay que tomar en cuenta que el destino podría modificarse debido a las condiciones dinámicas del mercado. Por lo tanto, los responsables de dirigir a la organización deben estar listos para cambiar de trayectoria cuando las condiciones lo exijan. La flexibilidad es particularmente relevante cuando llega el momento de implementar los planes.”</w:t>
       </w:r>
     </w:p>
     <w:p>
@@ -2480,7 +2480,7 @@
         <w:pStyle w:val="Heading3"/>
       </w:pPr>
       <w:r>
-        <w:t>bright-et-al-2019-principles-of-management-openstax.pdf — p. 418 — similitud 0.1385</w:t>
+        <w:t>Robbins y Coulter - Administracion - 13a ed - 2018.pdf — p. 157 — similitud 0.1242</w:t>
       </w:r>
     </w:p>
     <w:p>
@@ -2488,7 +2488,7 @@
         <w:ind w:left="360"/>
       </w:pPr>
       <w:r>
-        <w:t>“In this view, a good leader develops a vision for the group, communicates that vision,5 orchestrates the group’s energy and activity toward goal attainment, “[turns] a group of individuals into a team,” and “[transforms] good intentions into positive actions.”6 Leadership is frequently defined as a social (interpersonal) influence relationship between two or more persons who depend on each other to attain certain mutual goals in a group situation.7 Effective leadership helps individuals and groups achieve their goals by focusing on the group’s maintenance needs (the need for individuals to fit and work together by having, for example, shared norms) and task needs (the need for the”</w:t>
+        <w:t>“Por ejem- plo, BP pudo haber advertido a Exxon respecto de los desafíos que conllevaba hacer negocios en Rusia. Durante su larga trayectoria en el país, BP había sido víctima de “tantos operativos policía- cos, que el precio de sus acciones sufría bruscos aumentos o caídas súbitas en respuesta a redadas o arrestos de sus empleados”. Sin embargo, casi una cuarta parte de la producción de BP proviene del petróleo y el gas natural de Rusia, así que la empresa ha aprendido a vivir con esas molestias.”</w:t>
       </w:r>
     </w:p>
     <w:p>
@@ -2496,7 +2496,7 @@
         <w:pStyle w:val="Heading3"/>
       </w:pPr>
       <w:r>
-        <w:t>bright-et-al-2019-principles-of-management-openstax.pdf — p. 402 — similitud 0.1367</w:t>
+        <w:t>Robbins y Coulter - Administracion - 13a ed - 2018.pdf — p. 423 — similitud 0.0700</w:t>
       </w:r>
     </w:p>
     <w:p>
@@ -2504,39 +2504,7 @@
         <w:ind w:left="360"/>
       </w:pPr>
       <w:r>
-        <w:t>“When in-group favoritism does occur, majority-group members will be hired, promoted, and rewarded at the expense of minority-group members, often in violation of various laws. Schema Theory Schema theory explains how individuals encode information about others based on their demographic characteristics.141 Units of information and knowledge experienced by individuals are stored as having patterns and interrelationships, thus creating schemas that can be used to evaluate one’s self or others. As a result of the prior perceived knowledge or beliefs embodied in such schemas, individuals categorize people, events, and objects.”</w:t>
-      </w:r>
-    </w:p>
-    <w:p>
-      <w:pPr>
-        <w:pStyle w:val="Heading3"/>
-      </w:pPr>
-      <w:r>
-        <w:t>bright-et-al-2019-principles-of-management-openstax.pdf — p. 410 — similitud 0.1250</w:t>
-      </w:r>
-    </w:p>
-    <w:p>
-      <w:pPr>
-        <w:ind w:left="360"/>
-      </w:pPr>
-      <w:r>
-        <w:t>“manner that assists the organization in achieving a sustainable competitive advantage. surface-level diversity Diversity in the form of characteristics of individuals that are readily visible, including, but not limited to, age, body size, visible disabilities, race, or sex.”</w:t>
-      </w:r>
-    </w:p>
-    <w:p>
-      <w:pPr>
-        <w:pStyle w:val="Heading3"/>
-      </w:pPr>
-      <w:r>
-        <w:t>bright-et-al-2019-principles-of-management-openstax.pdf — p. 400 — similitud 0.1210</w:t>
-      </w:r>
-    </w:p>
-    <w:p>
-      <w:pPr>
-        <w:ind w:left="360"/>
-      </w:pPr>
-      <w:r>
-        <w:t>“Competing viewpoints attempt to explain how diversity is either harmful or beneficial to organizational outcomes. • The cognitive diversity hypothesis suggests that multiple perspectives stemming from the cultural differences between group or organizational members result in creative problem solving and innovation. • The similarity-attraction paradigm and social identity theory hold that individuals’ preferences for interacting with others like themselves can result in diversity having a negative effect on group and organizational outcomes. • The justification-suppression model explains under what conditions individuals act on their prejudices.”</w:t>
+        <w:t>“En un minuto, aparecen los nombres de 31 posibles candidatos.39 En Hoover’s Inc., una subsidiaria de Dun &amp; Bradstreet, para hacerse una idea clara de las habilidades del personal y localizar a los empleados adecuados para participar en algún proyecto, se utiliza un sofisticado programa de cómputo y un sistema de evaluación de empleados desarrollado por la propia compañía para registrar el progreso de los trabajadores a lo largo de sus trayectorias profesionales.40 Eso es justamente lo que debe lograr una buena planeación de RH: contribuir a que los gerentes identifiquen a las personas que necesitan.”</w:t>
       </w:r>
     </w:p>
     <w:p>
@@ -2547,7 +2515,7 @@
         <w:t xml:space="preserve">Observación automática: </w:t>
       </w:r>
       <w:r>
-        <w:t>La ficha presenta coincidencias útiles, pero conviene revisar la pertinencia de cada cita. Se agruparon varias referencias dentro de la misma fuente.</w:t>
+        <w:t>La ficha presenta coincidencias débiles; se recomienda validar manualmente las citas. Se agruparon varias referencias dentro de la misma fuente. Hay 1 referencia(s) de baja similitud que podrían introducir ruido.</w:t>
       </w:r>
     </w:p>
     <w:p>
@@ -2555,7 +2523,7 @@
         <w:pStyle w:val="Heading2"/>
       </w:pPr>
       <w:r>
-        <w:t>Ficha 16. managerial</w:t>
+        <w:t>Ficha 16. trayectoria teoría</w:t>
       </w:r>
     </w:p>
     <w:p>
@@ -2566,7 +2534,7 @@
         <w:t xml:space="preserve">Fuentes: </w:t>
       </w:r>
       <w:r>
-        <w:t>bright-et-al-2019-principles-of-management-openstax.pdf</w:t>
+        <w:t>Robbins y Judge - Comportamiento organizacional - 17a ed - 2017.pdf</w:t>
       </w:r>
     </w:p>
     <w:p>
@@ -2577,7 +2545,7 @@
         <w:t xml:space="preserve">Ubicaciones: </w:t>
       </w:r>
       <w:r>
-        <w:t>bright-et-al-2019-principles-of-management-openstax.pdf, p. 24; bright-et-al-2019-principles-of-management-openstax.pdf, p. 26; bright-et-al-2019-principles-of-management-openstax.pdf, p. 538; bright-et-al-2019-principles-of-management-openstax.pdf, p. 542; bright-et-al-2019-principles-of-management-openstax.pdf, p. 562; bright-et-al-2019-principles-of-management-openstax.pdf, p. 57; bright-et-al-2019-principles-of-management-openstax.pdf, p. 58; bright-et-al-2019-principles-of-management-openstax.pdf, p. 89</w:t>
+        <w:t>Robbins y Judge - Comportamiento organizacional - 17a ed - 2017.pdf, p. 14; Robbins y Judge - Comportamiento organizacional - 17a ed - 2017.pdf, p. 245; Robbins y Judge - Comportamiento organizacional - 17a ed - 2017.pdf, p. 253; Robbins y Judge - Comportamiento organizacional - 17a ed - 2017.pdf, p. 271; Robbins y Judge - Comportamiento organizacional - 17a ed - 2017.pdf, p. 427; Robbins y Judge - Comportamiento organizacional - 17a ed - 2017.pdf, p. 711; Robbins y Judge - Comportamiento organizacional - 17a ed - 2017.pdf, p. 712</w:t>
       </w:r>
     </w:p>
     <w:p>
@@ -2585,7 +2553,7 @@
         <w:pStyle w:val="Heading3"/>
       </w:pPr>
       <w:r>
-        <w:t>bright-et-al-2019-principles-of-management-openstax.pdf — p. 58 — similitud 0.1558</w:t>
+        <w:t>Robbins y Judge - Comportamiento organizacional - 17a ed - 2017.pdf — p. 14 — similitud 0.1322</w:t>
       </w:r>
     </w:p>
     <w:p>
@@ -2593,7 +2561,7 @@
         <w:ind w:left="360"/>
       </w:pPr>
       <w:r>
-        <w:t>“Suppression of dissent When a group member exerts his or her power to prevent others from voicing their thoughts or opinions. Summary of Learning Outcomes 2.1 Overview of Managerial Decision-Making 1. What are the basic characteristics of managerial decision-making?”</w:t>
+        <w:t>“xii CONTENIDO 7 Conceptos de motivación 206 La motivación y las primeras teorías 209 Primeras teorías sobre la motivación 210 Teoría de la jerarquía de las necesidades 210 • Teoría de los dos factores 211 • Teoría de las necesidades de McClelland 212 Objetivos de carrera ¿Por qué no siguen mi consejo? 214 Teorías contemporáneas de la motivación 214 Teoría de la autodeterminación 215 ¿Mito o ciencia?”</w:t>
       </w:r>
     </w:p>
     <w:p>
@@ -2601,7 +2569,7 @@
         <w:pStyle w:val="Heading3"/>
       </w:pPr>
       <w:r>
-        <w:t>bright-et-al-2019-principles-of-management-openstax.pdf — p. 562 — similitud 0.1233</w:t>
+        <w:t>Robbins y Judge - Comportamiento organizacional - 17a ed - 2017.pdf — p. 712 — similitud 0.1283</w:t>
       </w:r>
     </w:p>
     <w:p>
@@ -2609,7 +2577,7 @@
         <w:ind w:left="360"/>
       </w:pPr>
       <w:r>
-        <w:t>“commonly participative.12 The planning model described in this section breaks the managerial function of planning into several steps, as shown in Exhibit 17.3. Following this step-by-step procedure helps ensure that organizational planning meets these requirements.”</w:t>
+        <w:t>“También se le llama teoría de la motivación e higiene. teoría de los eventos afectivos (TEA) Modelo que sugiere que los eventos en el lugar de trabajo ocasionan reacciones emo- cionales en los empleados, las cuales influyen después en sus actitudes y comportamientos laborales. teoría del ajuste entre la personalidad y el puesto de tra- bajo Identifica seis tipos de personalidad, y propone que el ajuste entre el tipo de personalidad y el ambiente ocupacional determina la satisfacción y la rotación del personal. teoría del aprendizaje social Perspectiva de que los individuos aprenden tanto de la observación como de la propia experiencia. teoría del camino hacia la meta Plantea que es trabajo...”</w:t>
       </w:r>
     </w:p>
     <w:p>
@@ -2617,7 +2585,7 @@
         <w:pStyle w:val="Heading3"/>
       </w:pPr>
       <w:r>
-        <w:t>bright-et-al-2019-principles-of-management-openstax.pdf — p. 26 — similitud 0.1214</w:t>
+        <w:t>Robbins y Judge - Comportamiento organizacional - 17a ed - 2017.pdf — p. 271 — similitud 0.1219</w:t>
       </w:r>
     </w:p>
     <w:p>
@@ -2625,7 +2593,7 @@
         <w:ind w:left="360"/>
       </w:pPr>
       <w:r>
-        <w:t>“2. Describe and explain the three types of managerial skills and how they relate to each level of management.”</w:t>
+        <w:t>“Resumen Las teorías sobre la motivación que se estudian en este capítulo tienen diferente valor predictivo. La jerarquía de Maslow, la teoría de los dos factores y la teoría de McCle- lland se centran en las necesidades. La teoría de la autodeterminación y los modelos relacionados tienen méritos que hay que considerar.”</w:t>
       </w:r>
     </w:p>
     <w:p>
@@ -2633,7 +2601,7 @@
         <w:pStyle w:val="Heading3"/>
       </w:pPr>
       <w:r>
-        <w:t>bright-et-al-2019-principles-of-management-openstax.pdf — p. 57 — similitud 0.1202</w:t>
+        <w:t>Robbins y Judge - Comportamiento organizacional - 17a ed - 2017.pdf — p. 253 — similitud 0.1141</w:t>
       </w:r>
     </w:p>
     <w:p>
@@ -2641,7 +2609,7 @@
         <w:ind w:left="360"/>
       </w:pPr>
       <w:r>
-        <w:t>“48 Chapter 2 Managerial Decision-Making Summary of Techniques That May Improve Group Decision-Making Type of Technique Benefit Decision Encourage everyone to speak up Improves quality: generates more options, prevents and contribute. suppression of dissent Help group members find Improves quality: reduces personality conflict common ground. Table 2.3 (Attribution: Copyright Rice University, OpenStax, under CC-BY 4.0 license) Conclusion Decision-making is a crucial daily activity for managers.”</w:t>
+        <w:t>“Gran parte de los estudios sobre la teoría de la autodeterminación en el CO se ha enfocado en la teoría de la evaluación cognitiva, una teoría complementaria que pro- pone que las recompensas extrínsecas tienden a disminuir el interés intrínseco en una tarea. Cuando los individuos reciben un pago por su trabajo, sienten que se trata de algo que tienen que hacer y no algo que quieren hacer.”</w:t>
       </w:r>
     </w:p>
     <w:p>
@@ -2649,7 +2617,7 @@
         <w:pStyle w:val="Heading3"/>
       </w:pPr>
       <w:r>
-        <w:t>bright-et-al-2019-principles-of-management-openstax.pdf — p. 89 — similitud 0.1199</w:t>
+        <w:t>Robbins y Judge - Comportamiento organizacional - 17a ed - 2017.pdf — p. 245 — similitud 0.1133</w:t>
       </w:r>
     </w:p>
     <w:p>
@@ -2657,7 +2625,7 @@
         <w:ind w:left="360"/>
       </w:pPr>
       <w:r>
-        <w:t>“What is contingency management? Managerial Decision Exercises 1. Which management scholar do you find to be the most influential and important, and how would you incorporate their approach into your managerial approach?”</w:t>
+        <w:t>“7- 2 Comparar las primeras teorías sobre la motivación. 7- 3 Comparar los elementos de la teoría de la laboral del trabajador para la gerencia. 7- 6 Describir la manera como las teorías contemporáneas acerca de la motivación se complementan entre sí. autodeterminación y de la teoría del establecimiento de metas.”</w:t>
       </w:r>
     </w:p>
     <w:p>
@@ -2665,7 +2633,7 @@
         <w:pStyle w:val="Heading3"/>
       </w:pPr>
       <w:r>
-        <w:t>bright-et-al-2019-principles-of-management-openstax.pdf — p. 24 — similitud 0.1186</w:t>
+        <w:t>Robbins y Judge - Comportamiento organizacional - 17a ed - 2017.pdf — p. 712 — similitud 0.1070</w:t>
       </w:r>
     </w:p>
     <w:p>
@@ -2673,7 +2641,7 @@
         <w:ind w:left="360"/>
       </w:pPr>
       <w:r>
-        <w:t>“Chapter 1 Managing and Performing 15 Exhibit 1.5 Levels in the Management Hierarchy (Attribution: Copyright Rice University, OpenStax, under CC-BY 4.0 license) Exhibit 1.5 shows differences in managerial activities by hierarchical level. Senior executives will devote more of their time to conceptual issues, while front-line managers will concentrate their efforts on technical issues.”</w:t>
+        <w:t>“674 Glosario teoría de la identidad social Perspectiva que establece cuándo y por qué los individuos se consideran miembros de un grupo. teoría de la paradoja Plantea que la paradoja fundamental en la administración es que no existe un estatus óptimo final para una organización. teoría de las características del estatus Perspectiva que señala que las diferencias en las características del estatus crean jerar- quías dentro de los grupos. teoría de las expectativas Establece que la fortaleza de una tendencia para actuar de cierta manera depende de la fortaleza de la expectativa de que el acto irá seguido por un resultado dado que sea atractivo para el individuo. teoría de las necesidades de...”</w:t>
       </w:r>
     </w:p>
     <w:p>
@@ -2681,7 +2649,7 @@
         <w:pStyle w:val="Heading3"/>
       </w:pPr>
       <w:r>
-        <w:t>bright-et-al-2019-principles-of-management-openstax.pdf — p. 542 — similitud 0.1182</w:t>
+        <w:t>Robbins y Judge - Comportamiento organizacional - 17a ed - 2017.pdf — p. 427 — similitud 0.0992</w:t>
       </w:r>
     </w:p>
     <w:p>
@@ -2689,7 +2657,7 @@
         <w:ind w:left="360"/>
       </w:pPr>
       <w:r>
-        <w:t>“Chapter 16 Managerial Communication 533 C O N C E P T C H E C K 1. What are the major roles that managers play in communicating with employees?”</w:t>
+        <w:t>“Liderazgo CAPÍTULO 12 389 realizado para probar y respaldar la teoría han sido desalentadoras.15 ¿Por qué? Las explicaciones posibles incluyen ambigüedades internas e inconsistencias del propio modelo, así como problemas con la metodología de investigación.”</w:t>
       </w:r>
     </w:p>
     <w:p>
@@ -2697,7 +2665,7 @@
         <w:pStyle w:val="Heading3"/>
       </w:pPr>
       <w:r>
-        <w:t>bright-et-al-2019-principles-of-management-openstax.pdf — p. 538 — similitud 0.1179</w:t>
+        <w:t>Robbins y Judge - Comportamiento organizacional - 17a ed - 2017.pdf — p. 711 — similitud 0.0976</w:t>
       </w:r>
     </w:p>
     <w:p>
@@ -2705,7 +2673,7 @@
         <w:ind w:left="360"/>
       </w:pPr>
       <w:r>
-        <w:t>“Chapter 16 Managerial Communication 529 Social Influences Communication is a social process, as it takes at least two people to have a communication episode. There is a variety of social influences that can affect the accuracy of the intended message.”</w:t>
+        <w:t>“der Formas en las cuales los individuos convier- ten las bases del poder en acciones específicas. técnica del grupo nominal Método para tomar decisiones en grupo, en el cual los miembros se reúnen cara a cara para unifi- car sus juicios en forma sistemática pero independiente. tecnología La manera en que una organización convierte los insumos en productos. tendencia a confiar Probabilidad de que los empleados con- fíen en un líder. tendencia a la positividad Tendencia de la mayoría de los individuos a experimentar un estado de ánimo ligeramente positivo, si hay una aportación igual a cero (es decir, cuando no sucede nada en particular). teoría de la activación de los rasgos (TAR) Teoría que...”</w:t>
       </w:r>
     </w:p>
     <w:p>
@@ -2716,7 +2684,7 @@
         <w:t xml:space="preserve">Observación automática: </w:t>
       </w:r>
       <w:r>
-        <w:t>La ficha presenta coincidencias útiles, pero conviene revisar la pertinencia de cada cita. Se agruparon varias referencias dentro de la misma fuente.</w:t>
+        <w:t>La ficha presenta coincidencias débiles; se recomienda validar manualmente las citas. Se agruparon varias referencias dentro de la misma fuente.</w:t>
       </w:r>
     </w:p>
     <w:p>
@@ -2724,7 +2692,7 @@
         <w:pStyle w:val="Heading2"/>
       </w:pPr>
       <w:r>
-        <w:t>Ficha 17. communication</w:t>
+        <w:t>Ficha 17. unidad análisis</w:t>
       </w:r>
     </w:p>
     <w:p>
@@ -2735,7 +2703,7 @@
         <w:t xml:space="preserve">Fuentes: </w:t>
       </w:r>
       <w:r>
-        <w:t>bright-et-al-2019-principles-of-management-openstax.pdf</w:t>
+        <w:t>Robbins y Coulter - Administracion - 13a ed - 2018.pdf; Robbins y Judge - Comportamiento organizacional - 17a ed - 2017.pdf</w:t>
       </w:r>
     </w:p>
     <w:p>
@@ -2746,7 +2714,7 @@
         <w:t xml:space="preserve">Ubicaciones: </w:t>
       </w:r>
       <w:r>
-        <w:t>bright-et-al-2019-principles-of-management-openstax.pdf, p. 534; bright-et-al-2019-principles-of-management-openstax.pdf, p. 536; bright-et-al-2019-principles-of-management-openstax.pdf, p. 538; bright-et-al-2019-principles-of-management-openstax.pdf, p. 547; bright-et-al-2019-principles-of-management-openstax.pdf, p. 553; bright-et-al-2019-principles-of-management-openstax.pdf, p. 554; bright-et-al-2019-principles-of-management-openstax.pdf, p. 83</w:t>
+        <w:t>Robbins y Coulter - Administracion - 13a ed - 2018.pdf, p. 318; Robbins y Coulter - Administracion - 13a ed - 2018.pdf, p. 319; Robbins y Coulter - Administracion - 13a ed - 2018.pdf, p. 332; Robbins y Coulter - Administracion - 13a ed - 2018.pdf, p. 355; Robbins y Coulter - Administracion - 13a ed - 2018.pdf, p. 388; Robbins y Judge - Comportamiento organizacional - 17a ed - 2017.pdf, p. 31; Robbins y Judge - Comportamiento organizacional - 17a ed - 2017.pdf, p. 534</w:t>
       </w:r>
     </w:p>
     <w:p>
@@ -2754,7 +2722,7 @@
         <w:pStyle w:val="Heading3"/>
       </w:pPr>
       <w:r>
-        <w:t>bright-et-al-2019-principles-of-management-openstax.pdf — p. 554 — similitud 0.3742</w:t>
+        <w:t>Robbins y Coulter - Administracion - 13a ed - 2018.pdf — p. 319 — similitud 0.1046</w:t>
       </w:r>
     </w:p>
     <w:p>
@@ -2762,7 +2730,7 @@
         <w:ind w:left="360"/>
       </w:pPr>
       <w:r>
-        <w:t>“Chapter 16 Managerial Communication 545 communication processes involve people in different functions and that all functions need to operate effectively to achieve organizational objectives. Chapter Review Questions 1.”</w:t>
+        <w:t>“Para cumplirla, ha implementado una estrategia corporativa en sus diferentes líneas de negocio, incluyendo Pepsico Americas Beverage (bebidas), Pepsico Americas Foods (botanas y alimentos estrategia corporativa Estrategia organizacional que determina en qué líneas de negocio opera o desea operar la empresa y qué quiere lograr al participar en ellas Figura 9-3 Tipos de estrategias organizacionales Corporativa Corporación diversiﬁcada Competitiva Unidad estratégica Unidad estratégica Unidad estratégica de negocios 1 de negocios 2 de negocios 3 Funcional Investigación Recursos humanos Manufactura Marketing Finanzas y desarrollo”</w:t>
       </w:r>
     </w:p>
     <w:p>
@@ -2770,7 +2738,7 @@
         <w:pStyle w:val="Heading3"/>
       </w:pPr>
       <w:r>
-        <w:t>bright-et-al-2019-principles-of-management-openstax.pdf — p. 536 — similitud 0.2625</w:t>
+        <w:t>Robbins y Coulter - Administracion - 13a ed - 2018.pdf — p. 355 — similitud 0.1023</w:t>
       </w:r>
     </w:p>
     <w:p>
@@ -2778,7 +2746,7 @@
         <w:ind w:left="360"/>
       </w:pPr>
       <w:r>
-        <w:t>“Chapter 16 Managerial Communication 527 M A N A G E R I A L L E A D E R S H I P Dealing with Information Overload One of the challenges in many organizations is dealing with a deluge of emails, texts, voicemails, and other communication. Organizations have become flatter, outsourced many functions, and layered technology to speed communication with an integrated communication programs such as Slack, which allows users to manage all their communication and access shared resources in one place.”</w:t>
+        <w:t>“ANÁLISIS DE LA OPORTUNIDAD  En esta sección del plan de negocios, el emprendedor presenta los detalles de la oportunidad detectada. En esencia, estos detalles incluyen: 1. la eva- luación del mercado, a través de la descripción de los factores demográficos del mercado meta, 2. la descripción y evaluación de las tendencias de la industria, y 3. la identificación y evaluación de la competencia.”</w:t>
       </w:r>
     </w:p>
     <w:p>
@@ -2786,7 +2754,7 @@
         <w:pStyle w:val="Heading3"/>
       </w:pPr>
       <w:r>
-        <w:t>bright-et-al-2019-principles-of-management-openstax.pdf — p. 534 — similitud 0.2373</w:t>
+        <w:t>Robbins y Judge - Comportamiento organizacional - 17a ed - 2017.pdf — p. 534 — similitud 0.0999</w:t>
       </w:r>
     </w:p>
     <w:p>
@@ -2794,7 +2762,7 @@
         <w:ind w:left="360"/>
       </w:pPr>
       <w:r>
-        <w:t>“Chapter 16 Managerial Communication 525 Interpersonal communication is an important part of being an effective manager: • It influences the opinions, attitude, motivation, and behaviors of others. • It expresses our feelings, emotions, and intentions to others. • It is the vehicle for providing, receiving, and exchanging information regarding events or issues that concern us. • It reinforces the formal structure of the organization by such means as making use of formal channels of communication.”</w:t>
+        <w:t>“El principio de unidad del mando ayuda a conservar el concepto de una línea continua de auto- ridad, que establece que cada persona debería tener un único superior ante el cual es directamente responsable.”</w:t>
       </w:r>
     </w:p>
     <w:p>
@@ -2802,7 +2770,7 @@
         <w:pStyle w:val="Heading3"/>
       </w:pPr>
       <w:r>
-        <w:t>bright-et-al-2019-principles-of-management-openstax.pdf — p. 538 — similitud 0.2103</w:t>
+        <w:t>Robbins y Coulter - Administracion - 13a ed - 2018.pdf — p. 388 — similitud 0.0957</w:t>
       </w:r>
     </w:p>
     <w:p>
@@ -2810,7 +2778,7 @@
         <w:ind w:left="360"/>
       </w:pPr>
       <w:r>
-        <w:t>“Chapter 16 Managerial Communication 529 Social Influences Communication is a social process, as it takes at least two people to have a communication episode. There is a variety of social influences that can affect the accuracy of the intended message.”</w:t>
+        <w:t>“De igual manera, nadie debe considerarse responsable de aquellas tareas sobre cuya ejecución no tiene autoridad alguna. Por último, el principio de unidad de mando (uno de los 14 principios administrativos de Fayol; consulte la página 34, en el módulo de historia de la administración) establece que cada empleado debe reportarle únicamente a un gerente. De no haber unidad de mando, podrían surgir problemas debido a que varios jefes harían exigencias conflictivas entre sí. unidad de mando Principio administrativo según el cual cada empleado debe reportarle únicamente a un gerente”</w:t>
       </w:r>
     </w:p>
     <w:p>
@@ -2818,7 +2786,7 @@
         <w:pStyle w:val="Heading3"/>
       </w:pPr>
       <w:r>
-        <w:t>bright-et-al-2019-principles-of-management-openstax.pdf — p. 553 — similitud 0.2030</w:t>
+        <w:t>Robbins y Coulter - Administracion - 13a ed - 2018.pdf — p. 332 — similitud 0.0909</w:t>
       </w:r>
     </w:p>
     <w:p>
@@ -2826,7 +2794,7 @@
         <w:ind w:left="360"/>
       </w:pPr>
       <w:r>
-        <w:t>“544 Chapter 16 Managerial Communication Key Terms communicator The individual, group, or organization that needs or wants to share information with another individual, group, or organization. decoding Interpreting and understanding and making sense of a message. encoding Translating a message into symbols or language that a receiver can understand. figurehead role A necessary role for a manager who wants to inspire people within the organization to feel connected to each other and to the institution, to support the policies and decisions made on behalf of the organization, and to work harder for the good of the institution. interaction attentiveness/ interaction involvement A measure of how...”</w:t>
+        <w:t>“Los seis pasos del proceso de administración estratégica abarcan la planeación, la implementación y la evaluación de estrategias, y consisten en: 1. la identificación de la misión, las metas y las es­ trategias actuales de la organización; 2. la realización de un análisis externo; 3. la realización de un análisis interno (los pasos 2 y 3 en conjunto se denominan análisis FODA; 4. la formulación de estrategias; 5. la implementación de estrategias; y 6. la evaluación de las estrategias. Las fortalezas de la organización son aquellas actividades en cuya realización se destaca o los recursos únicos que tiene a su disposición.”</w:t>
       </w:r>
     </w:p>
     <w:p>
@@ -2834,7 +2802,7 @@
         <w:pStyle w:val="Heading3"/>
       </w:pPr>
       <w:r>
-        <w:t>bright-et-al-2019-principles-of-management-openstax.pdf — p. 547 — similitud 0.2002</w:t>
+        <w:t>Robbins y Coulter - Administracion - 13a ed - 2018.pdf — p. 318 — similitud 0.0880</w:t>
       </w:r>
     </w:p>
     <w:p>
@@ -2842,7 +2810,7 @@
         <w:ind w:left="360"/>
       </w:pPr>
       <w:r>
-        <w:t>“The advice for managers is simple: do not mail the first draft, and do not ever sign your name to a document you are not proud of. Communication Is Invention Without question, communication is a process of invention. Managers literally create meaning through communication.”</w:t>
+        <w:t>“fortalezas Cualquier actividad en cuya realización se destaca la organización o los recursos únicos que tiene a su disposición Una vez concluido el análisis interno, los gerentes deben ser capaces de identificar las forta­ lezas y las debilidades de la organización. Cualquier actividad en cuya realización se destaca la organización o los recursos únicos que tiene a su disposición, constituyen sus fortalezas.”</w:t>
       </w:r>
     </w:p>
     <w:p>
@@ -2850,7 +2818,7 @@
         <w:pStyle w:val="Heading3"/>
       </w:pPr>
       <w:r>
-        <w:t>bright-et-al-2019-principles-of-management-openstax.pdf — p. 553 — similitud 0.1842</w:t>
+        <w:t>Robbins y Judge - Comportamiento organizacional - 17a ed - 2017.pdf — p. 31 — similitud 0.0862</w:t>
       </w:r>
     </w:p>
     <w:p>
@@ -2858,7 +2826,7 @@
         <w:ind w:left="360"/>
       </w:pPr>
       <w:r>
-        <w:t>“Know the types of communications that occur in organizations. Interpersonal communication can be oral, written, or nonverbal. Body language refers to conveying messages to others through such techniques as facial expressions, posture, and eye movements.”</w:t>
+        <w:t>“PREFACIO xxix Capítulo 7: Conceptos de motivación ● Objetivos de aprendizaje revisados ● Nueva Viñeta inicial (Motivados hacia la responsabilidad social corporativa) ● Nueva investigación y análisis acerca de la teoría de la jerarquía de las necesidades ● Figura 7-1 actualizada (Jerarquía de necesidades de Maslow) ● Nueva investigación internacional y análisis sobre la teoría de las necesidades de McClelland ● Nueva sección: Objetivos de carrera (¿Por qué no siguen mi consejo?) ● Nueva investigación análisis sobre la teoría de la autodeterminación ● Nueva investigación internacional, análisis y organización en el tema de la teoría del establecimiento de metas ● Nueva sección...”</w:t>
       </w:r>
     </w:p>
     <w:p>
@@ -2866,7 +2834,7 @@
         <w:pStyle w:val="Heading3"/>
       </w:pPr>
       <w:r>
-        <w:t>bright-et-al-2019-principles-of-management-openstax.pdf — p. 83 — similitud 0.1835</w:t>
+        <w:t>Robbins y Judge - Comportamiento organizacional - 17a ed - 2017.pdf — p. 31 — similitud 0.0812</w:t>
       </w:r>
     </w:p>
     <w:p>
@@ -2874,7 +2842,7 @@
         <w:ind w:left="360"/>
       </w:pPr>
       <w:r>
-        <w:t>“Barnard defined a formal organization as consciously coordinated activities between two or more people but noted that such coordination is not likely to last for very long, a factor that may explain why many companies do not survive for long periods of time. Barnard believed that executives best exerted authority through communication and the use of incentives. Communication within an organization should include definite channels of communication, and workers should have access to knowledge and information.”</w:t>
+        <w:t>“● Nuevo caso 2 (La epidemia de somnolencia) Capítulo 8: Motivación: de los conceptos a las aplicaciones ● Nueva Viñeta inicial (Motivado a arriesgarlo todo) ● Figura 8-1 actualizada (El modelo de las características del puesto de trabajo) ● Nueva sección, investigación internacional y análisis acerca del modelo de las carac- terísticas del puesto de trabajo ● Nuevos estudios y análisis sobre la rotación de puestos ● Sección ¿Mito o ciencia? nueva/actualizada (El dinero no puede comprar la felicidad) ● Nueva sección e investigación sobre el diseño del puesto de trabajo por las relaciones ● Nueva investigación sobre los horarios flexibles ● Nuevos estudios acerca de los puestos compartidos ●...”</w:t>
       </w:r>
     </w:p>
     <w:p>
@@ -2885,1359 +2853,7 @@
         <w:t xml:space="preserve">Observación automática: </w:t>
       </w:r>
       <w:r>
-        <w:t>La ficha presenta una coincidencia fuerte con el concepto buscado. Se agruparon varias referencias dentro de la misma fuente.</w:t>
-      </w:r>
-    </w:p>
-    <w:p>
-      <w:pPr>
-        <w:pStyle w:val="Heading2"/>
-      </w:pPr>
-      <w:r>
-        <w:t>Ficha 18. that they</w:t>
-      </w:r>
-    </w:p>
-    <w:p>
-      <w:r>
-        <w:rPr>
-          <w:b/>
-        </w:rPr>
-        <w:t xml:space="preserve">Fuentes: </w:t>
-      </w:r>
-      <w:r>
-        <w:t>bright-et-al-2019-principles-of-management-openstax.pdf</w:t>
-      </w:r>
-    </w:p>
-    <w:p>
-      <w:r>
-        <w:rPr>
-          <w:b/>
-        </w:rPr>
-        <w:t xml:space="preserve">Ubicaciones: </w:t>
-      </w:r>
-      <w:r>
-        <w:t>bright-et-al-2019-principles-of-management-openstax.pdf, p. 31; bright-et-al-2019-principles-of-management-openstax.pdf, p. 328; bright-et-al-2019-principles-of-management-openstax.pdf, p. 331; bright-et-al-2019-principles-of-management-openstax.pdf, p. 375; bright-et-al-2019-principles-of-management-openstax.pdf, p. 426; bright-et-al-2019-principles-of-management-openstax.pdf, p. 434; bright-et-al-2019-principles-of-management-openstax.pdf, p. 484; bright-et-al-2019-principles-of-management-openstax.pdf, p. 514</w:t>
-      </w:r>
-    </w:p>
-    <w:p>
-      <w:pPr>
-        <w:pStyle w:val="Heading3"/>
-      </w:pPr>
-      <w:r>
-        <w:t>bright-et-al-2019-principles-of-management-openstax.pdf — p. 514 — similitud 0.2280</w:t>
-      </w:r>
-    </w:p>
-    <w:p>
-      <w:pPr>
-        <w:ind w:left="360"/>
-      </w:pPr>
-      <w:r>
-        <w:t>“Making the jump from individual contributor to manager is never easy, and it doesn’t take long for a new manager to realize that what got him there is much different than what is needed to be successful in the future. Individual contributors that have been recently promoted would probably say that they have strong technical skills in their area, and that they were very good at doing what they were doing. In a more savvy organization that recognizes leadership competencies, individual contributors would probably say that they have strong technical skills AND that they showed some behaviors and potential to lead others.”</w:t>
-      </w:r>
-    </w:p>
-    <w:p>
-      <w:pPr>
-        <w:pStyle w:val="Heading3"/>
-      </w:pPr>
-      <w:r>
-        <w:t>bright-et-al-2019-principles-of-management-openstax.pdf — p. 328 — similitud 0.1721</w:t>
-      </w:r>
-    </w:p>
-    <w:p>
-      <w:pPr>
-        <w:ind w:left="360"/>
-      </w:pPr>
-      <w:r>
-        <w:t>“For example, following the top-down approach, leaders might determine that the organizational structure needs to be reconfigured to better accommodate a significant shift in its business. They might assume that they can implement the new structure and that employee routines and patterns of behavior will then change in a natural progression. The bottom-up approach may reverse this logic.”</w:t>
-      </w:r>
-    </w:p>
-    <w:p>
-      <w:pPr>
-        <w:pStyle w:val="Heading3"/>
-      </w:pPr>
-      <w:r>
-        <w:t>bright-et-al-2019-principles-of-management-openstax.pdf — p. 484 — similitud 0.1715</w:t>
-      </w:r>
-    </w:p>
-    <w:p>
-      <w:pPr>
-        <w:ind w:left="360"/>
-      </w:pPr>
-      <w:r>
-        <w:t>“This means that many employees don’t know for certain how much their colleagues are paid. And, because most of us overestimate the pay of others, we tend to think that they’re paid more than they actually are, and the unjustified perceptions of inequity are perpetuated. The bottom line for employers is that they need to be sensitive to employees’ need for equity.”</w:t>
-      </w:r>
-    </w:p>
-    <w:p>
-      <w:pPr>
-        <w:pStyle w:val="Heading3"/>
-      </w:pPr>
-      <w:r>
-        <w:t>bright-et-al-2019-principles-of-management-openstax.pdf — p. 375 — similitud 0.1656</w:t>
-      </w:r>
-    </w:p>
-    <w:p>
-      <w:pPr>
-        <w:ind w:left="360"/>
-      </w:pPr>
-      <w:r>
-        <w:t>“experience, etc.) so that they can properly move from project to project yet maintain a role of a certain level. That level is then tied to a specific pay scale, so the same consultant will receive the same salary no matter which project he is on.”</w:t>
-      </w:r>
-    </w:p>
-    <w:p>
-      <w:pPr>
-        <w:pStyle w:val="Heading3"/>
-      </w:pPr>
-      <w:r>
-        <w:t>bright-et-al-2019-principles-of-management-openstax.pdf — p. 31 — similitud 0.1646</w:t>
-      </w:r>
-    </w:p>
-    <w:p>
-      <w:pPr>
-        <w:ind w:left="360"/>
-      </w:pPr>
-      <w:r>
-        <w:t>“22 Chapter 2 Managerial Decision-Making for a model in which they sold directly to consumers, they could provide high-quality luggage at more of a midrange ($200-$300) price. After considerable research, the two were convinced that they had an idea worth pursuing. Rubio and Korey settled on the company name “Away,” which is intended to invoke the pleasure that comes from travelling.”</w:t>
-      </w:r>
-    </w:p>
-    <w:p>
-      <w:pPr>
-        <w:pStyle w:val="Heading3"/>
-      </w:pPr>
-      <w:r>
-        <w:t>bright-et-al-2019-principles-of-management-openstax.pdf — p. 434 — similitud 0.1631</w:t>
-      </w:r>
-    </w:p>
-    <w:p>
-      <w:pPr>
-        <w:ind w:left="360"/>
-      </w:pPr>
-      <w:r>
-        <w:t>“performance, and encouraging the use of uniform procedures. After consideration and initiating structure behaviors were first identified, many leaders believed that they had to behave one way or the other. If they initiated structure, they could not be considerate, and vice versa.”</w:t>
-      </w:r>
-    </w:p>
-    <w:p>
-      <w:pPr>
-        <w:pStyle w:val="Heading3"/>
-      </w:pPr>
-      <w:r>
-        <w:t>bright-et-al-2019-principles-of-management-openstax.pdf — p. 426 — similitud 0.1578</w:t>
-      </w:r>
-    </w:p>
-    <w:p>
-      <w:pPr>
-        <w:ind w:left="360"/>
-      </w:pPr>
-      <w:r>
-        <w:t>“Chapter 13 Leadership 417 French and Raven provide us with a useful typology that identifies the sources and types of power that may be at the disposal of leaders: • Reward power—the power a person has because people believe that he can bestow rewards or outcomes, such as money or recognition that others desire • Coercive power—the power a person has because people believe that he can punish them by inflicting pain or by withholding or taking away something that they value • Referent power—the power a person has because others want to associate with or be accepted by him • Expert power—the power a person has because others believe that he has and is willing to share expert knowledge that...”</w:t>
-      </w:r>
-    </w:p>
-    <w:p>
-      <w:pPr>
-        <w:pStyle w:val="Heading3"/>
-      </w:pPr>
-      <w:r>
-        <w:t>bright-et-al-2019-principles-of-management-openstax.pdf — p. 331 — similitud 0.1522</w:t>
-      </w:r>
-    </w:p>
-    <w:p>
-      <w:pPr>
-        <w:ind w:left="360"/>
-      </w:pPr>
-      <w:r>
-        <w:t>“That’s been her area of expertise throughout her professional life. At JPMorgan Chase she endured nine different mergers, and her job was to help her employees prepare for change. “Most people aren’t comfortable with change, and often when they say that, what they really mean is that they are comfortable with change, but they aren’t comfortable with change happening to them,” she said. “It’s all about what happens to us, so how as a leader do you help people get through that? “We may not be able to control that fan and that microcosm of society that is over-indexed in our sport,” she said. “Over time it will change as we introduce new fans, and guess what?”</w:t>
-      </w:r>
-    </w:p>
-    <w:p>
-      <w:r>
-        <w:rPr>
-          <w:b/>
-        </w:rPr>
-        <w:t xml:space="preserve">Observación automática: </w:t>
-      </w:r>
-      <w:r>
-        <w:t>La ficha presenta coincidencias útiles, pero conviene revisar la pertinencia de cada cita. Se agruparon varias referencias dentro de la misma fuente.</w:t>
-      </w:r>
-    </w:p>
-    <w:p>
-      <w:pPr>
-        <w:pStyle w:val="Heading2"/>
-      </w:pPr>
-      <w:r>
-        <w:t>Ficha 19. international</w:t>
-      </w:r>
-    </w:p>
-    <w:p>
-      <w:r>
-        <w:rPr>
-          <w:b/>
-        </w:rPr>
-        <w:t xml:space="preserve">Fuentes: </w:t>
-      </w:r>
-      <w:r>
-        <w:t>bright-et-al-2019-principles-of-management-openstax.pdf</w:t>
-      </w:r>
-    </w:p>
-    <w:p>
-      <w:r>
-        <w:rPr>
-          <w:b/>
-        </w:rPr>
-        <w:t xml:space="preserve">Ubicaciones: </w:t>
-      </w:r>
-      <w:r>
-        <w:t>bright-et-al-2019-principles-of-management-openstax.pdf, p. 168; bright-et-al-2019-principles-of-management-openstax.pdf, p. 199; bright-et-al-2019-principles-of-management-openstax.pdf, p. 207; bright-et-al-2019-principles-of-management-openstax.pdf, p. 209; bright-et-al-2019-principles-of-management-openstax.pdf, p. 211; bright-et-al-2019-principles-of-management-openstax.pdf, p. 309</w:t>
-      </w:r>
-    </w:p>
-    <w:p>
-      <w:pPr>
-        <w:pStyle w:val="Heading3"/>
-      </w:pPr>
-      <w:r>
-        <w:t>bright-et-al-2019-principles-of-management-openstax.pdf — p. 168 — similitud 0.2785</w:t>
-      </w:r>
-    </w:p>
-    <w:p>
-      <w:pPr>
-        <w:ind w:left="360"/>
-      </w:pPr>
-      <w:r>
-        <w:t>“India, have coworkers from Egypt, Brazil, or Germany, or have to negotiate with someone from Russia. This chapter will prepare you for the complexities of international management by discussing some of the crucial issues faced by managers of international companies today. The chapter begins by discussing some of the key factors in making the business world global today and why an understanding of international management is so critical.”</w:t>
-      </w:r>
-    </w:p>
-    <w:p>
-      <w:pPr>
-        <w:pStyle w:val="Heading3"/>
-      </w:pPr>
-      <w:r>
-        <w:t>bright-et-al-2019-principles-of-management-openstax.pdf — p. 199 — similitud 0.2017</w:t>
-      </w:r>
-    </w:p>
-    <w:p>
-      <w:pPr>
-        <w:ind w:left="360"/>
-      </w:pPr>
-      <w:r>
-        <w:t>“190 Chapter 6 International Management implement them. As we have seen so many times before, each method for entering international markets has its advantages and disadvantages, and it is up to the international management team to figure out which is most suitable for its company and for the countries in which it operates.”</w:t>
-      </w:r>
-    </w:p>
-    <w:p>
-      <w:pPr>
-        <w:pStyle w:val="Heading3"/>
-      </w:pPr>
-      <w:r>
-        <w:t>bright-et-al-2019-principles-of-management-openstax.pdf — p. 199 — similitud 0.1963</w:t>
-      </w:r>
-    </w:p>
-    <w:p>
-      <w:pPr>
-        <w:ind w:left="360"/>
-      </w:pPr>
-      <w:r>
-        <w:t>“In fact, some companies may find that exporting is so critical that they create a dedicated export department. Because exporting is one of the easiest ways to go international, it can bring many benefits.36 Current research suggests that companies that export tend to be 17% more profitable than companies that don’t. Additionally, exporting provides the ability for companies to defend their markets by becoming more competitive in other markets.”</w:t>
-      </w:r>
-    </w:p>
-    <w:p>
-      <w:pPr>
-        <w:pStyle w:val="Heading3"/>
-      </w:pPr>
-      <w:r>
-        <w:t>bright-et-al-2019-principles-of-management-openstax.pdf — p. 209 — similitud 0.1764</w:t>
-      </w:r>
-    </w:p>
-    <w:p>
-      <w:pPr>
-        <w:ind w:left="360"/>
-      </w:pPr>
-      <w:r>
-        <w:t>“Social stratification Degree to which social benefits are unequally distributed; those patterns are perpetuated for life. Tariffs Extra charges that are added to the price of international products in the form of additional taxes or higher prices as a way to give domestic companies a price advantage while also protecting these companies from foreign competition. Trade agreements Popular policy instruments that countries agree on to eliminate cross-border barriers to trade and to promote global integration.”</w:t>
-      </w:r>
-    </w:p>
-    <w:p>
-      <w:pPr>
-        <w:pStyle w:val="Heading3"/>
-      </w:pPr>
-      <w:r>
-        <w:t>bright-et-al-2019-principles-of-management-openstax.pdf — p. 211 — similitud 0.1747</w:t>
-      </w:r>
-    </w:p>
-    <w:p>
-      <w:pPr>
-        <w:ind w:left="360"/>
-      </w:pPr>
-      <w:r>
-        <w:t>“202 Chapter 6 International Management about various types of training: low-rigor training (where individuals are exposed to critical information but are not necessarily actively engaged in their learning) and high-rigor training (methods of training where participants are much more actively engaged in the training process). You also learned that multinationals can also provide training before someone goes on an international assignment or while someone is already on the assignment.”</w:t>
-      </w:r>
-    </w:p>
-    <w:p>
-      <w:pPr>
-        <w:pStyle w:val="Heading3"/>
-      </w:pPr>
-      <w:r>
-        <w:t>bright-et-al-2019-principles-of-management-openstax.pdf — p. 309 — similitud 0.1746</w:t>
-      </w:r>
-    </w:p>
-    <w:p>
-      <w:pPr>
-        <w:ind w:left="360"/>
-      </w:pPr>
-      <w:r>
-        <w:t>“Corporate CEOs use the BCG Matrix to evaluate their portfolio of businesses and use corporate actions like acquisitions to make significant changes to their companies. International strategy can be combined with either of the previous two strategies to incorporate international operations into a business or corporation. International strategy answers questions of what country or countries to operate in and how to be successful in foreign operations.”</w:t>
-      </w:r>
-    </w:p>
-    <w:p>
-      <w:pPr>
-        <w:pStyle w:val="Heading3"/>
-      </w:pPr>
-      <w:r>
-        <w:t>bright-et-al-2019-principles-of-management-openstax.pdf — p. 211 — similitud 0.1739</w:t>
-      </w:r>
-    </w:p>
-    <w:p>
-      <w:pPr>
-        <w:ind w:left="360"/>
-      </w:pPr>
-      <w:r>
-        <w:t>“Why might it be necessary for a company to go international, and how might it accomplish this goal? In the final section of the chapter, you first read about the need for companies to go international and learned that some markets present strong potential while others have floundered.”</w:t>
-      </w:r>
-    </w:p>
-    <w:p>
-      <w:pPr>
-        <w:pStyle w:val="Heading3"/>
-      </w:pPr>
-      <w:r>
-        <w:t>bright-et-al-2019-principles-of-management-openstax.pdf — p. 207 — similitud 0.1724</w:t>
-      </w:r>
-    </w:p>
-    <w:p>
-      <w:pPr>
-        <w:ind w:left="360"/>
-      </w:pPr>
-      <w:r>
-        <w:t>“198 Chapter 6 International Management resources in the form of local reputation or the availability of a local branch network to offer services, the more likely the company was to use joint ventures or acquisitions as forms of international entry. If a bank wanted to have greater control in terms of being able to manage its activities to achieve its goals, it would be more likely to acquire local firms.”</w:t>
-      </w:r>
-    </w:p>
-    <w:p>
-      <w:r>
-        <w:rPr>
-          <w:b/>
-        </w:rPr>
-        <w:t xml:space="preserve">Observación automática: </w:t>
-      </w:r>
-      <w:r>
-        <w:t>La ficha presenta coincidencias útiles, pero conviene revisar la pertinencia de cada cita. Se agruparon varias referencias dentro de la misma fuente.</w:t>
-      </w:r>
-    </w:p>
-    <w:p>
-      <w:pPr>
-        <w:pStyle w:val="Heading2"/>
-      </w:pPr>
-      <w:r>
-        <w:t>Ficha 20. structures</w:t>
-      </w:r>
-    </w:p>
-    <w:p>
-      <w:r>
-        <w:rPr>
-          <w:b/>
-        </w:rPr>
-        <w:t xml:space="preserve">Fuentes: </w:t>
-      </w:r>
-      <w:r>
-        <w:t>bright-et-al-2019-principles-of-management-openstax.pdf</w:t>
-      </w:r>
-    </w:p>
-    <w:p>
-      <w:r>
-        <w:rPr>
-          <w:b/>
-        </w:rPr>
-        <w:t xml:space="preserve">Ubicaciones: </w:t>
-      </w:r>
-      <w:r>
-        <w:t>bright-et-al-2019-principles-of-management-openstax.pdf, p. 101; bright-et-al-2019-principles-of-management-openstax.pdf, p. 102; bright-et-al-2019-principles-of-management-openstax.pdf, p. 123; bright-et-al-2019-principles-of-management-openstax.pdf, p. 124; bright-et-al-2019-principles-of-management-openstax.pdf, p. 339; bright-et-al-2019-principles-of-management-openstax.pdf, p. 342; bright-et-al-2019-principles-of-management-openstax.pdf, p. 343</w:t>
-      </w:r>
-    </w:p>
-    <w:p>
-      <w:pPr>
-        <w:pStyle w:val="Heading3"/>
-      </w:pPr>
-      <w:r>
-        <w:t>bright-et-al-2019-principles-of-management-openstax.pdf — p. 343 — similitud 0.2845</w:t>
-      </w:r>
-    </w:p>
-    <w:p>
-      <w:pPr>
-        <w:ind w:left="360"/>
-      </w:pPr>
-      <w:r>
-        <w:t>“334 Chapter 10 Organizational Structure and Change called “tall” structures due to the presence of many levels of management. Summary of Learning Outcomes 10.1 Organizational Structures and Design 1.”</w:t>
-      </w:r>
-    </w:p>
-    <w:p>
-      <w:pPr>
-        <w:pStyle w:val="Heading3"/>
-      </w:pPr>
-      <w:r>
-        <w:t>bright-et-al-2019-principles-of-management-openstax.pdf — p. 101 — similitud 0.2331</w:t>
-      </w:r>
-    </w:p>
-    <w:p>
-      <w:pPr>
-        <w:ind w:left="360"/>
-      </w:pPr>
-      <w:r>
-        <w:t>“However, not every organization or every part of most organizations may require an organic type of structure. Understanding different organizational designs and structures is important to discern when, where, and under what circumstances a type of mechanistic system or part of an organization would be needed. The following section discusses five types of structures with variations.”</w:t>
-      </w:r>
-    </w:p>
-    <w:p>
-      <w:pPr>
-        <w:pStyle w:val="Heading3"/>
-      </w:pPr>
-      <w:r>
-        <w:t>bright-et-al-2019-principles-of-management-openstax.pdf — p. 123 — similitud 0.2120</w:t>
-      </w:r>
-    </w:p>
-    <w:p>
-      <w:pPr>
-        <w:ind w:left="360"/>
-      </w:pPr>
-      <w:r>
-        <w:t>“There are small and large organizations that face environments that are either stable of unstable and managing the organization by recognizing their environment is a crucial skill. 4.3 Organizational Designs and Structures 3. Identify different types of organizational structures, and their strengths and weaknesses An understanding of Mechanistic vs Organic Structures and Systems and how they differ and how these major concepts help classify different organizational structures is crucial to recognizing organizational structures.”</w:t>
-      </w:r>
-    </w:p>
-    <w:p>
-      <w:pPr>
-        <w:pStyle w:val="Heading3"/>
-      </w:pPr>
-      <w:r>
-        <w:t>bright-et-al-2019-principles-of-management-openstax.pdf — p. 102 — similitud 0.2106</w:t>
-      </w:r>
-    </w:p>
-    <w:p>
-      <w:pPr>
-        <w:ind w:left="360"/>
-      </w:pPr>
-      <w:r>
-        <w:t>“Chapter 4 External and Internal Organizational Environments and Corporate Culture 93 so-called silos and walls of organizations opened up; everything could not be or did not have to be produced within the confines of an organization, especially if corporations were cutting costs and outsourcing different functions of products to save costs. During this period, further extensions of the horizontal and organic types of structures evolved: the divisional, matrix, global geographic, modular, team-based, and virtual structures were created.”</w:t>
-      </w:r>
-    </w:p>
-    <w:p>
-      <w:pPr>
-        <w:pStyle w:val="Heading3"/>
-      </w:pPr>
-      <w:r>
-        <w:t>bright-et-al-2019-principles-of-management-openstax.pdf — p. 124 — similitud 0.2057</w:t>
-      </w:r>
-    </w:p>
-    <w:p>
-      <w:pPr>
-        <w:ind w:left="360"/>
-      </w:pPr>
-      <w:r>
-        <w:t>“What are some advantages and disadvantages of divisional structures? 10.”</w:t>
-      </w:r>
-    </w:p>
-    <w:p>
-      <w:pPr>
-        <w:pStyle w:val="Heading3"/>
-      </w:pPr>
-      <w:r>
-        <w:t>bright-et-al-2019-principles-of-management-openstax.pdf — p. 342 — similitud 0.1952</w:t>
-      </w:r>
-    </w:p>
-    <w:p>
-      <w:pPr>
-        <w:ind w:left="360"/>
-      </w:pPr>
-      <w:r>
-        <w:t>“disruption to some underlying aspect of the organization, its processes, or its structures. unplanned change An unintentional activity that is usually the result of informal organizing. vertical organizational structure Organizational structures found in large mechanistic organizations; also”</w:t>
-      </w:r>
-    </w:p>
-    <w:p>
-      <w:pPr>
-        <w:pStyle w:val="Heading3"/>
-      </w:pPr>
-      <w:r>
-        <w:t>bright-et-al-2019-principles-of-management-openstax.pdf — p. 124 — similitud 0.1826</w:t>
-      </w:r>
-    </w:p>
-    <w:p>
-      <w:pPr>
-        <w:ind w:left="360"/>
-      </w:pPr>
-      <w:r>
-        <w:t>“Chapter Review Questions 1. Explain how several current environmental forces are affecting and will affect organizations and organizational structures’ effectiveness and efficiency in the near future? 2.”</w:t>
-      </w:r>
-    </w:p>
-    <w:p>
-      <w:pPr>
-        <w:pStyle w:val="Heading3"/>
-      </w:pPr>
-      <w:r>
-        <w:t>bright-et-al-2019-principles-of-management-openstax.pdf — p. 339 — similitud 0.1759</w:t>
-      </w:r>
-    </w:p>
-    <w:p>
-      <w:pPr>
-        <w:ind w:left="360"/>
-      </w:pPr>
-      <w:r>
-        <w:t>“Appreciative inquiry is one method that works especially well to accomplish all these impacts. In addition, leaders may also influence the structures that shape patterns of self-organizing. From a CAS perspective, a structure is anything that causes people to engage in a particular pattern of activity.”</w:t>
-      </w:r>
-    </w:p>
-    <w:p>
-      <w:r>
-        <w:rPr>
-          <w:b/>
-        </w:rPr>
-        <w:t xml:space="preserve">Observación automática: </w:t>
-      </w:r>
-      <w:r>
-        <w:t>La ficha presenta una coincidencia fuerte con el concepto buscado. Se agruparon varias referencias dentro de la misma fuente.</w:t>
-      </w:r>
-    </w:p>
-    <w:p>
-      <w:pPr>
-        <w:pStyle w:val="Heading2"/>
-      </w:pPr>
-      <w:r>
-        <w:t>Ficha 21. innovation</w:t>
-      </w:r>
-    </w:p>
-    <w:p>
-      <w:r>
-        <w:rPr>
-          <w:b/>
-        </w:rPr>
-        <w:t xml:space="preserve">Fuentes: </w:t>
-      </w:r>
-      <w:r>
-        <w:t>bright-et-al-2019-principles-of-management-openstax.pdf</w:t>
-      </w:r>
-    </w:p>
-    <w:p>
-      <w:r>
-        <w:rPr>
-          <w:b/>
-        </w:rPr>
-        <w:t xml:space="preserve">Ubicaciones: </w:t>
-      </w:r>
-      <w:r>
-        <w:t>bright-et-al-2019-principles-of-management-openstax.pdf, p. 606; bright-et-al-2019-principles-of-management-openstax.pdf, p. 624; bright-et-al-2019-principles-of-management-openstax.pdf, p. 625; bright-et-al-2019-principles-of-management-openstax.pdf, p. 626; bright-et-al-2019-principles-of-management-openstax.pdf, p. 627; bright-et-al-2019-principles-of-management-openstax.pdf, p. 666</w:t>
-      </w:r>
-    </w:p>
-    <w:p>
-      <w:pPr>
-        <w:pStyle w:val="Heading3"/>
-      </w:pPr>
-      <w:r>
-        <w:t>bright-et-al-2019-principles-of-management-openstax.pdf — p. 625 — similitud 0.2841</w:t>
-      </w:r>
-    </w:p>
-    <w:p>
-      <w:pPr>
-        <w:ind w:left="360"/>
-      </w:pPr>
-      <w:r>
-        <w:t>“Management of technology and innovation is critical to the organization. Because of innovations and new technologies, we have historically seen the emergence of innovative organizational structures and new ways of performing work.”</w:t>
-      </w:r>
-    </w:p>
-    <w:p>
-      <w:pPr>
-        <w:pStyle w:val="Heading3"/>
-      </w:pPr>
-      <w:r>
-        <w:t>bright-et-al-2019-principles-of-management-openstax.pdf — p. 625 — similitud 0.2542</w:t>
-      </w:r>
-    </w:p>
-    <w:p>
-      <w:pPr>
-        <w:ind w:left="360"/>
-      </w:pPr>
-      <w:r>
-        <w:t>“616 Chapter 18 Management of Technology and Innovation Key Terms entrepreneurial activities The implementation of new ventures and idea generation in organizations. explicit knowledge Information codified or written down as rules or guidelines. followship The process of seeking or accepting influence. formal and informal contracts Used to allow firms to share technology between each other. franchise agreements Long-term agreements that involve long payoffs for the sharing of known technology. innovation Invention, new product development, and process-improvement methods are all examples of innovation. joint ventures Long-term alliances that involve the creation of a new entity to...”</w:t>
-      </w:r>
-    </w:p>
-    <w:p>
-      <w:pPr>
-        <w:pStyle w:val="Heading3"/>
-      </w:pPr>
-      <w:r>
-        <w:t>bright-et-al-2019-principles-of-management-openstax.pdf — p. 606 — similitud 0.2387</w:t>
-      </w:r>
-    </w:p>
-    <w:p>
-      <w:pPr>
-        <w:ind w:left="360"/>
-      </w:pPr>
-      <w:r>
-        <w:t>“18 Management of Technology and Innovation Exhibit 18.1 (Credit: 6eo tech/ flickr/ Attribution 2.0 Generic (CC BY 2.0)) Introduction Learning Outcome After reading this chapter, you should be able to answer these questions: 1. What do we mean by management of technology and innovation (MTI), and why is it crucial?”</w:t>
-      </w:r>
-    </w:p>
-    <w:p>
-      <w:pPr>
-        <w:pStyle w:val="Heading3"/>
-      </w:pPr>
-      <w:r>
-        <w:t>bright-et-al-2019-principles-of-management-openstax.pdf — p. 627 — similitud 0.2326</w:t>
-      </w:r>
-    </w:p>
-    <w:p>
-      <w:pPr>
-        <w:ind w:left="360"/>
-      </w:pPr>
-      <w:r>
-        <w:t>“618 Chapter 18 Management of Technology and Innovation Chapter Review Questions 1. How do we define technology and innovation, and how are they related?”</w:t>
-      </w:r>
-    </w:p>
-    <w:p>
-      <w:pPr>
-        <w:pStyle w:val="Heading3"/>
-      </w:pPr>
-      <w:r>
-        <w:t>bright-et-al-2019-principles-of-management-openstax.pdf — p. 626 — similitud 0.2159</w:t>
-      </w:r>
-    </w:p>
-    <w:p>
-      <w:pPr>
-        <w:ind w:left="360"/>
-      </w:pPr>
-      <w:r>
-        <w:t>“The most common types of external processes used to enhance technology and innovation in a firm include: mergers/acquisitions (M&amp;A), joint ventures, franchise agreements, licensing agreements, and formal and informal contracts. 18.4 Internal Sources of Technology and Innovation 4.”</w:t>
-      </w:r>
-    </w:p>
-    <w:p>
-      <w:pPr>
-        <w:pStyle w:val="Heading3"/>
-      </w:pPr>
-      <w:r>
-        <w:t>bright-et-al-2019-principles-of-management-openstax.pdf — p. 624 — similitud 0.2144</w:t>
-      </w:r>
-    </w:p>
-    <w:p>
-      <w:pPr>
-        <w:ind w:left="360"/>
-      </w:pPr>
-      <w:r>
-        <w:t>“Chapter 18 Management of Technology and Innovation 615 C O N C E P T C H E C K 1. What is organizational learning?”</w:t>
-      </w:r>
-    </w:p>
-    <w:p>
-      <w:pPr>
-        <w:pStyle w:val="Heading3"/>
-      </w:pPr>
-      <w:r>
-        <w:t>bright-et-al-2019-principles-of-management-openstax.pdf — p. 666 — similitud 0.1876</w:t>
-      </w:r>
-    </w:p>
-    <w:p>
-      <w:pPr>
-        <w:ind w:left="360"/>
-      </w:pPr>
-      <w:r>
-        <w:t>“MTI—Its Importance Now and In the Future 1. Brockhoff, K (2017). “The emergence of technology and innovation.” Technology and Innovation Vol 19. Pp.”</w:t>
-      </w:r>
-    </w:p>
-    <w:p>
-      <w:pPr>
-        <w:pStyle w:val="Heading3"/>
-      </w:pPr>
-      <w:r>
-        <w:t>bright-et-al-2019-principles-of-management-openstax.pdf — p. 626 — similitud 0.1875</w:t>
-      </w:r>
-    </w:p>
-    <w:p>
-      <w:pPr>
-        <w:ind w:left="360"/>
-      </w:pPr>
-      <w:r>
-        <w:t>“Chapter 18 Management of Technology and Innovation 617 There are four things the firm should do to balance the conflicting demands of being agile in a dynamic environment. These are: design systems and processes, identify communication needs and efficiently turn data into information, develop employees through training and learning, and use good change management processes.”</w:t>
-      </w:r>
-    </w:p>
-    <w:p>
-      <w:r>
-        <w:rPr>
-          <w:b/>
-        </w:rPr>
-        <w:t xml:space="preserve">Observación automática: </w:t>
-      </w:r>
-      <w:r>
-        <w:t>La ficha presenta una coincidencia fuerte con el concepto buscado. Se agruparon varias referencias dentro de la misma fuente.</w:t>
-      </w:r>
-    </w:p>
-    <w:p>
-      <w:pPr>
-        <w:pStyle w:val="Heading2"/>
-      </w:pPr>
-      <w:r>
-        <w:t>Ficha 22. understand</w:t>
-      </w:r>
-    </w:p>
-    <w:p>
-      <w:r>
-        <w:rPr>
-          <w:b/>
-        </w:rPr>
-        <w:t xml:space="preserve">Fuentes: </w:t>
-      </w:r>
-      <w:r>
-        <w:t>bright-et-al-2019-principles-of-management-openstax.pdf</w:t>
-      </w:r>
-    </w:p>
-    <w:p>
-      <w:r>
-        <w:rPr>
-          <w:b/>
-        </w:rPr>
-        <w:t xml:space="preserve">Ubicaciones: </w:t>
-      </w:r>
-      <w:r>
-        <w:t>bright-et-al-2019-principles-of-management-openstax.pdf, p. 123; bright-et-al-2019-principles-of-management-openstax.pdf, p. 210; bright-et-al-2019-principles-of-management-openstax.pdf, p. 258; bright-et-al-2019-principles-of-management-openstax.pdf, p. 343; bright-et-al-2019-principles-of-management-openstax.pdf, p. 36; bright-et-al-2019-principles-of-management-openstax.pdf, p. 459; bright-et-al-2019-principles-of-management-openstax.pdf, p. 523; bright-et-al-2019-principles-of-management-openstax.pdf, p. 558</w:t>
-      </w:r>
-    </w:p>
-    <w:p>
-      <w:pPr>
-        <w:pStyle w:val="Heading3"/>
-      </w:pPr>
-      <w:r>
-        <w:t>bright-et-al-2019-principles-of-management-openstax.pdf — p. 210 — similitud 0.1440</w:t>
-      </w:r>
-    </w:p>
-    <w:p>
-      <w:pPr>
-        <w:ind w:left="360"/>
-      </w:pPr>
-      <w:r>
-        <w:t>“What steps can you undertake to be better prepared for cross-cultural assignments? While the above sections provided you with many diagnostic tools to understand how to evaluate cross- cultural differences, this section presented you with the ways to prepare for cross-cultural assignments. The goal of any training is to increase cultural intelligence, the ability to function and manage effectively in culturally diverse settings.”</w:t>
-      </w:r>
-    </w:p>
-    <w:p>
-      <w:pPr>
-        <w:pStyle w:val="Heading3"/>
-      </w:pPr>
-      <w:r>
-        <w:t>bright-et-al-2019-principles-of-management-openstax.pdf — p. 343 — similitud 0.1432</w:t>
-      </w:r>
-    </w:p>
-    <w:p>
-      <w:pPr>
-        <w:ind w:left="360"/>
-      </w:pPr>
-      <w:r>
-        <w:t>“It is often said that the only constant is change. Managers need to have the ability to understand the dimensions of change, know what drives change, and know how to implement changes to meet and exceed organizational goals. The three types of change are structural, technological, and culture changes.”</w:t>
-      </w:r>
-    </w:p>
-    <w:p>
-      <w:pPr>
-        <w:pStyle w:val="Heading3"/>
-      </w:pPr>
-      <w:r>
-        <w:t>bright-et-al-2019-principles-of-management-openstax.pdf — p. 258 — similitud 0.1406</w:t>
-      </w:r>
-    </w:p>
-    <w:p>
-      <w:pPr>
-        <w:ind w:left="360"/>
-      </w:pPr>
-      <w:r>
-        <w:t>“What is strategic analysis, and why do firms need to analyze their competitive environment? Strategic analysis is the process that firms use to study and understand the many different layers and aspects of their competitive environment. Why do firms spend time and money trying to understand what is going on around them?”</w:t>
-      </w:r>
-    </w:p>
-    <w:p>
-      <w:pPr>
-        <w:pStyle w:val="Heading3"/>
-      </w:pPr>
-      <w:r>
-        <w:t>bright-et-al-2019-principles-of-management-openstax.pdf — p. 36 — similitud 0.1388</w:t>
-      </w:r>
-    </w:p>
-    <w:p>
-      <w:pPr>
-        <w:ind w:left="360"/>
-      </w:pPr>
-      <w:r>
-        <w:t>“For this reason, the concept of emotional intelligence has become popular as a characteristic of effective managers. Emotional intelligence is the ability to recognize, understand, pay attention to, and manage one’s own emotions and the emotions of others. It involves self-awareness and self-regulation—essentially, this is a toggling back and forth between emotions and logic so that we analyze and understand our own emotions and then exert the necessary control to manage them as appropriate for the situation.”</w:t>
-      </w:r>
-    </w:p>
-    <w:p>
-      <w:pPr>
-        <w:pStyle w:val="Heading3"/>
-      </w:pPr>
-      <w:r>
-        <w:t>bright-et-al-2019-principles-of-management-openstax.pdf — p. 523 — similitud 0.1367</w:t>
-      </w:r>
-    </w:p>
-    <w:p>
-      <w:pPr>
-        <w:ind w:left="360"/>
-      </w:pPr>
-      <w:r>
-        <w:t>“With mutual learning, global colleagues learn from each other and absorb the new culture and behaviors through listening and observation. In mutual understanding, you try to understand the logic and cultural behaviors of the new culture to understand why people are doing what they do. This, of course, requires suspending judgment and trying to understand and embrace the differences.”</w:t>
-      </w:r>
-    </w:p>
-    <w:p>
-      <w:pPr>
-        <w:pStyle w:val="Heading3"/>
-      </w:pPr>
-      <w:r>
-        <w:t>bright-et-al-2019-principles-of-management-openstax.pdf — p. 123 — similitud 0.1302</w:t>
-      </w:r>
-    </w:p>
-    <w:p>
-      <w:pPr>
-        <w:ind w:left="360"/>
-      </w:pPr>
-      <w:r>
-        <w:t>“You should be able to discuss the evolution of different types of Organizational Structures. You should understand and identify the six types of organizational structures, and the advantages and disadvantages of each: Functional, Divisional, Matrix, Geographic, Networked Team, and Virtual. 4.4 The Internal Organization and External Environments 4.”</w:t>
-      </w:r>
-    </w:p>
-    <w:p>
-      <w:pPr>
-        <w:pStyle w:val="Heading3"/>
-      </w:pPr>
-      <w:r>
-        <w:t>bright-et-al-2019-principles-of-management-openstax.pdf — p. 459 — similitud 0.1278</w:t>
-      </w:r>
-    </w:p>
-    <w:p>
-      <w:pPr>
-        <w:ind w:left="360"/>
-      </w:pPr>
-      <w:r>
-        <w:t>“issue to employers because organizations with high-performing employees will almost always be more effective. To better understand why people perform at different levels, researchers consider the major determinants of performance: ability, effort (motivation), accurate role perceptions, and environmental factors (see Exhibit 14.2). Each performance determinant is important, and a deficit in one can seriously affect the others.”</w:t>
-      </w:r>
-    </w:p>
-    <w:p>
-      <w:pPr>
-        <w:pStyle w:val="Heading3"/>
-      </w:pPr>
-      <w:r>
-        <w:t>bright-et-al-2019-principles-of-management-openstax.pdf — p. 558 — similitud 0.1265</w:t>
-      </w:r>
-    </w:p>
-    <w:p>
-      <w:pPr>
-        <w:ind w:left="360"/>
-      </w:pPr>
-      <w:r>
-        <w:t>“17 Organizational Planning and Controlling Exhibit 17.1 (Credit: marcusrg/ flickr/ Attribution 2.0 Generic (CC BY 2.0)) Introduction Learning Outcomes After reading this chapter, you should be able to answer these questions: 1. Understand the importance of planning and why organizations need to plan and control. 2.”</w:t>
-      </w:r>
-    </w:p>
-    <w:p>
-      <w:r>
-        <w:rPr>
-          <w:b/>
-        </w:rPr>
-        <w:t xml:space="preserve">Observación automática: </w:t>
-      </w:r>
-      <w:r>
-        <w:t>La ficha presenta coincidencias útiles, pero conviene revisar la pertinencia de cada cita. Se agruparon varias referencias dentro de la misma fuente.</w:t>
-      </w:r>
-    </w:p>
-    <w:p>
-      <w:pPr>
-        <w:pStyle w:val="Heading2"/>
-      </w:pPr>
-      <w:r>
-        <w:t>Ficha 23. competitive</w:t>
-      </w:r>
-    </w:p>
-    <w:p>
-      <w:r>
-        <w:rPr>
-          <w:b/>
-        </w:rPr>
-        <w:t xml:space="preserve">Fuentes: </w:t>
-      </w:r>
-      <w:r>
-        <w:t>bright-et-al-2019-principles-of-management-openstax.pdf</w:t>
-      </w:r>
-    </w:p>
-    <w:p>
-      <w:r>
-        <w:rPr>
-          <w:b/>
-        </w:rPr>
-        <w:t xml:space="preserve">Ubicaciones: </w:t>
-      </w:r>
-      <w:r>
-        <w:t>bright-et-al-2019-principles-of-management-openstax.pdf, p. 258; bright-et-al-2019-principles-of-management-openstax.pdf, p. 279; bright-et-al-2019-principles-of-management-openstax.pdf, p. 280; bright-et-al-2019-principles-of-management-openstax.pdf, p. 282; bright-et-al-2019-principles-of-management-openstax.pdf, p. 283; bright-et-al-2019-principles-of-management-openstax.pdf, p. 287; bright-et-al-2019-principles-of-management-openstax.pdf, p. 292</w:t>
-      </w:r>
-    </w:p>
-    <w:p>
-      <w:pPr>
-        <w:pStyle w:val="Heading3"/>
-      </w:pPr>
-      <w:r>
-        <w:t>bright-et-al-2019-principles-of-management-openstax.pdf — p. 283 — similitud 0.2477</w:t>
-      </w:r>
-    </w:p>
-    <w:p>
-      <w:pPr>
-        <w:ind w:left="360"/>
-      </w:pPr>
-      <w:r>
-        <w:t>“274 Chapter 8 Strategic Analysis: Understanding a Firm’s Competitive Environment 8.6 Competition, Strategy, and Competitive Advantage 6. What does it mean to compete with other firms in a business environment, and what does it mean when a firm has a competitive advantage over its rivals and what generic strategies can a firm implement to gain advantage over its rivals?”</w:t>
-      </w:r>
-    </w:p>
-    <w:p>
-      <w:pPr>
-        <w:pStyle w:val="Heading3"/>
-      </w:pPr>
-      <w:r>
-        <w:t>bright-et-al-2019-principles-of-management-openstax.pdf — p. 287 — similitud 0.1825</w:t>
-      </w:r>
-    </w:p>
-    <w:p>
-      <w:pPr>
-        <w:ind w:left="360"/>
-      </w:pPr>
-      <w:r>
-        <w:t>“278 Chapter 8 Strategic Analysis: Understanding a Firm’s Competitive Environment This OpenStax book is available for free at http://cnx.org/content/col28330/1.8”</w:t>
-      </w:r>
-    </w:p>
-    <w:p>
-      <w:pPr>
-        <w:pStyle w:val="Heading3"/>
-      </w:pPr>
-      <w:r>
-        <w:t>bright-et-al-2019-principles-of-management-openstax.pdf — p. 279 — similitud 0.1750</w:t>
-      </w:r>
-    </w:p>
-    <w:p>
-      <w:pPr>
-        <w:ind w:left="360"/>
-      </w:pPr>
-      <w:r>
-        <w:t>“270 Chapter 8 Strategic Analysis: Understanding a Firm’s Competitive Environment understanding of the competitive environment, including the firm’s own resources and capabilities, its industry situation, and facts about the macro environment. A strategic position includes a choice of generic competitive strategy, which a firm selects based on its own capabilities and in response to the positions already staked out by its industry rivals.”</w:t>
-      </w:r>
-    </w:p>
-    <w:p>
-      <w:pPr>
-        <w:pStyle w:val="Heading3"/>
-      </w:pPr>
-      <w:r>
-        <w:t>bright-et-al-2019-principles-of-management-openstax.pdf — p. 283 — similitud 0.1745</w:t>
-      </w:r>
-    </w:p>
-    <w:p>
-      <w:pPr>
-        <w:ind w:left="360"/>
-      </w:pPr>
-      <w:r>
-        <w:t>“In contrast, differentiators add value to their products and services while performing value chain activities so that they can charge premium prices to consumers. A third generic competitive strategy, focus, is chosen in combination with one of the other two strategies by firms who decide to target smaller geographic or demographic customer groups. 8.7 Strategic Positioning 7.”</w:t>
-      </w:r>
-    </w:p>
-    <w:p>
-      <w:pPr>
-        <w:pStyle w:val="Heading3"/>
-      </w:pPr>
-      <w:r>
-        <w:t>bright-et-al-2019-principles-of-management-openstax.pdf — p. 282 — similitud 0.1718</w:t>
-      </w:r>
-    </w:p>
-    <w:p>
-      <w:pPr>
-        <w:ind w:left="360"/>
-      </w:pPr>
-      <w:r>
-        <w:t>“Chapter 8 Strategic Analysis: Understanding a Firm’s Competitive Environment 273 weaknesses Things that a firm does not have good capabilities to perform or gaps in firm resources. Summary of Learning Outcomes 8.1 Gaining Advantages by Understanding the Competitive Environment 1.”</w:t>
-      </w:r>
-    </w:p>
-    <w:p>
-      <w:pPr>
-        <w:pStyle w:val="Heading3"/>
-      </w:pPr>
-      <w:r>
-        <w:t>bright-et-al-2019-principles-of-management-openstax.pdf — p. 258 — similitud 0.1701</w:t>
-      </w:r>
-    </w:p>
-    <w:p>
-      <w:pPr>
-        <w:ind w:left="360"/>
-      </w:pPr>
-      <w:r>
-        <w:t>“Chapter 8 Strategic Analysis: Understanding a Firm’s Competitive Environment 249 8.1 Gaining Advantages by Understanding the Competitive Environment 1. What is strategic analysis, and why do firms need to analyze their competitive environment?”</w:t>
-      </w:r>
-    </w:p>
-    <w:p>
-      <w:pPr>
-        <w:pStyle w:val="Heading3"/>
-      </w:pPr>
-      <w:r>
-        <w:t>bright-et-al-2019-principles-of-management-openstax.pdf — p. 292 — similitud 0.1508</w:t>
-      </w:r>
-    </w:p>
-    <w:p>
-      <w:pPr>
-        <w:ind w:left="360"/>
-      </w:pPr>
-      <w:r>
-        <w:t>“Chapter 9 The Strategic Management Process: Achieving and Sustaining Competitive Advantage 283 Why are vision and mission statements important to a firm’s strategy for developing a competitive advantage? To put it simply, you can’t make a plan or strategy unless you know what you want to accomplish.”</w:t>
-      </w:r>
-    </w:p>
-    <w:p>
-      <w:pPr>
-        <w:pStyle w:val="Heading3"/>
-      </w:pPr>
-      <w:r>
-        <w:t>bright-et-al-2019-principles-of-management-openstax.pdf — p. 280 — similitud 0.1491</w:t>
-      </w:r>
-    </w:p>
-    <w:p>
-      <w:pPr>
-        <w:ind w:left="360"/>
-      </w:pPr>
-      <w:r>
-        <w:t>“Chapter 8 Strategic Analysis: Understanding a Firm’s Competitive Environment 271 Key Terms barriers to entry Industry factors (such as high start-up costs) that can prevent new firms from successfully launching new operations in that industry. buyer power In the relationship between a firm and its customers, buyers with high power can negotiate product price or features, while buyers with low power cannot. capabilities A firm’s skill at coordinating and leveraging resources to create value. competition Business actions a firm undertakes to attract customers to its products and away from competitors’ products. competitive advantage When a firm successfully attracts more customers, earns more...”</w:t>
-      </w:r>
-    </w:p>
-    <w:p>
-      <w:r>
-        <w:rPr>
-          <w:b/>
-        </w:rPr>
-        <w:t xml:space="preserve">Observación automática: </w:t>
-      </w:r>
-      <w:r>
-        <w:t>La ficha presenta coincidencias útiles, pero conviene revisar la pertinencia de cada cita. Se agruparon varias referencias dentro de la misma fuente.</w:t>
-      </w:r>
-    </w:p>
-    <w:p>
-      <w:pPr>
-        <w:pStyle w:val="Heading2"/>
-      </w:pPr>
-      <w:r>
-        <w:t>Ficha 24. organizaciones</w:t>
-      </w:r>
-    </w:p>
-    <w:p>
-      <w:r>
-        <w:rPr>
-          <w:b/>
-        </w:rPr>
-        <w:t xml:space="preserve">Fuentes: </w:t>
-      </w:r>
-      <w:r>
-        <w:t>larrarte-sf-fundamentos-administracion.pdf; sanchez-banuelos-2017-evolucion-gestion-organizacional.pdf</w:t>
-      </w:r>
-    </w:p>
-    <w:p>
-      <w:r>
-        <w:rPr>
-          <w:b/>
-        </w:rPr>
-        <w:t xml:space="preserve">Ubicaciones: </w:t>
-      </w:r>
-      <w:r>
-        <w:t>larrarte-sf-fundamentos-administracion.pdf, p. 14; larrarte-sf-fundamentos-administracion.pdf, p. 21; larrarte-sf-fundamentos-administracion.pdf, p. 5; sanchez-banuelos-2017-evolucion-gestion-organizacional.pdf, p. 3; sanchez-banuelos-2017-evolucion-gestion-organizacional.pdf, p. 4; sanchez-banuelos-2017-evolucion-gestion-organizacional.pdf, p. 7; sanchez-banuelos-2017-evolucion-gestion-organizacional.pdf, p. 8</w:t>
-      </w:r>
-    </w:p>
-    <w:p>
-      <w:pPr>
-        <w:pStyle w:val="Heading3"/>
-      </w:pPr>
-      <w:r>
-        <w:t>sanchez-banuelos-2017-evolucion-gestion-organizacional.pdf — p. 3 — similitud 0.2224</w:t>
-      </w:r>
-    </w:p>
-    <w:p>
-      <w:pPr>
-        <w:ind w:left="360"/>
-      </w:pPr>
-      <w:r>
-        <w:t>“Ciencias Administrativas, 2017, núm. 10, July-December, ISSN: 2314-3738 De ello se desprende dicha necesidad de conocimiento referente a las organizaciones y su funcionamiento. Por este motivo han surgido diferentes teorías que han planteado un panorama de las organizaciones en el acontecer real, dejando por sentado en base a evidencia empírica, cómo es que se puede analizar dichas organizaciones mediante teorías que pretenden describir la realidad.”</w:t>
-      </w:r>
-    </w:p>
-    <w:p>
-      <w:pPr>
-        <w:pStyle w:val="Heading3"/>
-      </w:pPr>
-      <w:r>
-        <w:t>larrarte-sf-fundamentos-administracion.pdf — p. 5 — similitud 0.1916</w:t>
-      </w:r>
-    </w:p>
-    <w:p>
-      <w:pPr>
-        <w:ind w:left="360"/>
-      </w:pPr>
-      <w:r>
-        <w:t>“La teoría administrativa es indispensable para el éxito del administrador y de las organizaciones, hallando su aplicabilidad en la necesidad de innovación y renovación en empresas con sistemas flexibles, capaces de generar y adaptarse a la adopción de nuevas ideas . Cada una de las teorías surgió como respuesta a los problemas empresariales, el éxito de su implementación y la generalidad de las situaciones hacen que muchas puedan ser aplicadas a situaciones actuales .”</w:t>
-      </w:r>
-    </w:p>
-    <w:p>
-      <w:pPr>
-        <w:pStyle w:val="Heading3"/>
-      </w:pPr>
-      <w:r>
-        <w:t>sanchez-banuelos-2017-evolucion-gestion-organizacional.pdf — p. 8 — similitud 0.1887</w:t>
-      </w:r>
-    </w:p>
-    <w:p>
-      <w:pPr>
-        <w:ind w:left="360"/>
-      </w:pPr>
-      <w:r>
-        <w:t>“APORTES TEÓRICOS A LA GESTIÓN ORGANIZACIONAL: LA EVOLUCIÓN EN LA VI... Como se vio en estas corrientes teóricas, las organizaciones son vistas con mayor frecuencia en los aspectos del entorno y las relaciones que se generan dentro y fuera de ellas. La organización da pie a relaciones externas que permitan una conexión y ventaja competitiva, así mismo se encuentran en la búsqueda constante de la aceptación de factores ajenos a la organización, creando isomorﬁsmos con el ﬁn de seguir vigentes.”</w:t>
-      </w:r>
-    </w:p>
-    <w:p>
-      <w:pPr>
-        <w:pStyle w:val="Heading3"/>
-      </w:pPr>
-      <w:r>
-        <w:t>larrarte-sf-fundamentos-administracion.pdf — p. 21 — similitud 0.1599</w:t>
-      </w:r>
-    </w:p>
-    <w:p>
-      <w:pPr>
-        <w:ind w:left="360"/>
-      </w:pPr>
-      <w:r>
-        <w:t>“Organizaciones orgánicas u organicistas: estructura más flexible en la que se fa- vorece el trabajo en equipos o por proyectos, la autoridad varía con cada uno, las comunicaciones son más informativas que socializadores de decisiones, todos los niveles de la organización deben tomar decisiones y los elementos de producción pueden estar según las actividades necesarias . A finales de los 60, James Thompson (1920-1973) relacionó a las organizaciones con el medioambiente, en un sistema abierto y bajo el concepto de la racionalidad organiza- cional .”</w:t>
-      </w:r>
-    </w:p>
-    <w:p>
-      <w:pPr>
-        <w:pStyle w:val="Heading3"/>
-      </w:pPr>
-      <w:r>
-        <w:t>sanchez-banuelos-2017-evolucion-gestion-organizacional.pdf — p. 4 — similitud 0.1555</w:t>
-      </w:r>
-    </w:p>
-    <w:p>
-      <w:pPr>
-        <w:ind w:left="360"/>
-      </w:pPr>
-      <w:r>
-        <w:t>“APORTES TEÓRICOS A LA GESTIÓN ORGANIZACIONAL: LA EVOLUCIÓN EN LA VI... deﬁniciones exactas y una visión de la organización desde un aspecto psicológico social como un sistema compuesto por dos o más participantes. De acuerdo a Morgan (1990) esta visión permite ver a las organizaciones como sistemas vivos, que existen en un medio ambiente del cual dependen para satisfacer sus variadas necesidades. Sin duda alguna gracias al cambio del paradigma en las organizaciones, se abre una nueva brecha en la visión de éstas donde consecuentemente son vistas como sistemas que interactúan con un medio ambiente.”</w:t>
-      </w:r>
-    </w:p>
-    <w:p>
-      <w:pPr>
-        <w:pStyle w:val="Heading3"/>
-      </w:pPr>
-      <w:r>
-        <w:t>sanchez-banuelos-2017-evolucion-gestion-organizacional.pdf — p. 7 — similitud 0.1527</w:t>
-      </w:r>
-    </w:p>
-    <w:p>
-      <w:pPr>
-        <w:ind w:left="360"/>
-      </w:pPr>
-      <w:r>
-        <w:t>“En dicha teoría se puede ver cómo el hombre se relaciona con su entorno laboral y el exterior, la organización formal como sistema social parcial donde se deﬁne un conjunto de metas y estatus especíﬁco. Gracias al avance en la globalización, se ha visto la necesidad de cambiar con el paso del tiempo, de tal forma que las organizaciones se han adaptado a este nuevo contexto. Sin embargo, se ha observado cómo las organizaciones tienen rasgos muy similares, esto debido a los sistemas burocráticos y sistémicos que permanecen en la actualidad.”</w:t>
-      </w:r>
-    </w:p>
-    <w:p>
-      <w:pPr>
-        <w:pStyle w:val="Heading3"/>
-      </w:pPr>
-      <w:r>
-        <w:t>sanchez-banuelos-2017-evolucion-gestion-organizacional.pdf — p. 3 — similitud 0.1491</w:t>
-      </w:r>
-    </w:p>
-    <w:p>
-      <w:pPr>
-        <w:ind w:left="360"/>
-      </w:pPr>
-      <w:r>
-        <w:t>“En contra parte, Lakatos, mediante la falsación de la teoría, menciona que una nueva se impondrá sobre otra vigente, la cual se enfrentará a los vacíos o anomalías que la teoría anterior no tomaba en cuenta (Hatch, 1997). Con la intención de analizar la complejidad de las organizaciones se abordarán de acuerdo a la perspectiva pos-moderna propuesta por Ballina (2006) y la división de perspectiva de las organizaciones que propone conforme los avances evolutivos humanos y el tiempo.”</w:t>
-      </w:r>
-    </w:p>
-    <w:p>
-      <w:pPr>
-        <w:pStyle w:val="Heading3"/>
-      </w:pPr>
-      <w:r>
-        <w:t>larrarte-sf-fundamentos-administracion.pdf — p. 14 — similitud 0.1468</w:t>
-      </w:r>
-    </w:p>
-    <w:p>
-      <w:pPr>
-        <w:ind w:left="360"/>
-      </w:pPr>
-      <w:r>
-        <w:t>“Iniciativa: capacidad para visualizar y proponer un plan con probabilidades de éxi- to . Es un rasgo muy apetecido en las organizaciones . 6 .”</w:t>
-      </w:r>
-    </w:p>
-    <w:p>
-      <w:r>
-        <w:rPr>
-          <w:b/>
-        </w:rPr>
-        <w:t xml:space="preserve">Observación automática: </w:t>
-      </w:r>
-      <w:r>
-        <w:t>La ficha presenta coincidencias útiles, pero conviene revisar la pertinencia de cada cita. Se agruparon referencias de múltiples fuentes para enriquecer el concepto.</w:t>
-      </w:r>
-    </w:p>
-    <w:p>
-      <w:pPr>
-        <w:pStyle w:val="Heading2"/>
-      </w:pPr>
-      <w:r>
-        <w:t>Ficha 25. attribution</w:t>
-      </w:r>
-    </w:p>
-    <w:p>
-      <w:r>
-        <w:rPr>
-          <w:b/>
-        </w:rPr>
-        <w:t xml:space="preserve">Fuentes: </w:t>
-      </w:r>
-      <w:r>
-        <w:t>bright-et-al-2019-principles-of-management-openstax.pdf</w:t>
-      </w:r>
-    </w:p>
-    <w:p>
-      <w:r>
-        <w:rPr>
-          <w:b/>
-        </w:rPr>
-        <w:t xml:space="preserve">Ubicaciones: </w:t>
-      </w:r>
-      <w:r>
-        <w:t>bright-et-al-2019-principles-of-management-openstax.pdf, p. 10; bright-et-al-2019-principles-of-management-openstax.pdf, p. 42; bright-et-al-2019-principles-of-management-openstax.pdf, p. 48; bright-et-al-2019-principles-of-management-openstax.pdf, p. 56; bright-et-al-2019-principles-of-management-openstax.pdf, p. 610; bright-et-al-2019-principles-of-management-openstax.pdf, p. 616; bright-et-al-2019-principles-of-management-openstax.pdf, p. 86</w:t>
-      </w:r>
-    </w:p>
-    <w:p>
-      <w:pPr>
-        <w:pStyle w:val="Heading3"/>
-      </w:pPr>
-      <w:r>
-        <w:t>bright-et-al-2019-principles-of-management-openstax.pdf — p. 10 — similitud 0.1389</w:t>
-      </w:r>
-    </w:p>
-    <w:p>
-      <w:pPr>
-        <w:ind w:left="360"/>
-      </w:pPr>
-      <w:r>
-        <w:t>“Visit the Instructor Resources section of your book page on openstax.org for more information. Art Attribution In Principles of Management, most art contains attribution to its title, creator, or rights holder, host platform, and license within the caption. Because the art is openly licensed, anyone may reuse the art as long as they provide the same attribution to its original source.”</w:t>
-      </w:r>
-    </w:p>
-    <w:p>
-      <w:pPr>
-        <w:pStyle w:val="Heading3"/>
-      </w:pPr>
-      <w:r>
-        <w:t>bright-et-al-2019-principles-of-management-openstax.pdf — p. 610 — similitud 0.1318</w:t>
-      </w:r>
-    </w:p>
-    <w:p>
-      <w:pPr>
-        <w:ind w:left="360"/>
-      </w:pPr>
-      <w:r>
-        <w:t>“Chapter 18 Management of Technology and Innovation 601 Exhibit 18.2 Technology and Innovation Defined (Attribution: Copyright Rice University, OpenStax, under CC-BY 4.0 license) Technology can be defined in a number of ways. The basic purpose of a system (such as an organization) is to convert inputs into outputs.”</w:t>
-      </w:r>
-    </w:p>
-    <w:p>
-      <w:pPr>
-        <w:pStyle w:val="Heading3"/>
-      </w:pPr>
-      <w:r>
-        <w:t>bright-et-al-2019-principles-of-management-openstax.pdf — p. 616 — similitud 0.1233</w:t>
-      </w:r>
-    </w:p>
-    <w:p>
-      <w:pPr>
-        <w:ind w:left="360"/>
-      </w:pPr>
-      <w:r>
-        <w:t>“Chapter 18 Management of Technology and Innovation 607 Exhibit 18.6 Key Management Activities (Attribution: Copyright Rice University, OpenStax, under CC-BY 4.0 license) There are three basic organizational processes—buying and partnering, developing newness within the firm, and entrepreneurially exploiting a space in the environment. Exhibit 18.6 delineates the three types.”</w:t>
-      </w:r>
-    </w:p>
-    <w:p>
-      <w:pPr>
-        <w:pStyle w:val="Heading3"/>
-      </w:pPr>
-      <w:r>
-        <w:t>bright-et-al-2019-principles-of-management-openstax.pdf — p. 10 — similitud 0.1177</w:t>
-      </w:r>
-    </w:p>
-    <w:p>
-      <w:pPr>
-        <w:ind w:left="360"/>
-      </w:pPr>
-      <w:r>
-        <w:t>“Through our partnerships with philanthropic foundations and our alliance with other educational resource organizations, OpenStax is breaking down the most common barriers to learning and empowering students and instructors to succeed. About OpenStax Resources Customization Principles of Management is licensed under a Creative Commons Attribution 4.0 International (CC BY) license, which means that you can distribute, remix, and build upon the content, as long as you provide attribution to OpenStax and its content contributors.”</w:t>
-      </w:r>
-    </w:p>
-    <w:p>
-      <w:pPr>
-        <w:pStyle w:val="Heading3"/>
-      </w:pPr>
-      <w:r>
-        <w:t>bright-et-al-2019-principles-of-management-openstax.pdf — p. 56 — similitud 0.1166</w:t>
-      </w:r>
-    </w:p>
-    <w:p>
-      <w:pPr>
-        <w:ind w:left="360"/>
-      </w:pPr>
-      <w:r>
-        <w:t>“Summary of Techniques That May Improve Group Decision-Making Type of Technique Benefit Decision Group Have diverse members in the Improves quality: generates more options, reduces decisions group. bias Assign a devil’s advocate. Improves quality: reduces groupthink Table 2.3 (Attribution: Copyright Rice University, OpenStax, under CC-BY 4.0 license)”</w:t>
-      </w:r>
-    </w:p>
-    <w:p>
-      <w:pPr>
-        <w:pStyle w:val="Heading3"/>
-      </w:pPr>
-      <w:r>
-        <w:t>bright-et-al-2019-principles-of-management-openstax.pdf — p. 48 — similitud 0.1153</w:t>
-      </w:r>
-    </w:p>
-    <w:p>
-      <w:pPr>
-        <w:ind w:left="360"/>
-      </w:pPr>
-      <w:r>
-        <w:t>“In this case, most holidays for which businesses close are in the late fall and winter (Thanksgiving, Christmas), and there are more illnesses at this time of year because of the weather, not because of the business being closed. Table 2.2 (Attribution: Copyright Rice University, OpenStax, under CC-BY 4.0 license)”</w:t>
-      </w:r>
-    </w:p>
-    <w:p>
-      <w:pPr>
-        <w:pStyle w:val="Heading3"/>
-      </w:pPr>
-      <w:r>
-        <w:t>bright-et-al-2019-principles-of-management-openstax.pdf — p. 86 — similitud 0.1086</w:t>
-      </w:r>
-    </w:p>
-    <w:p>
-      <w:pPr>
-        <w:ind w:left="360"/>
-      </w:pPr>
-      <w:r>
-        <w:t>“Weber gave us the start of organizational design and the importance of authority. Exhibit 3.6 The Development of Management Thought (Attribution: Copyright Rice University, OpenStax, under CC-BY 4.0 license) C O N C E P T C H E C K 1. What is the going contribution of systems and contingency management thought?”</w:t>
-      </w:r>
-    </w:p>
-    <w:p>
-      <w:pPr>
-        <w:pStyle w:val="Heading3"/>
-      </w:pPr>
-      <w:r>
-        <w:t>bright-et-al-2019-principles-of-management-openstax.pdf — p. 42 — similitud 0.1084</w:t>
-      </w:r>
-    </w:p>
-    <w:p>
-      <w:pPr>
-        <w:ind w:left="360"/>
-      </w:pPr>
-      <w:r>
-        <w:t>“He suggests that unforeseen and unanticipated risks are becoming more frequent and less predictable and are having a greater impact on more people at one time. Credit (New America/ flickr/ Attribution 2.0 Generic (CC BY 2.0)) If the bad behavior is not corrected, it will continue, which is going to cause more problems in the workplace in”</w:t>
-      </w:r>
-    </w:p>
-    <w:p>
-      <w:r>
-        <w:rPr>
-          <w:b/>
-        </w:rPr>
-        <w:t xml:space="preserve">Observación automática: </w:t>
-      </w:r>
-      <w:r>
-        <w:t>La ficha presenta coincidencias débiles; se recomienda validar manualmente las citas. Se agruparon varias referencias dentro de la misma fuente.</w:t>
+        <w:t>La ficha presenta coincidencias débiles; se recomienda validar manualmente las citas. Se agruparon referencias de múltiples fuentes para enriquecer el concepto.</w:t>
       </w:r>
     </w:p>
     <w:sectPr>

</xml_diff>